<commit_message>
docs(reference): add pairing and release precautions and fallback
Section 4.3, in both the docx and the markdown. The reference described what
the app does on pairing and release, but never what the person holding the
phone should do when either goes wrong.

Covers precautions before pairing, the app's actual on-screen failure messages
mapped to the correct response, precautions before releasing, and the fallback
when a phone is reset, lost, or damaged - where the changed Android identity
means only an office force-release can free the unit.

The docx was patched in place, not regenerated: its cover page, TOC, header and
footer, and five embedded screenshots exist nowhere else. Verified block by
block that no original content was dropped and the images are byte-identical;
only word/document.xml changed. The TOC still needs a field refresh in Word to
list 4.3 with a page number.
</commit_message>
<xml_diff>
--- a/docs/HAMS_PRODUCTION_REFERENCE.docx
+++ b/docs/HAMS_PRODUCTION_REFERENCE.docx
@@ -1842,16 +1842,32 @@
           <w:p>
             <w:pPr>
               <w:spacing w:after="0"/>
-            </w:pPr>
-            <w:r>
-              <w:rPr>
-                <w:b w:val="0"/>
-                <w:bCs w:val="0"/>
-                <w:color w:val="202020"/>
-                <w:sz w:val="19"/>
-                <w:szCs w:val="19"/>
-              </w:rPr>
-              <w:t>1.1 (2)</w:t>
+              <w:rPr>
+                <w:rFonts w:hint="default"/>
+                <w:lang w:val="en-US"/>
+              </w:rPr>
+            </w:pPr>
+            <w:r>
+              <w:rPr>
+                <w:b w:val="0"/>
+                <w:bCs w:val="0"/>
+                <w:color w:val="202020"/>
+                <w:sz w:val="19"/>
+                <w:szCs w:val="19"/>
+              </w:rPr>
+              <w:t>1.</w:t>
+            </w:r>
+            <w:r>
+              <w:rPr>
+                <w:rFonts w:hint="default"/>
+                <w:b w:val="0"/>
+                <w:bCs w:val="0"/>
+                <w:color w:val="202020"/>
+                <w:sz w:val="19"/>
+                <w:szCs w:val="19"/>
+                <w:lang w:val="en-US"/>
+              </w:rPr>
+              <w:t>2</w:t>
             </w:r>
           </w:p>
         </w:tc>
@@ -2484,12 +2500,6 @@
             <w:insideH w:val="single" w:color="auto" w:sz="4" w:space="0"/>
             <w:insideV w:val="single" w:color="auto" w:sz="4" w:space="0"/>
           </w:tblBorders>
-          <w:tblCellMar>
-            <w:top w:w="0" w:type="dxa"/>
-            <w:left w:w="10" w:type="dxa"/>
-            <w:bottom w:w="0" w:type="dxa"/>
-            <w:right w:w="10" w:type="dxa"/>
-          </w:tblCellMar>
         </w:tblPrEx>
         <w:trPr>
           <w:tblHeader/>
@@ -2807,16 +2817,32 @@
           <w:p>
             <w:pPr>
               <w:spacing w:after="0"/>
-            </w:pPr>
-            <w:r>
-              <w:rPr>
-                <w:b w:val="0"/>
-                <w:bCs w:val="0"/>
-                <w:color w:val="202020"/>
-                <w:sz w:val="19"/>
-                <w:szCs w:val="19"/>
-              </w:rPr>
-              <w:t>1.1 (2)</w:t>
+              <w:rPr>
+                <w:rFonts w:hint="default"/>
+                <w:lang w:val="en-US"/>
+              </w:rPr>
+            </w:pPr>
+            <w:r>
+              <w:rPr>
+                <w:b w:val="0"/>
+                <w:bCs w:val="0"/>
+                <w:color w:val="202020"/>
+                <w:sz w:val="19"/>
+                <w:szCs w:val="19"/>
+              </w:rPr>
+              <w:t>1</w:t>
+            </w:r>
+            <w:r>
+              <w:rPr>
+                <w:rFonts w:hint="default"/>
+                <w:b w:val="0"/>
+                <w:bCs w:val="0"/>
+                <w:color w:val="202020"/>
+                <w:sz w:val="19"/>
+                <w:szCs w:val="19"/>
+                <w:lang w:val="en-US"/>
+              </w:rPr>
+              <w:t>.2</w:t>
             </w:r>
           </w:p>
         </w:tc>
@@ -3236,12 +3262,6 @@
             <w:insideH w:val="single" w:color="auto" w:sz="4" w:space="0"/>
             <w:insideV w:val="single" w:color="auto" w:sz="4" w:space="0"/>
           </w:tblBorders>
-          <w:tblCellMar>
-            <w:top w:w="0" w:type="dxa"/>
-            <w:left w:w="10" w:type="dxa"/>
-            <w:bottom w:w="0" w:type="dxa"/>
-            <w:right w:w="10" w:type="dxa"/>
-          </w:tblCellMar>
         </w:tblPrEx>
         <w:trPr>
           <w:tblHeader/>
@@ -3768,7 +3788,7 @@
           <wp:inline distT="0" distB="0" distL="114300" distR="114300">
             <wp:extent cx="1175385" cy="2600960"/>
             <wp:effectExtent l="0" t="0" r="13335" b="5080"/>
-            <wp:docPr id="1" name="Picture 1" descr="app-01-count-screen"/>
+            <wp:docPr id="1" name="Picture 1" descr="C:/Users/User/Downloads/WhatsApp Image 2026-08-21 at 09.47.39.jpegWhatsApp Image 2026-08-21 at 09.47.39"/>
             <wp:cNvGraphicFramePr>
               <a:graphicFrameLocks xmlns:a="http://schemas.openxmlformats.org/drawingml/2006/main" noChangeAspect="1"/>
             </wp:cNvGraphicFramePr>
@@ -3776,13 +3796,14 @@
               <a:graphicData uri="http://schemas.openxmlformats.org/drawingml/2006/picture">
                 <pic:pic xmlns:pic="http://schemas.openxmlformats.org/drawingml/2006/picture">
                   <pic:nvPicPr>
-                    <pic:cNvPr id="1" name="Picture 1" descr="app-01-count-screen"/>
+                    <pic:cNvPr id="1" name="Picture 1" descr="C:/Users/User/Downloads/WhatsApp Image 2026-08-21 at 09.47.39.jpegWhatsApp Image 2026-08-21 at 09.47.39"/>
                     <pic:cNvPicPr>
                       <a:picLocks noChangeAspect="1"/>
                     </pic:cNvPicPr>
                   </pic:nvPicPr>
                   <pic:blipFill>
                     <a:blip r:embed="rId6"/>
+                    <a:srcRect l="49" r="49"/>
                     <a:stretch>
                       <a:fillRect/>
                     </a:stretch>
@@ -3818,7 +3839,7 @@
           <wp:inline distT="0" distB="0" distL="114300" distR="114300">
             <wp:extent cx="1176655" cy="2604135"/>
             <wp:effectExtent l="0" t="0" r="12065" b="1905"/>
-            <wp:docPr id="2" name="Picture 2" descr="D:/HAMS_company_solution/docs/image_guideline/app/app-02-new-task.jpegapp-02-new-task"/>
+            <wp:docPr id="2" name="Picture 2" descr="C:/Users/User/Downloads/WhatsApp Image 2026-08-21 at 09.46.07.jpegWhatsApp Image 2026-08-21 at 09.46.07"/>
             <wp:cNvGraphicFramePr>
               <a:graphicFrameLocks xmlns:a="http://schemas.openxmlformats.org/drawingml/2006/main" noChangeAspect="1"/>
             </wp:cNvGraphicFramePr>
@@ -3826,14 +3847,14 @@
               <a:graphicData uri="http://schemas.openxmlformats.org/drawingml/2006/picture">
                 <pic:pic xmlns:pic="http://schemas.openxmlformats.org/drawingml/2006/picture">
                   <pic:nvPicPr>
-                    <pic:cNvPr id="2" name="Picture 2" descr="D:/HAMS_company_solution/docs/image_guideline/app/app-02-new-task.jpegapp-02-new-task"/>
+                    <pic:cNvPr id="2" name="Picture 2" descr="C:/Users/User/Downloads/WhatsApp Image 2026-08-21 at 09.46.07.jpegWhatsApp Image 2026-08-21 at 09.46.07"/>
                     <pic:cNvPicPr>
                       <a:picLocks noChangeAspect="1"/>
                     </pic:cNvPicPr>
                   </pic:nvPicPr>
                   <pic:blipFill>
                     <a:blip r:embed="rId7"/>
-                    <a:srcRect l="56" r="56"/>
+                    <a:srcRect l="61" r="61"/>
                     <a:stretch>
                       <a:fillRect/>
                     </a:stretch>
@@ -4150,12 +4171,6 @@
             <w:insideH w:val="single" w:color="auto" w:sz="4" w:space="0"/>
             <w:insideV w:val="single" w:color="auto" w:sz="4" w:space="0"/>
           </w:tblBorders>
-          <w:tblCellMar>
-            <w:top w:w="0" w:type="dxa"/>
-            <w:left w:w="10" w:type="dxa"/>
-            <w:bottom w:w="0" w:type="dxa"/>
-            <w:right w:w="10" w:type="dxa"/>
-          </w:tblCellMar>
         </w:tblPrEx>
         <w:trPr>
           <w:tblHeader/>
@@ -5317,12 +5332,6 @@
             <w:insideH w:val="single" w:color="auto" w:sz="4" w:space="0"/>
             <w:insideV w:val="single" w:color="auto" w:sz="4" w:space="0"/>
           </w:tblBorders>
-          <w:tblCellMar>
-            <w:top w:w="0" w:type="dxa"/>
-            <w:left w:w="10" w:type="dxa"/>
-            <w:bottom w:w="0" w:type="dxa"/>
-            <w:right w:w="10" w:type="dxa"/>
-          </w:tblCellMar>
         </w:tblPrEx>
         <w:trPr>
           <w:tblHeader/>
@@ -5855,12 +5864,6 @@
             <w:insideH w:val="single" w:color="auto" w:sz="4" w:space="0"/>
             <w:insideV w:val="single" w:color="auto" w:sz="4" w:space="0"/>
           </w:tblBorders>
-          <w:tblCellMar>
-            <w:top w:w="0" w:type="dxa"/>
-            <w:left w:w="10" w:type="dxa"/>
-            <w:bottom w:w="0" w:type="dxa"/>
-            <w:right w:w="10" w:type="dxa"/>
-          </w:tblCellMar>
         </w:tblPrEx>
         <w:tc>
           <w:tcPr>
@@ -5885,6 +5888,1706 @@
             </w:pPr>
             <w:r>
               <w:t>⚠ Never pair a replacement phone to the same unit while the old phone may contain unsent work.</w:t>
+            </w:r>
+          </w:p>
+        </w:tc>
+      </w:tr>
+    </w:tbl>
+    <w:p>
+      <w:pPr>
+        <w:spacing w:after="100"/>
+      </w:pPr>
+    </w:p>
+    <w:p>
+      <w:pPr>
+        <w:pStyle w:val="3"/>
+      </w:pPr>
+      <w:bookmarkStart w:id="900" w:name="_Toc99431"/>
+      <w:r>
+        <w:t>4.3 Pairing and release: precautions and fallback</w:t>
+      </w:r>
+      <w:bookmarkEnd w:id="900"/>
+    </w:p>
+    <w:p>
+      <w:pPr>
+        <w:spacing w:after="100"/>
+      </w:pPr>
+      <w:r>
+        <w:t xml:space="preserve">This section tells the person holding the phone what to do when pairing or release does not go as expected. In the tables below, the highlighted cell is the action to take.</w:t>
+      </w:r>
+    </w:p>
+    <w:p>
+      <w:pPr>
+        <w:spacing w:after="100"/>
+      </w:pPr>
+      <w:r>
+        <w:rPr>
+          <w:b/>
+          <w:bCs/>
+        </w:rPr>
+        <w:t xml:space="preserve">Before pairing</w:t>
+      </w:r>
+    </w:p>
+    <w:p>
+      <w:pPr>
+        <w:numPr>
+          <w:ilvl w:val="0"/>
+          <w:numId w:val="2"/>
+        </w:numPr>
+        <w:spacing w:after="50"/>
+      </w:pPr>
+      <w:r>
+        <w:t xml:space="preserve">Take the unit ID from the office register. Do not guess it or type it from memory. The convention is OC&lt;NUM&gt;_H_&lt;SERIAL_NUMBER&gt;; a wrong ID either fails outright or binds the phone to the wrong unit.</w:t>
+      </w:r>
+    </w:p>
+    <w:p>
+      <w:pPr>
+        <w:numPr>
+          <w:ilvl w:val="0"/>
+          <w:numId w:val="2"/>
+        </w:numPr>
+        <w:spacing w:after="50"/>
+      </w:pPr>
+      <w:r>
+        <w:t xml:space="preserve">Confirm the phone has a working network connection. Pairing needs one. GPS is not required until counting starts.</w:t>
+      </w:r>
+    </w:p>
+    <w:p>
+      <w:pPr>
+        <w:numPr>
+          <w:ilvl w:val="0"/>
+          <w:numId w:val="2"/>
+        </w:numPr>
+        <w:spacing w:after="50"/>
+      </w:pPr>
+      <w:r>
+        <w:t xml:space="preserve">Pair one phone to one unit at a time, and record the pairing in the operational register.</w:t>
+      </w:r>
+    </w:p>
+    <w:p>
+      <w:pPr>
+        <w:spacing w:after="60"/>
+      </w:pPr>
+      <w:r>
+        <w:t xml:space="preserve"/>
+      </w:r>
+    </w:p>
+    <w:p>
+      <w:pPr>
+        <w:spacing w:after="100"/>
+      </w:pPr>
+      <w:r>
+        <w:rPr>
+          <w:b/>
+          <w:bCs/>
+        </w:rPr>
+        <w:t xml:space="preserve">If pairing does not succeed</w:t>
+      </w:r>
+    </w:p>
+    <w:tbl>
+      <w:tblPr>
+        <w:tblStyle w:val="9"/>
+        <w:tblW w:w="9746" w:type="dxa"/>
+        <w:tblInd w:w="0" w:type="dxa"/>
+        <w:tblBorders>
+          <w:top w:val="single" w:color="auto" w:sz="4" w:space="0"/>
+          <w:left w:val="single" w:color="auto" w:sz="4" w:space="0"/>
+          <w:bottom w:val="single" w:color="auto" w:sz="4" w:space="0"/>
+          <w:right w:val="single" w:color="auto" w:sz="4" w:space="0"/>
+          <w:insideH w:val="single" w:color="auto" w:sz="4" w:space="0"/>
+          <w:insideV w:val="single" w:color="auto" w:sz="4" w:space="0"/>
+        </w:tblBorders>
+        <w:tblLayout w:type="autofit"/>
+        <w:tblCellMar>
+          <w:top w:w="0" w:type="dxa"/>
+          <w:left w:w="10" w:type="dxa"/>
+          <w:bottom w:w="0" w:type="dxa"/>
+          <w:right w:w="10" w:type="dxa"/>
+        </w:tblCellMar>
+      </w:tblPr>
+      <w:tblGrid>
+        <w:gridCol w:w="3000"/>
+        <w:gridCol w:w="3200"/>
+        <w:gridCol w:w="3546"/>
+      </w:tblGrid>
+      <w:tr>
+        <w:trPr>
+          <w:tblHeader/>
+        </w:trPr>
+        <w:tc>
+          <w:tcPr>
+            <w:tcW w:w="3000" w:type="dxa"/>
+            <w:tcBorders>
+              <w:top w:val="single" w:color="B7C9C0" w:sz="4" w:space="0"/>
+              <w:left w:val="single" w:color="B7C9C0" w:sz="4" w:space="0"/>
+              <w:bottom w:val="single" w:color="B7C9C0" w:sz="4" w:space="0"/>
+              <w:right w:val="single" w:color="B7C9C0" w:sz="4" w:space="0"/>
+            </w:tcBorders>
+            <w:shd w:val="clear" w:color="auto" w:fill="1F4E3D"/>
+            <w:tcMar>
+              <w:top w:w="80" w:type="dxa"/>
+              <w:left w:w="100" w:type="dxa"/>
+              <w:bottom w:w="80" w:type="dxa"/>
+              <w:right w:w="100" w:type="dxa"/>
+            </w:tcMar>
+            <w:vAlign w:val="center"/>
+          </w:tcPr>
+          <w:p>
+            <w:pPr>
+              <w:spacing w:after="0"/>
+            </w:pPr>
+            <w:r>
+              <w:rPr>
+                <w:b/>
+                <w:bCs/>
+                <w:color w:val="FFFFFF"/>
+                <w:sz w:val="19"/>
+                <w:szCs w:val="19"/>
+              </w:rPr>
+              <w:t xml:space="preserve">Message on the phone</w:t>
+            </w:r>
+          </w:p>
+        </w:tc>
+        <w:tc>
+          <w:tcPr>
+            <w:tcW w:w="3200" w:type="dxa"/>
+            <w:tcBorders>
+              <w:top w:val="single" w:color="B7C9C0" w:sz="4" w:space="0"/>
+              <w:left w:val="single" w:color="B7C9C0" w:sz="4" w:space="0"/>
+              <w:bottom w:val="single" w:color="B7C9C0" w:sz="4" w:space="0"/>
+              <w:right w:val="single" w:color="B7C9C0" w:sz="4" w:space="0"/>
+            </w:tcBorders>
+            <w:shd w:val="clear" w:color="auto" w:fill="1F4E3D"/>
+            <w:tcMar>
+              <w:top w:w="80" w:type="dxa"/>
+              <w:left w:w="100" w:type="dxa"/>
+              <w:bottom w:w="80" w:type="dxa"/>
+              <w:right w:w="100" w:type="dxa"/>
+            </w:tcMar>
+            <w:vAlign w:val="center"/>
+          </w:tcPr>
+          <w:p>
+            <w:pPr>
+              <w:spacing w:after="0"/>
+            </w:pPr>
+            <w:r>
+              <w:rPr>
+                <w:b/>
+                <w:bCs/>
+                <w:color w:val="FFFFFF"/>
+                <w:sz w:val="19"/>
+                <w:szCs w:val="19"/>
+              </w:rPr>
+              <w:t xml:space="preserve">What it means</w:t>
+            </w:r>
+          </w:p>
+        </w:tc>
+        <w:tc>
+          <w:tcPr>
+            <w:tcW w:w="3546" w:type="dxa"/>
+            <w:tcBorders>
+              <w:top w:val="single" w:color="B7C9C0" w:sz="4" w:space="0"/>
+              <w:left w:val="single" w:color="B7C9C0" w:sz="4" w:space="0"/>
+              <w:bottom w:val="single" w:color="B7C9C0" w:sz="4" w:space="0"/>
+              <w:right w:val="single" w:color="B7C9C0" w:sz="4" w:space="0"/>
+            </w:tcBorders>
+            <w:shd w:val="clear" w:color="auto" w:fill="1F4E3D"/>
+            <w:tcMar>
+              <w:top w:w="80" w:type="dxa"/>
+              <w:left w:w="100" w:type="dxa"/>
+              <w:bottom w:w="80" w:type="dxa"/>
+              <w:right w:w="100" w:type="dxa"/>
+            </w:tcMar>
+            <w:vAlign w:val="center"/>
+          </w:tcPr>
+          <w:p>
+            <w:pPr>
+              <w:spacing w:after="0"/>
+            </w:pPr>
+            <w:r>
+              <w:rPr>
+                <w:b/>
+                <w:bCs/>
+                <w:color w:val="FFFFFF"/>
+                <w:sz w:val="19"/>
+                <w:szCs w:val="19"/>
+              </w:rPr>
+              <w:t xml:space="preserve">What to do</w:t>
+            </w:r>
+          </w:p>
+        </w:tc>
+      </w:tr>
+      <w:tr>
+        <w:tc>
+          <w:tcPr>
+            <w:tcW w:w="3000" w:type="dxa"/>
+            <w:tcBorders>
+              <w:top w:val="single" w:color="B7C9C0" w:sz="4" w:space="0"/>
+              <w:left w:val="single" w:color="B7C9C0" w:sz="4" w:space="0"/>
+              <w:bottom w:val="single" w:color="B7C9C0" w:sz="4" w:space="0"/>
+              <w:right w:val="single" w:color="B7C9C0" w:sz="4" w:space="0"/>
+            </w:tcBorders>
+            <w:shd w:val="clear" w:color="auto" w:fill="FFFFFF"/>
+            <w:tcMar>
+              <w:top w:w="80" w:type="dxa"/>
+              <w:left w:w="100" w:type="dxa"/>
+              <w:bottom w:w="80" w:type="dxa"/>
+              <w:right w:w="100" w:type="dxa"/>
+            </w:tcMar>
+            <w:vAlign w:val="center"/>
+          </w:tcPr>
+          <w:p>
+            <w:pPr>
+              <w:spacing w:after="0"/>
+            </w:pPr>
+            <w:r>
+              <w:rPr>
+                <w:b w:val="0"/>
+                <w:bCs w:val="0"/>
+                <w:color w:val="202020"/>
+                <w:sz w:val="19"/>
+                <w:szCs w:val="19"/>
+              </w:rPr>
+              <w:t xml:space="preserve">Unknown unit ID. Check and retry.</w:t>
+            </w:r>
+          </w:p>
+        </w:tc>
+        <w:tc>
+          <w:tcPr>
+            <w:tcW w:w="3200" w:type="dxa"/>
+            <w:tcBorders>
+              <w:top w:val="single" w:color="B7C9C0" w:sz="4" w:space="0"/>
+              <w:left w:val="single" w:color="B7C9C0" w:sz="4" w:space="0"/>
+              <w:bottom w:val="single" w:color="B7C9C0" w:sz="4" w:space="0"/>
+              <w:right w:val="single" w:color="B7C9C0" w:sz="4" w:space="0"/>
+            </w:tcBorders>
+            <w:shd w:val="clear" w:color="auto" w:fill="FFFFFF"/>
+            <w:tcMar>
+              <w:top w:w="80" w:type="dxa"/>
+              <w:left w:w="100" w:type="dxa"/>
+              <w:bottom w:w="80" w:type="dxa"/>
+              <w:right w:w="100" w:type="dxa"/>
+            </w:tcMar>
+            <w:vAlign w:val="center"/>
+          </w:tcPr>
+          <w:p>
+            <w:pPr>
+              <w:spacing w:after="0"/>
+            </w:pPr>
+            <w:r>
+              <w:rPr>
+                <w:b w:val="0"/>
+                <w:bCs w:val="0"/>
+                <w:color w:val="202020"/>
+                <w:sz w:val="19"/>
+                <w:szCs w:val="19"/>
+              </w:rPr>
+              <w:t xml:space="preserve">The unit is not in the office register.</w:t>
+            </w:r>
+          </w:p>
+        </w:tc>
+        <w:tc>
+          <w:tcPr>
+            <w:tcW w:w="3546" w:type="dxa"/>
+            <w:tcBorders>
+              <w:top w:val="single" w:color="B7C9C0" w:sz="4" w:space="0"/>
+              <w:left w:val="single" w:color="B7C9C0" w:sz="4" w:space="0"/>
+              <w:bottom w:val="single" w:color="B7C9C0" w:sz="4" w:space="0"/>
+              <w:right w:val="single" w:color="B7C9C0" w:sz="4" w:space="0"/>
+            </w:tcBorders>
+            <w:shd w:val="clear" w:color="auto" w:fill="FFF2CC"/>
+            <w:tcMar>
+              <w:top w:w="80" w:type="dxa"/>
+              <w:left w:w="100" w:type="dxa"/>
+              <w:bottom w:w="80" w:type="dxa"/>
+              <w:right w:w="100" w:type="dxa"/>
+            </w:tcMar>
+            <w:vAlign w:val="center"/>
+          </w:tcPr>
+          <w:p>
+            <w:pPr>
+              <w:spacing w:after="0"/>
+            </w:pPr>
+            <w:r>
+              <w:rPr>
+                <w:b/>
+                <w:bCs/>
+                <w:color w:val="202020"/>
+                <w:sz w:val="19"/>
+                <w:szCs w:val="19"/>
+              </w:rPr>
+              <w:t xml:space="preserve">Re-check the ID against the register. If it is correct, ask the office to confirm the unit was seeded.</w:t>
+            </w:r>
+          </w:p>
+        </w:tc>
+      </w:tr>
+      <w:tr>
+        <w:tc>
+          <w:tcPr>
+            <w:tcW w:w="3000" w:type="dxa"/>
+            <w:tcBorders>
+              <w:top w:val="single" w:color="B7C9C0" w:sz="4" w:space="0"/>
+              <w:left w:val="single" w:color="B7C9C0" w:sz="4" w:space="0"/>
+              <w:bottom w:val="single" w:color="B7C9C0" w:sz="4" w:space="0"/>
+              <w:right w:val="single" w:color="B7C9C0" w:sz="4" w:space="0"/>
+            </w:tcBorders>
+            <w:shd w:val="clear" w:color="auto" w:fill="FFFFFF"/>
+            <w:tcMar>
+              <w:top w:w="80" w:type="dxa"/>
+              <w:left w:w="100" w:type="dxa"/>
+              <w:bottom w:w="80" w:type="dxa"/>
+              <w:right w:w="100" w:type="dxa"/>
+            </w:tcMar>
+            <w:vAlign w:val="center"/>
+          </w:tcPr>
+          <w:p>
+            <w:pPr>
+              <w:spacing w:after="0"/>
+            </w:pPr>
+            <w:r>
+              <w:rPr>
+                <w:b w:val="0"/>
+                <w:bCs w:val="0"/>
+                <w:color w:val="202020"/>
+                <w:sz w:val="19"/>
+                <w:szCs w:val="19"/>
+              </w:rPr>
+              <w:t xml:space="preserve">This device is already bound to another unit.</w:t>
+            </w:r>
+          </w:p>
+        </w:tc>
+        <w:tc>
+          <w:tcPr>
+            <w:tcW w:w="3200" w:type="dxa"/>
+            <w:tcBorders>
+              <w:top w:val="single" w:color="B7C9C0" w:sz="4" w:space="0"/>
+              <w:left w:val="single" w:color="B7C9C0" w:sz="4" w:space="0"/>
+              <w:bottom w:val="single" w:color="B7C9C0" w:sz="4" w:space="0"/>
+              <w:right w:val="single" w:color="B7C9C0" w:sz="4" w:space="0"/>
+            </w:tcBorders>
+            <w:shd w:val="clear" w:color="auto" w:fill="FFFFFF"/>
+            <w:tcMar>
+              <w:top w:w="80" w:type="dxa"/>
+              <w:left w:w="100" w:type="dxa"/>
+              <w:bottom w:w="80" w:type="dxa"/>
+              <w:right w:w="100" w:type="dxa"/>
+            </w:tcMar>
+            <w:vAlign w:val="center"/>
+          </w:tcPr>
+          <w:p>
+            <w:pPr>
+              <w:spacing w:after="0"/>
+            </w:pPr>
+            <w:r>
+              <w:rPr>
+                <w:b w:val="0"/>
+                <w:bCs w:val="0"/>
+                <w:color w:val="202020"/>
+                <w:sz w:val="19"/>
+                <w:szCs w:val="19"/>
+              </w:rPr>
+              <w:t xml:space="preserve">This phone already owns a different unit.</w:t>
+            </w:r>
+          </w:p>
+        </w:tc>
+        <w:tc>
+          <w:tcPr>
+            <w:tcW w:w="3546" w:type="dxa"/>
+            <w:tcBorders>
+              <w:top w:val="single" w:color="B7C9C0" w:sz="4" w:space="0"/>
+              <w:left w:val="single" w:color="B7C9C0" w:sz="4" w:space="0"/>
+              <w:bottom w:val="single" w:color="B7C9C0" w:sz="4" w:space="0"/>
+              <w:right w:val="single" w:color="B7C9C0" w:sz="4" w:space="0"/>
+            </w:tcBorders>
+            <w:shd w:val="clear" w:color="auto" w:fill="FFF2CC"/>
+            <w:tcMar>
+              <w:top w:w="80" w:type="dxa"/>
+              <w:left w:w="100" w:type="dxa"/>
+              <w:bottom w:w="80" w:type="dxa"/>
+              <w:right w:w="100" w:type="dxa"/>
+            </w:tcMar>
+            <w:vAlign w:val="center"/>
+          </w:tcPr>
+          <w:p>
+            <w:pPr>
+              <w:spacing w:after="0"/>
+            </w:pPr>
+            <w:r>
+              <w:rPr>
+                <w:b/>
+                <w:bCs/>
+                <w:color w:val="202020"/>
+                <w:sz w:val="19"/>
+                <w:szCs w:val="19"/>
+              </w:rPr>
+              <w:t xml:space="preserve">Release that unit first, then pair to the new one.</w:t>
+            </w:r>
+          </w:p>
+        </w:tc>
+      </w:tr>
+      <w:tr>
+        <w:tc>
+          <w:tcPr>
+            <w:tcW w:w="3000" w:type="dxa"/>
+            <w:tcBorders>
+              <w:top w:val="single" w:color="B7C9C0" w:sz="4" w:space="0"/>
+              <w:left w:val="single" w:color="B7C9C0" w:sz="4" w:space="0"/>
+              <w:bottom w:val="single" w:color="B7C9C0" w:sz="4" w:space="0"/>
+              <w:right w:val="single" w:color="B7C9C0" w:sz="4" w:space="0"/>
+            </w:tcBorders>
+            <w:shd w:val="clear" w:color="auto" w:fill="FFFFFF"/>
+            <w:tcMar>
+              <w:top w:w="80" w:type="dxa"/>
+              <w:left w:w="100" w:type="dxa"/>
+              <w:bottom w:w="80" w:type="dxa"/>
+              <w:right w:w="100" w:type="dxa"/>
+            </w:tcMar>
+            <w:vAlign w:val="center"/>
+          </w:tcPr>
+          <w:p>
+            <w:pPr>
+              <w:spacing w:after="0"/>
+            </w:pPr>
+            <w:r>
+              <w:rPr>
+                <w:b w:val="0"/>
+                <w:bCs w:val="0"/>
+                <w:color w:val="202020"/>
+                <w:sz w:val="19"/>
+                <w:szCs w:val="19"/>
+              </w:rPr>
+              <w:t xml:space="preserve">That unit is bound to another device.</w:t>
+            </w:r>
+          </w:p>
+        </w:tc>
+        <w:tc>
+          <w:tcPr>
+            <w:tcW w:w="3200" w:type="dxa"/>
+            <w:tcBorders>
+              <w:top w:val="single" w:color="B7C9C0" w:sz="4" w:space="0"/>
+              <w:left w:val="single" w:color="B7C9C0" w:sz="4" w:space="0"/>
+              <w:bottom w:val="single" w:color="B7C9C0" w:sz="4" w:space="0"/>
+              <w:right w:val="single" w:color="B7C9C0" w:sz="4" w:space="0"/>
+            </w:tcBorders>
+            <w:shd w:val="clear" w:color="auto" w:fill="FFFFFF"/>
+            <w:tcMar>
+              <w:top w:w="80" w:type="dxa"/>
+              <w:left w:w="100" w:type="dxa"/>
+              <w:bottom w:w="80" w:type="dxa"/>
+              <w:right w:w="100" w:type="dxa"/>
+            </w:tcMar>
+            <w:vAlign w:val="center"/>
+          </w:tcPr>
+          <w:p>
+            <w:pPr>
+              <w:spacing w:after="0"/>
+            </w:pPr>
+            <w:r>
+              <w:rPr>
+                <w:b w:val="0"/>
+                <w:bCs w:val="0"/>
+                <w:color w:val="202020"/>
+                <w:sz w:val="19"/>
+                <w:szCs w:val="19"/>
+              </w:rPr>
+              <w:t xml:space="preserve">A different phone owns the unit.</w:t>
+            </w:r>
+          </w:p>
+        </w:tc>
+        <w:tc>
+          <w:tcPr>
+            <w:tcW w:w="3546" w:type="dxa"/>
+            <w:tcBorders>
+              <w:top w:val="single" w:color="B7C9C0" w:sz="4" w:space="0"/>
+              <w:left w:val="single" w:color="B7C9C0" w:sz="4" w:space="0"/>
+              <w:bottom w:val="single" w:color="B7C9C0" w:sz="4" w:space="0"/>
+              <w:right w:val="single" w:color="B7C9C0" w:sz="4" w:space="0"/>
+            </w:tcBorders>
+            <w:shd w:val="clear" w:color="auto" w:fill="FFF2CC"/>
+            <w:tcMar>
+              <w:top w:w="80" w:type="dxa"/>
+              <w:left w:w="100" w:type="dxa"/>
+              <w:bottom w:w="80" w:type="dxa"/>
+              <w:right w:w="100" w:type="dxa"/>
+            </w:tcMar>
+            <w:vAlign w:val="center"/>
+          </w:tcPr>
+          <w:p>
+            <w:pPr>
+              <w:spacing w:after="0"/>
+            </w:pPr>
+            <w:r>
+              <w:rPr>
+                <w:b/>
+                <w:bCs/>
+                <w:color w:val="202020"/>
+                <w:sz w:val="19"/>
+                <w:szCs w:val="19"/>
+              </w:rPr>
+              <w:t xml:space="preserve">Stop. Do not retry. The office must release the unit before this phone can take it.</w:t>
+            </w:r>
+          </w:p>
+        </w:tc>
+      </w:tr>
+      <w:tr>
+        <w:tc>
+          <w:tcPr>
+            <w:tcW w:w="3000" w:type="dxa"/>
+            <w:tcBorders>
+              <w:top w:val="single" w:color="B7C9C0" w:sz="4" w:space="0"/>
+              <w:left w:val="single" w:color="B7C9C0" w:sz="4" w:space="0"/>
+              <w:bottom w:val="single" w:color="B7C9C0" w:sz="4" w:space="0"/>
+              <w:right w:val="single" w:color="B7C9C0" w:sz="4" w:space="0"/>
+            </w:tcBorders>
+            <w:shd w:val="clear" w:color="auto" w:fill="FFFFFF"/>
+            <w:tcMar>
+              <w:top w:w="80" w:type="dxa"/>
+              <w:left w:w="100" w:type="dxa"/>
+              <w:bottom w:w="80" w:type="dxa"/>
+              <w:right w:w="100" w:type="dxa"/>
+            </w:tcMar>
+            <w:vAlign w:val="center"/>
+          </w:tcPr>
+          <w:p>
+            <w:pPr>
+              <w:spacing w:after="0"/>
+            </w:pPr>
+            <w:r>
+              <w:rPr>
+                <w:b w:val="0"/>
+                <w:bCs w:val="0"/>
+                <w:color w:val="202020"/>
+                <w:sz w:val="19"/>
+                <w:szCs w:val="19"/>
+              </w:rPr>
+              <w:t xml:space="preserve">This unit is finishing release from another device.</w:t>
+            </w:r>
+          </w:p>
+        </w:tc>
+        <w:tc>
+          <w:tcPr>
+            <w:tcW w:w="3200" w:type="dxa"/>
+            <w:tcBorders>
+              <w:top w:val="single" w:color="B7C9C0" w:sz="4" w:space="0"/>
+              <w:left w:val="single" w:color="B7C9C0" w:sz="4" w:space="0"/>
+              <w:bottom w:val="single" w:color="B7C9C0" w:sz="4" w:space="0"/>
+              <w:right w:val="single" w:color="B7C9C0" w:sz="4" w:space="0"/>
+            </w:tcBorders>
+            <w:shd w:val="clear" w:color="auto" w:fill="FFFFFF"/>
+            <w:tcMar>
+              <w:top w:w="80" w:type="dxa"/>
+              <w:left w:w="100" w:type="dxa"/>
+              <w:bottom w:w="80" w:type="dxa"/>
+              <w:right w:w="100" w:type="dxa"/>
+            </w:tcMar>
+            <w:vAlign w:val="center"/>
+          </w:tcPr>
+          <w:p>
+            <w:pPr>
+              <w:spacing w:after="0"/>
+            </w:pPr>
+            <w:r>
+              <w:rPr>
+                <w:b w:val="0"/>
+                <w:bCs w:val="0"/>
+                <w:color w:val="202020"/>
+                <w:sz w:val="19"/>
+                <w:szCs w:val="19"/>
+              </w:rPr>
+              <w:t xml:space="preserve">The previous phone is still inside its protected delivery window.</w:t>
+            </w:r>
+          </w:p>
+        </w:tc>
+        <w:tc>
+          <w:tcPr>
+            <w:tcW w:w="3546" w:type="dxa"/>
+            <w:tcBorders>
+              <w:top w:val="single" w:color="B7C9C0" w:sz="4" w:space="0"/>
+              <w:left w:val="single" w:color="B7C9C0" w:sz="4" w:space="0"/>
+              <w:bottom w:val="single" w:color="B7C9C0" w:sz="4" w:space="0"/>
+              <w:right w:val="single" w:color="B7C9C0" w:sz="4" w:space="0"/>
+            </w:tcBorders>
+            <w:shd w:val="clear" w:color="auto" w:fill="FFF2CC"/>
+            <w:tcMar>
+              <w:top w:w="80" w:type="dxa"/>
+              <w:left w:w="100" w:type="dxa"/>
+              <w:bottom w:w="80" w:type="dxa"/>
+              <w:right w:w="100" w:type="dxa"/>
+            </w:tcMar>
+            <w:vAlign w:val="center"/>
+          </w:tcPr>
+          <w:p>
+            <w:pPr>
+              <w:spacing w:after="0"/>
+            </w:pPr>
+            <w:r>
+              <w:rPr>
+                <w:b/>
+                <w:bCs/>
+                <w:color w:val="202020"/>
+                <w:sz w:val="19"/>
+                <w:szCs w:val="19"/>
+              </w:rPr>
+              <w:t xml:space="preserve">Wait a few minutes, then retry. The wait protects counts still being sent.</w:t>
+            </w:r>
+          </w:p>
+        </w:tc>
+      </w:tr>
+      <w:tr>
+        <w:tc>
+          <w:tcPr>
+            <w:tcW w:w="3000" w:type="dxa"/>
+            <w:tcBorders>
+              <w:top w:val="single" w:color="B7C9C0" w:sz="4" w:space="0"/>
+              <w:left w:val="single" w:color="B7C9C0" w:sz="4" w:space="0"/>
+              <w:bottom w:val="single" w:color="B7C9C0" w:sz="4" w:space="0"/>
+              <w:right w:val="single" w:color="B7C9C0" w:sz="4" w:space="0"/>
+            </w:tcBorders>
+            <w:shd w:val="clear" w:color="auto" w:fill="FFFFFF"/>
+            <w:tcMar>
+              <w:top w:w="80" w:type="dxa"/>
+              <w:left w:w="100" w:type="dxa"/>
+              <w:bottom w:w="80" w:type="dxa"/>
+              <w:right w:w="100" w:type="dxa"/>
+            </w:tcMar>
+            <w:vAlign w:val="center"/>
+          </w:tcPr>
+          <w:p>
+            <w:pPr>
+              <w:spacing w:after="0"/>
+            </w:pPr>
+            <w:r>
+              <w:rPr>
+                <w:b w:val="0"/>
+                <w:bCs w:val="0"/>
+                <w:color w:val="202020"/>
+                <w:sz w:val="19"/>
+                <w:szCs w:val="19"/>
+              </w:rPr>
+              <w:t xml:space="preserve">Supervisor code rejected. Check and retry.</w:t>
+            </w:r>
+          </w:p>
+        </w:tc>
+        <w:tc>
+          <w:tcPr>
+            <w:tcW w:w="3200" w:type="dxa"/>
+            <w:tcBorders>
+              <w:top w:val="single" w:color="B7C9C0" w:sz="4" w:space="0"/>
+              <w:left w:val="single" w:color="B7C9C0" w:sz="4" w:space="0"/>
+              <w:bottom w:val="single" w:color="B7C9C0" w:sz="4" w:space="0"/>
+              <w:right w:val="single" w:color="B7C9C0" w:sz="4" w:space="0"/>
+            </w:tcBorders>
+            <w:shd w:val="clear" w:color="auto" w:fill="FFFFFF"/>
+            <w:tcMar>
+              <w:top w:w="80" w:type="dxa"/>
+              <w:left w:w="100" w:type="dxa"/>
+              <w:bottom w:w="80" w:type="dxa"/>
+              <w:right w:w="100" w:type="dxa"/>
+            </w:tcMar>
+            <w:vAlign w:val="center"/>
+          </w:tcPr>
+          <w:p>
+            <w:pPr>
+              <w:spacing w:after="0"/>
+            </w:pPr>
+            <w:r>
+              <w:rPr>
+                <w:b w:val="0"/>
+                <w:bCs w:val="0"/>
+                <w:color w:val="202020"/>
+                <w:sz w:val="19"/>
+                <w:szCs w:val="19"/>
+              </w:rPr>
+              <w:t xml:space="preserve">The code is wrong, expired, or already used.</w:t>
+            </w:r>
+          </w:p>
+        </w:tc>
+        <w:tc>
+          <w:tcPr>
+            <w:tcW w:w="3546" w:type="dxa"/>
+            <w:tcBorders>
+              <w:top w:val="single" w:color="B7C9C0" w:sz="4" w:space="0"/>
+              <w:left w:val="single" w:color="B7C9C0" w:sz="4" w:space="0"/>
+              <w:bottom w:val="single" w:color="B7C9C0" w:sz="4" w:space="0"/>
+              <w:right w:val="single" w:color="B7C9C0" w:sz="4" w:space="0"/>
+            </w:tcBorders>
+            <w:shd w:val="clear" w:color="auto" w:fill="FFF2CC"/>
+            <w:tcMar>
+              <w:top w:w="80" w:type="dxa"/>
+              <w:left w:w="100" w:type="dxa"/>
+              <w:bottom w:w="80" w:type="dxa"/>
+              <w:right w:w="100" w:type="dxa"/>
+            </w:tcMar>
+            <w:vAlign w:val="center"/>
+          </w:tcPr>
+          <w:p>
+            <w:pPr>
+              <w:spacing w:after="0"/>
+            </w:pPr>
+            <w:r>
+              <w:rPr>
+                <w:b/>
+                <w:bCs/>
+                <w:color w:val="202020"/>
+                <w:sz w:val="19"/>
+                <w:szCs w:val="19"/>
+              </w:rPr>
+              <w:t xml:space="preserve">Request a fresh code. A code lasts 10 minutes and works once only.</w:t>
+            </w:r>
+          </w:p>
+        </w:tc>
+      </w:tr>
+      <w:tr>
+        <w:tc>
+          <w:tcPr>
+            <w:tcW w:w="3000" w:type="dxa"/>
+            <w:tcBorders>
+              <w:top w:val="single" w:color="B7C9C0" w:sz="4" w:space="0"/>
+              <w:left w:val="single" w:color="B7C9C0" w:sz="4" w:space="0"/>
+              <w:bottom w:val="single" w:color="B7C9C0" w:sz="4" w:space="0"/>
+              <w:right w:val="single" w:color="B7C9C0" w:sz="4" w:space="0"/>
+            </w:tcBorders>
+            <w:shd w:val="clear" w:color="auto" w:fill="FFFFFF"/>
+            <w:tcMar>
+              <w:top w:w="80" w:type="dxa"/>
+              <w:left w:w="100" w:type="dxa"/>
+              <w:bottom w:w="80" w:type="dxa"/>
+              <w:right w:w="100" w:type="dxa"/>
+            </w:tcMar>
+            <w:vAlign w:val="center"/>
+          </w:tcPr>
+          <w:p>
+            <w:pPr>
+              <w:spacing w:after="0"/>
+            </w:pPr>
+            <w:r>
+              <w:rPr>
+                <w:b w:val="0"/>
+                <w:bCs w:val="0"/>
+                <w:color w:val="202020"/>
+                <w:sz w:val="19"/>
+                <w:szCs w:val="19"/>
+              </w:rPr>
+              <w:t xml:space="preserve">Supervisor code is not configured.</w:t>
+            </w:r>
+          </w:p>
+        </w:tc>
+        <w:tc>
+          <w:tcPr>
+            <w:tcW w:w="3200" w:type="dxa"/>
+            <w:tcBorders>
+              <w:top w:val="single" w:color="B7C9C0" w:sz="4" w:space="0"/>
+              <w:left w:val="single" w:color="B7C9C0" w:sz="4" w:space="0"/>
+              <w:bottom w:val="single" w:color="B7C9C0" w:sz="4" w:space="0"/>
+              <w:right w:val="single" w:color="B7C9C0" w:sz="4" w:space="0"/>
+            </w:tcBorders>
+            <w:shd w:val="clear" w:color="auto" w:fill="FFFFFF"/>
+            <w:tcMar>
+              <w:top w:w="80" w:type="dxa"/>
+              <w:left w:w="100" w:type="dxa"/>
+              <w:bottom w:w="80" w:type="dxa"/>
+              <w:right w:w="100" w:type="dxa"/>
+            </w:tcMar>
+            <w:vAlign w:val="center"/>
+          </w:tcPr>
+          <w:p>
+            <w:pPr>
+              <w:spacing w:after="0"/>
+            </w:pPr>
+            <w:r>
+              <w:rPr>
+                <w:b w:val="0"/>
+                <w:bCs w:val="0"/>
+                <w:color w:val="202020"/>
+                <w:sz w:val="19"/>
+                <w:szCs w:val="19"/>
+              </w:rPr>
+              <w:t xml:space="preserve">The office code service is not set up.</w:t>
+            </w:r>
+          </w:p>
+        </w:tc>
+        <w:tc>
+          <w:tcPr>
+            <w:tcW w:w="3546" w:type="dxa"/>
+            <w:tcBorders>
+              <w:top w:val="single" w:color="B7C9C0" w:sz="4" w:space="0"/>
+              <w:left w:val="single" w:color="B7C9C0" w:sz="4" w:space="0"/>
+              <w:bottom w:val="single" w:color="B7C9C0" w:sz="4" w:space="0"/>
+              <w:right w:val="single" w:color="B7C9C0" w:sz="4" w:space="0"/>
+            </w:tcBorders>
+            <w:shd w:val="clear" w:color="auto" w:fill="FFF2CC"/>
+            <w:tcMar>
+              <w:top w:w="80" w:type="dxa"/>
+              <w:left w:w="100" w:type="dxa"/>
+              <w:bottom w:w="80" w:type="dxa"/>
+              <w:right w:w="100" w:type="dxa"/>
+            </w:tcMar>
+            <w:vAlign w:val="center"/>
+          </w:tcPr>
+          <w:p>
+            <w:pPr>
+              <w:spacing w:after="0"/>
+            </w:pPr>
+            <w:r>
+              <w:rPr>
+                <w:b/>
+                <w:bCs/>
+                <w:color w:val="202020"/>
+                <w:sz w:val="19"/>
+                <w:szCs w:val="19"/>
+              </w:rPr>
+              <w:t xml:space="preserve">Contact the office administrator. Nothing can be fixed on the phone.</w:t>
+            </w:r>
+          </w:p>
+        </w:tc>
+      </w:tr>
+      <w:tr>
+        <w:tc>
+          <w:tcPr>
+            <w:tcW w:w="3000" w:type="dxa"/>
+            <w:tcBorders>
+              <w:top w:val="single" w:color="B7C9C0" w:sz="4" w:space="0"/>
+              <w:left w:val="single" w:color="B7C9C0" w:sz="4" w:space="0"/>
+              <w:bottom w:val="single" w:color="B7C9C0" w:sz="4" w:space="0"/>
+              <w:right w:val="single" w:color="B7C9C0" w:sz="4" w:space="0"/>
+            </w:tcBorders>
+            <w:shd w:val="clear" w:color="auto" w:fill="FFFFFF"/>
+            <w:tcMar>
+              <w:top w:w="80" w:type="dxa"/>
+              <w:left w:w="100" w:type="dxa"/>
+              <w:bottom w:w="80" w:type="dxa"/>
+              <w:right w:w="100" w:type="dxa"/>
+            </w:tcMar>
+            <w:vAlign w:val="center"/>
+          </w:tcPr>
+          <w:p>
+            <w:pPr>
+              <w:spacing w:after="0"/>
+            </w:pPr>
+            <w:r>
+              <w:rPr>
+                <w:b w:val="0"/>
+                <w:bCs w:val="0"/>
+                <w:color w:val="202020"/>
+                <w:sz w:val="19"/>
+                <w:szCs w:val="19"/>
+              </w:rPr>
+              <w:t xml:space="preserve">No connection. Connect and retry.</w:t>
+            </w:r>
+          </w:p>
+        </w:tc>
+        <w:tc>
+          <w:tcPr>
+            <w:tcW w:w="3200" w:type="dxa"/>
+            <w:tcBorders>
+              <w:top w:val="single" w:color="B7C9C0" w:sz="4" w:space="0"/>
+              <w:left w:val="single" w:color="B7C9C0" w:sz="4" w:space="0"/>
+              <w:bottom w:val="single" w:color="B7C9C0" w:sz="4" w:space="0"/>
+              <w:right w:val="single" w:color="B7C9C0" w:sz="4" w:space="0"/>
+            </w:tcBorders>
+            <w:shd w:val="clear" w:color="auto" w:fill="FFFFFF"/>
+            <w:tcMar>
+              <w:top w:w="80" w:type="dxa"/>
+              <w:left w:w="100" w:type="dxa"/>
+              <w:bottom w:w="80" w:type="dxa"/>
+              <w:right w:w="100" w:type="dxa"/>
+            </w:tcMar>
+            <w:vAlign w:val="center"/>
+          </w:tcPr>
+          <w:p>
+            <w:pPr>
+              <w:spacing w:after="0"/>
+            </w:pPr>
+            <w:r>
+              <w:rPr>
+                <w:b w:val="0"/>
+                <w:bCs w:val="0"/>
+                <w:color w:val="202020"/>
+                <w:sz w:val="19"/>
+                <w:szCs w:val="19"/>
+              </w:rPr>
+              <w:t xml:space="preserve">The phone cannot reach the office service.</w:t>
+            </w:r>
+          </w:p>
+        </w:tc>
+        <w:tc>
+          <w:tcPr>
+            <w:tcW w:w="3546" w:type="dxa"/>
+            <w:tcBorders>
+              <w:top w:val="single" w:color="B7C9C0" w:sz="4" w:space="0"/>
+              <w:left w:val="single" w:color="B7C9C0" w:sz="4" w:space="0"/>
+              <w:bottom w:val="single" w:color="B7C9C0" w:sz="4" w:space="0"/>
+              <w:right w:val="single" w:color="B7C9C0" w:sz="4" w:space="0"/>
+            </w:tcBorders>
+            <w:shd w:val="clear" w:color="auto" w:fill="FFF2CC"/>
+            <w:tcMar>
+              <w:top w:w="80" w:type="dxa"/>
+              <w:left w:w="100" w:type="dxa"/>
+              <w:bottom w:w="80" w:type="dxa"/>
+              <w:right w:w="100" w:type="dxa"/>
+            </w:tcMar>
+            <w:vAlign w:val="center"/>
+          </w:tcPr>
+          <w:p>
+            <w:pPr>
+              <w:spacing w:after="0"/>
+            </w:pPr>
+            <w:r>
+              <w:rPr>
+                <w:b/>
+                <w:bCs/>
+                <w:color w:val="202020"/>
+                <w:sz w:val="19"/>
+                <w:szCs w:val="19"/>
+              </w:rPr>
+              <w:t xml:space="preserve">Restore the network and retry. Nothing is lost by retrying.</w:t>
+            </w:r>
+          </w:p>
+        </w:tc>
+      </w:tr>
+    </w:tbl>
+    <w:p>
+      <w:pPr>
+        <w:spacing w:after="100"/>
+      </w:pPr>
+    </w:p>
+    <w:p>
+      <w:pPr>
+        <w:spacing w:after="100"/>
+      </w:pPr>
+      <w:r>
+        <w:rPr>
+          <w:b/>
+          <w:bCs/>
+        </w:rPr>
+        <w:t xml:space="preserve">Before releasing or handing back a phone</w:t>
+      </w:r>
+    </w:p>
+    <w:p>
+      <w:pPr>
+        <w:numPr>
+          <w:ilvl w:val="0"/>
+          <w:numId w:val="2"/>
+        </w:numPr>
+        <w:spacing w:after="50"/>
+      </w:pPr>
+      <w:r>
+        <w:t xml:space="preserve">Deliver pending counts first, and confirm the push completed.</w:t>
+      </w:r>
+    </w:p>
+    <w:p>
+      <w:pPr>
+        <w:numPr>
+          <w:ilvl w:val="0"/>
+          <w:numId w:val="2"/>
+        </w:numPr>
+        <w:spacing w:after="50"/>
+      </w:pPr>
+      <w:r>
+        <w:t xml:space="preserve">Only then use the protected administrator release control with a valid supervisor code.</w:t>
+      </w:r>
+    </w:p>
+    <w:p>
+      <w:pPr>
+        <w:numPr>
+          <w:ilvl w:val="0"/>
+          <w:numId w:val="2"/>
+        </w:numPr>
+        <w:spacing w:after="50"/>
+      </w:pPr>
+      <w:r>
+        <w:t xml:space="preserve">Never uninstall the app to fix a delivery problem. Uninstalling destroys counts that have not been sent, and skips the safe release sequence entirely.</w:t>
+      </w:r>
+    </w:p>
+    <w:p>
+      <w:pPr>
+        <w:spacing w:after="60"/>
+      </w:pPr>
+      <w:r>
+        <w:t xml:space="preserve"/>
+      </w:r>
+    </w:p>
+    <w:p>
+      <w:pPr>
+        <w:spacing w:after="100"/>
+      </w:pPr>
+      <w:r>
+        <w:rPr>
+          <w:b/>
+          <w:bCs/>
+        </w:rPr>
+        <w:t xml:space="preserve">Fallback when a phone is reset, lost, or damaged</w:t>
+      </w:r>
+    </w:p>
+    <w:p>
+      <w:pPr>
+        <w:spacing w:after="100"/>
+      </w:pPr>
+      <w:r>
+        <w:t xml:space="preserve">A factory reset changes the phone's Android identity. The rebuilt phone can no longer prove it owned the unit, so it cannot release the unit itself and cannot simply pair to it again. The office must force-release the unit first. The same unit ID can then be paired to the rebuilt or replacement phone, keeping its identity and its history.</w:t>
+      </w:r>
+    </w:p>
+    <w:tbl>
+      <w:tblPr>
+        <w:tblStyle w:val="9"/>
+        <w:tblW w:w="9746" w:type="dxa"/>
+        <w:tblInd w:w="0" w:type="dxa"/>
+        <w:tblBorders>
+          <w:top w:val="single" w:color="auto" w:sz="4" w:space="0"/>
+          <w:left w:val="single" w:color="auto" w:sz="4" w:space="0"/>
+          <w:bottom w:val="single" w:color="auto" w:sz="4" w:space="0"/>
+          <w:right w:val="single" w:color="auto" w:sz="4" w:space="0"/>
+          <w:insideH w:val="single" w:color="auto" w:sz="4" w:space="0"/>
+          <w:insideV w:val="single" w:color="auto" w:sz="4" w:space="0"/>
+        </w:tblBorders>
+        <w:tblLayout w:type="autofit"/>
+        <w:tblCellMar>
+          <w:top w:w="0" w:type="dxa"/>
+          <w:left w:w="10" w:type="dxa"/>
+          <w:bottom w:w="0" w:type="dxa"/>
+          <w:right w:w="10" w:type="dxa"/>
+        </w:tblCellMar>
+      </w:tblPr>
+      <w:tblGrid>
+        <w:gridCol w:w="2900"/>
+        <w:gridCol w:w="3200"/>
+        <w:gridCol w:w="3646"/>
+      </w:tblGrid>
+      <w:tr>
+        <w:trPr>
+          <w:tblHeader/>
+        </w:trPr>
+        <w:tc>
+          <w:tcPr>
+            <w:tcW w:w="2900" w:type="dxa"/>
+            <w:tcBorders>
+              <w:top w:val="single" w:color="B7C9C0" w:sz="4" w:space="0"/>
+              <w:left w:val="single" w:color="B7C9C0" w:sz="4" w:space="0"/>
+              <w:bottom w:val="single" w:color="B7C9C0" w:sz="4" w:space="0"/>
+              <w:right w:val="single" w:color="B7C9C0" w:sz="4" w:space="0"/>
+            </w:tcBorders>
+            <w:shd w:val="clear" w:color="auto" w:fill="1F4E3D"/>
+            <w:tcMar>
+              <w:top w:w="80" w:type="dxa"/>
+              <w:left w:w="100" w:type="dxa"/>
+              <w:bottom w:w="80" w:type="dxa"/>
+              <w:right w:w="100" w:type="dxa"/>
+            </w:tcMar>
+            <w:vAlign w:val="center"/>
+          </w:tcPr>
+          <w:p>
+            <w:pPr>
+              <w:spacing w:after="0"/>
+            </w:pPr>
+            <w:r>
+              <w:rPr>
+                <w:b/>
+                <w:bCs/>
+                <w:color w:val="FFFFFF"/>
+                <w:sz w:val="19"/>
+                <w:szCs w:val="19"/>
+              </w:rPr>
+              <w:t xml:space="preserve">Scenario</w:t>
+            </w:r>
+          </w:p>
+        </w:tc>
+        <w:tc>
+          <w:tcPr>
+            <w:tcW w:w="3200" w:type="dxa"/>
+            <w:tcBorders>
+              <w:top w:val="single" w:color="B7C9C0" w:sz="4" w:space="0"/>
+              <w:left w:val="single" w:color="B7C9C0" w:sz="4" w:space="0"/>
+              <w:bottom w:val="single" w:color="B7C9C0" w:sz="4" w:space="0"/>
+              <w:right w:val="single" w:color="B7C9C0" w:sz="4" w:space="0"/>
+            </w:tcBorders>
+            <w:shd w:val="clear" w:color="auto" w:fill="1F4E3D"/>
+            <w:tcMar>
+              <w:top w:w="80" w:type="dxa"/>
+              <w:left w:w="100" w:type="dxa"/>
+              <w:bottom w:w="80" w:type="dxa"/>
+              <w:right w:w="100" w:type="dxa"/>
+            </w:tcMar>
+            <w:vAlign w:val="center"/>
+          </w:tcPr>
+          <w:p>
+            <w:pPr>
+              <w:spacing w:after="0"/>
+            </w:pPr>
+            <w:r>
+              <w:rPr>
+                <w:b/>
+                <w:bCs/>
+                <w:color w:val="FFFFFF"/>
+                <w:sz w:val="19"/>
+                <w:szCs w:val="19"/>
+              </w:rPr>
+              <w:t xml:space="preserve">What has happened</w:t>
+            </w:r>
+          </w:p>
+        </w:tc>
+        <w:tc>
+          <w:tcPr>
+            <w:tcW w:w="3646" w:type="dxa"/>
+            <w:tcBorders>
+              <w:top w:val="single" w:color="B7C9C0" w:sz="4" w:space="0"/>
+              <w:left w:val="single" w:color="B7C9C0" w:sz="4" w:space="0"/>
+              <w:bottom w:val="single" w:color="B7C9C0" w:sz="4" w:space="0"/>
+              <w:right w:val="single" w:color="B7C9C0" w:sz="4" w:space="0"/>
+            </w:tcBorders>
+            <w:shd w:val="clear" w:color="auto" w:fill="1F4E3D"/>
+            <w:tcMar>
+              <w:top w:w="80" w:type="dxa"/>
+              <w:left w:w="100" w:type="dxa"/>
+              <w:bottom w:w="80" w:type="dxa"/>
+              <w:right w:w="100" w:type="dxa"/>
+            </w:tcMar>
+            <w:vAlign w:val="center"/>
+          </w:tcPr>
+          <w:p>
+            <w:pPr>
+              <w:spacing w:after="0"/>
+            </w:pPr>
+            <w:r>
+              <w:rPr>
+                <w:b/>
+                <w:bCs/>
+                <w:color w:val="FFFFFF"/>
+                <w:sz w:val="19"/>
+                <w:szCs w:val="19"/>
+              </w:rPr>
+              <w:t xml:space="preserve">Correct response</w:t>
+            </w:r>
+          </w:p>
+        </w:tc>
+      </w:tr>
+      <w:tr>
+        <w:tc>
+          <w:tcPr>
+            <w:tcW w:w="2900" w:type="dxa"/>
+            <w:tcBorders>
+              <w:top w:val="single" w:color="B7C9C0" w:sz="4" w:space="0"/>
+              <w:left w:val="single" w:color="B7C9C0" w:sz="4" w:space="0"/>
+              <w:bottom w:val="single" w:color="B7C9C0" w:sz="4" w:space="0"/>
+              <w:right w:val="single" w:color="B7C9C0" w:sz="4" w:space="0"/>
+            </w:tcBorders>
+            <w:shd w:val="clear" w:color="auto" w:fill="FFFFFF"/>
+            <w:tcMar>
+              <w:top w:w="80" w:type="dxa"/>
+              <w:left w:w="100" w:type="dxa"/>
+              <w:bottom w:w="80" w:type="dxa"/>
+              <w:right w:w="100" w:type="dxa"/>
+            </w:tcMar>
+            <w:vAlign w:val="center"/>
+          </w:tcPr>
+          <w:p>
+            <w:pPr>
+              <w:spacing w:after="0"/>
+            </w:pPr>
+            <w:r>
+              <w:rPr>
+                <w:b w:val="0"/>
+                <w:bCs w:val="0"/>
+                <w:color w:val="202020"/>
+                <w:sz w:val="19"/>
+                <w:szCs w:val="19"/>
+              </w:rPr>
+              <w:t xml:space="preserve">Phone works and is being reassigned</w:t>
+            </w:r>
+          </w:p>
+        </w:tc>
+        <w:tc>
+          <w:tcPr>
+            <w:tcW w:w="3200" w:type="dxa"/>
+            <w:tcBorders>
+              <w:top w:val="single" w:color="B7C9C0" w:sz="4" w:space="0"/>
+              <w:left w:val="single" w:color="B7C9C0" w:sz="4" w:space="0"/>
+              <w:bottom w:val="single" w:color="B7C9C0" w:sz="4" w:space="0"/>
+              <w:right w:val="single" w:color="B7C9C0" w:sz="4" w:space="0"/>
+            </w:tcBorders>
+            <w:shd w:val="clear" w:color="auto" w:fill="FFFFFF"/>
+            <w:tcMar>
+              <w:top w:w="80" w:type="dxa"/>
+              <w:left w:w="100" w:type="dxa"/>
+              <w:bottom w:w="80" w:type="dxa"/>
+              <w:right w:w="100" w:type="dxa"/>
+            </w:tcMar>
+            <w:vAlign w:val="center"/>
+          </w:tcPr>
+          <w:p>
+            <w:pPr>
+              <w:spacing w:after="0"/>
+            </w:pPr>
+            <w:r>
+              <w:rPr>
+                <w:b w:val="0"/>
+                <w:bCs w:val="0"/>
+                <w:color w:val="202020"/>
+                <w:sz w:val="19"/>
+                <w:szCs w:val="19"/>
+              </w:rPr>
+              <w:t xml:space="preserve">Normal case. The app can still prove it owns the unit.</w:t>
+            </w:r>
+          </w:p>
+        </w:tc>
+        <w:tc>
+          <w:tcPr>
+            <w:tcW w:w="3646" w:type="dxa"/>
+            <w:tcBorders>
+              <w:top w:val="single" w:color="B7C9C0" w:sz="4" w:space="0"/>
+              <w:left w:val="single" w:color="B7C9C0" w:sz="4" w:space="0"/>
+              <w:bottom w:val="single" w:color="B7C9C0" w:sz="4" w:space="0"/>
+              <w:right w:val="single" w:color="B7C9C0" w:sz="4" w:space="0"/>
+            </w:tcBorders>
+            <w:shd w:val="clear" w:color="auto" w:fill="FFF2CC"/>
+            <w:tcMar>
+              <w:top w:w="80" w:type="dxa"/>
+              <w:left w:w="100" w:type="dxa"/>
+              <w:bottom w:w="80" w:type="dxa"/>
+              <w:right w:w="100" w:type="dxa"/>
+            </w:tcMar>
+            <w:vAlign w:val="center"/>
+          </w:tcPr>
+          <w:p>
+            <w:pPr>
+              <w:spacing w:after="0"/>
+            </w:pPr>
+            <w:r>
+              <w:rPr>
+                <w:b/>
+                <w:bCs/>
+                <w:color w:val="202020"/>
+                <w:sz w:val="19"/>
+                <w:szCs w:val="19"/>
+              </w:rPr>
+              <w:t xml:space="preserve">Release from the app with a supervisor code. Pending counts are delivered first.</w:t>
+            </w:r>
+          </w:p>
+        </w:tc>
+      </w:tr>
+      <w:tr>
+        <w:tc>
+          <w:tcPr>
+            <w:tcW w:w="2900" w:type="dxa"/>
+            <w:tcBorders>
+              <w:top w:val="single" w:color="B7C9C0" w:sz="4" w:space="0"/>
+              <w:left w:val="single" w:color="B7C9C0" w:sz="4" w:space="0"/>
+              <w:bottom w:val="single" w:color="B7C9C0" w:sz="4" w:space="0"/>
+              <w:right w:val="single" w:color="B7C9C0" w:sz="4" w:space="0"/>
+            </w:tcBorders>
+            <w:shd w:val="clear" w:color="auto" w:fill="FFFFFF"/>
+            <w:tcMar>
+              <w:top w:w="80" w:type="dxa"/>
+              <w:left w:w="100" w:type="dxa"/>
+              <w:bottom w:w="80" w:type="dxa"/>
+              <w:right w:w="100" w:type="dxa"/>
+            </w:tcMar>
+            <w:vAlign w:val="center"/>
+          </w:tcPr>
+          <w:p>
+            <w:pPr>
+              <w:spacing w:after="0"/>
+            </w:pPr>
+            <w:r>
+              <w:rPr>
+                <w:b w:val="0"/>
+                <w:bCs w:val="0"/>
+                <w:color w:val="202020"/>
+                <w:sz w:val="19"/>
+                <w:szCs w:val="19"/>
+              </w:rPr>
+              <w:t xml:space="preserve">Phone was reset without releasing</w:t>
+            </w:r>
+          </w:p>
+        </w:tc>
+        <w:tc>
+          <w:tcPr>
+            <w:tcW w:w="3200" w:type="dxa"/>
+            <w:tcBorders>
+              <w:top w:val="single" w:color="B7C9C0" w:sz="4" w:space="0"/>
+              <w:left w:val="single" w:color="B7C9C0" w:sz="4" w:space="0"/>
+              <w:bottom w:val="single" w:color="B7C9C0" w:sz="4" w:space="0"/>
+              <w:right w:val="single" w:color="B7C9C0" w:sz="4" w:space="0"/>
+            </w:tcBorders>
+            <w:shd w:val="clear" w:color="auto" w:fill="FFFFFF"/>
+            <w:tcMar>
+              <w:top w:w="80" w:type="dxa"/>
+              <w:left w:w="100" w:type="dxa"/>
+              <w:bottom w:w="80" w:type="dxa"/>
+              <w:right w:w="100" w:type="dxa"/>
+            </w:tcMar>
+            <w:vAlign w:val="center"/>
+          </w:tcPr>
+          <w:p>
+            <w:pPr>
+              <w:spacing w:after="0"/>
+            </w:pPr>
+            <w:r>
+              <w:rPr>
+                <w:b w:val="0"/>
+                <w:bCs w:val="0"/>
+                <w:color w:val="202020"/>
+                <w:sz w:val="19"/>
+                <w:szCs w:val="19"/>
+              </w:rPr>
+              <w:t xml:space="preserve">The register still shows the unit claimed by an identity that no longer exists.</w:t>
+            </w:r>
+          </w:p>
+        </w:tc>
+        <w:tc>
+          <w:tcPr>
+            <w:tcW w:w="3646" w:type="dxa"/>
+            <w:tcBorders>
+              <w:top w:val="single" w:color="B7C9C0" w:sz="4" w:space="0"/>
+              <w:left w:val="single" w:color="B7C9C0" w:sz="4" w:space="0"/>
+              <w:bottom w:val="single" w:color="B7C9C0" w:sz="4" w:space="0"/>
+              <w:right w:val="single" w:color="B7C9C0" w:sz="4" w:space="0"/>
+            </w:tcBorders>
+            <w:shd w:val="clear" w:color="auto" w:fill="FFF2CC"/>
+            <w:tcMar>
+              <w:top w:w="80" w:type="dxa"/>
+              <w:left w:w="100" w:type="dxa"/>
+              <w:bottom w:w="80" w:type="dxa"/>
+              <w:right w:w="100" w:type="dxa"/>
+            </w:tcMar>
+            <w:vAlign w:val="center"/>
+          </w:tcPr>
+          <w:p>
+            <w:pPr>
+              <w:spacing w:after="0"/>
+            </w:pPr>
+            <w:r>
+              <w:rPr>
+                <w:b/>
+                <w:bCs/>
+                <w:color w:val="202020"/>
+                <w:sz w:val="19"/>
+                <w:szCs w:val="19"/>
+              </w:rPr>
+              <w:t xml:space="preserve">Ask the office to force-release the unit, then pair the same unit ID again.</w:t>
+            </w:r>
+          </w:p>
+        </w:tc>
+      </w:tr>
+      <w:tr>
+        <w:tc>
+          <w:tcPr>
+            <w:tcW w:w="2900" w:type="dxa"/>
+            <w:tcBorders>
+              <w:top w:val="single" w:color="B7C9C0" w:sz="4" w:space="0"/>
+              <w:left w:val="single" w:color="B7C9C0" w:sz="4" w:space="0"/>
+              <w:bottom w:val="single" w:color="B7C9C0" w:sz="4" w:space="0"/>
+              <w:right w:val="single" w:color="B7C9C0" w:sz="4" w:space="0"/>
+            </w:tcBorders>
+            <w:shd w:val="clear" w:color="auto" w:fill="FFFFFF"/>
+            <w:tcMar>
+              <w:top w:w="80" w:type="dxa"/>
+              <w:left w:w="100" w:type="dxa"/>
+              <w:bottom w:w="80" w:type="dxa"/>
+              <w:right w:w="100" w:type="dxa"/>
+            </w:tcMar>
+            <w:vAlign w:val="center"/>
+          </w:tcPr>
+          <w:p>
+            <w:pPr>
+              <w:spacing w:after="0"/>
+            </w:pPr>
+            <w:r>
+              <w:rPr>
+                <w:b w:val="0"/>
+                <w:bCs w:val="0"/>
+                <w:color w:val="202020"/>
+                <w:sz w:val="19"/>
+                <w:szCs w:val="19"/>
+              </w:rPr>
+              <w:t xml:space="preserve">Phone lost, stolen, or dead</w:t>
+            </w:r>
+          </w:p>
+        </w:tc>
+        <w:tc>
+          <w:tcPr>
+            <w:tcW w:w="3200" w:type="dxa"/>
+            <w:tcBorders>
+              <w:top w:val="single" w:color="B7C9C0" w:sz="4" w:space="0"/>
+              <w:left w:val="single" w:color="B7C9C0" w:sz="4" w:space="0"/>
+              <w:bottom w:val="single" w:color="B7C9C0" w:sz="4" w:space="0"/>
+              <w:right w:val="single" w:color="B7C9C0" w:sz="4" w:space="0"/>
+            </w:tcBorders>
+            <w:shd w:val="clear" w:color="auto" w:fill="FFFFFF"/>
+            <w:tcMar>
+              <w:top w:w="80" w:type="dxa"/>
+              <w:left w:w="100" w:type="dxa"/>
+              <w:bottom w:w="80" w:type="dxa"/>
+              <w:right w:w="100" w:type="dxa"/>
+            </w:tcMar>
+            <w:vAlign w:val="center"/>
+          </w:tcPr>
+          <w:p>
+            <w:pPr>
+              <w:spacing w:after="0"/>
+            </w:pPr>
+            <w:r>
+              <w:rPr>
+                <w:b w:val="0"/>
+                <w:bCs w:val="0"/>
+                <w:color w:val="202020"/>
+                <w:sz w:val="19"/>
+                <w:szCs w:val="19"/>
+              </w:rPr>
+              <w:t xml:space="preserve">The unit stays claimed and no phone is able to release it.</w:t>
+            </w:r>
+          </w:p>
+        </w:tc>
+        <w:tc>
+          <w:tcPr>
+            <w:tcW w:w="3646" w:type="dxa"/>
+            <w:tcBorders>
+              <w:top w:val="single" w:color="B7C9C0" w:sz="4" w:space="0"/>
+              <w:left w:val="single" w:color="B7C9C0" w:sz="4" w:space="0"/>
+              <w:bottom w:val="single" w:color="B7C9C0" w:sz="4" w:space="0"/>
+              <w:right w:val="single" w:color="B7C9C0" w:sz="4" w:space="0"/>
+            </w:tcBorders>
+            <w:shd w:val="clear" w:color="auto" w:fill="FFF2CC"/>
+            <w:tcMar>
+              <w:top w:w="80" w:type="dxa"/>
+              <w:left w:w="100" w:type="dxa"/>
+              <w:bottom w:w="80" w:type="dxa"/>
+              <w:right w:w="100" w:type="dxa"/>
+            </w:tcMar>
+            <w:vAlign w:val="center"/>
+          </w:tcPr>
+          <w:p>
+            <w:pPr>
+              <w:spacing w:after="0"/>
+            </w:pPr>
+            <w:r>
+              <w:rPr>
+                <w:b/>
+                <w:bCs/>
+                <w:color w:val="202020"/>
+                <w:sz w:val="19"/>
+                <w:szCs w:val="19"/>
+              </w:rPr>
+              <w:t xml:space="preserve">Ask the office to force-release the unit, then pair the replacement phone.</w:t>
+            </w:r>
+          </w:p>
+        </w:tc>
+      </w:tr>
+      <w:tr>
+        <w:tc>
+          <w:tcPr>
+            <w:tcW w:w="2900" w:type="dxa"/>
+            <w:tcBorders>
+              <w:top w:val="single" w:color="B7C9C0" w:sz="4" w:space="0"/>
+              <w:left w:val="single" w:color="B7C9C0" w:sz="4" w:space="0"/>
+              <w:bottom w:val="single" w:color="B7C9C0" w:sz="4" w:space="0"/>
+              <w:right w:val="single" w:color="B7C9C0" w:sz="4" w:space="0"/>
+            </w:tcBorders>
+            <w:shd w:val="clear" w:color="auto" w:fill="FFFFFF"/>
+            <w:tcMar>
+              <w:top w:w="80" w:type="dxa"/>
+              <w:left w:w="100" w:type="dxa"/>
+              <w:bottom w:w="80" w:type="dxa"/>
+              <w:right w:w="100" w:type="dxa"/>
+            </w:tcMar>
+            <w:vAlign w:val="center"/>
+          </w:tcPr>
+          <w:p>
+            <w:pPr>
+              <w:spacing w:after="0"/>
+            </w:pPr>
+            <w:r>
+              <w:rPr>
+                <w:b w:val="0"/>
+                <w:bCs w:val="0"/>
+                <w:color w:val="202020"/>
+                <w:sz w:val="19"/>
+                <w:szCs w:val="19"/>
+              </w:rPr>
+              <w:t xml:space="preserve">App unexpectedly returns to the pairing screen</w:t>
+            </w:r>
+          </w:p>
+        </w:tc>
+        <w:tc>
+          <w:tcPr>
+            <w:tcW w:w="3200" w:type="dxa"/>
+            <w:tcBorders>
+              <w:top w:val="single" w:color="B7C9C0" w:sz="4" w:space="0"/>
+              <w:left w:val="single" w:color="B7C9C0" w:sz="4" w:space="0"/>
+              <w:bottom w:val="single" w:color="B7C9C0" w:sz="4" w:space="0"/>
+              <w:right w:val="single" w:color="B7C9C0" w:sz="4" w:space="0"/>
+            </w:tcBorders>
+            <w:shd w:val="clear" w:color="auto" w:fill="FFFFFF"/>
+            <w:tcMar>
+              <w:top w:w="80" w:type="dxa"/>
+              <w:left w:w="100" w:type="dxa"/>
+              <w:bottom w:w="80" w:type="dxa"/>
+              <w:right w:w="100" w:type="dxa"/>
+            </w:tcMar>
+            <w:vAlign w:val="center"/>
+          </w:tcPr>
+          <w:p>
+            <w:pPr>
+              <w:spacing w:after="0"/>
+            </w:pPr>
+            <w:r>
+              <w:rPr>
+                <w:b w:val="0"/>
+                <w:bCs w:val="0"/>
+                <w:color w:val="202020"/>
+                <w:sz w:val="19"/>
+                <w:szCs w:val="19"/>
+              </w:rPr>
+              <w:t xml:space="preserve">The unit was released or reassigned somewhere else.</w:t>
+            </w:r>
+          </w:p>
+        </w:tc>
+        <w:tc>
+          <w:tcPr>
+            <w:tcW w:w="3646" w:type="dxa"/>
+            <w:tcBorders>
+              <w:top w:val="single" w:color="B7C9C0" w:sz="4" w:space="0"/>
+              <w:left w:val="single" w:color="B7C9C0" w:sz="4" w:space="0"/>
+              <w:bottom w:val="single" w:color="B7C9C0" w:sz="4" w:space="0"/>
+              <w:right w:val="single" w:color="B7C9C0" w:sz="4" w:space="0"/>
+            </w:tcBorders>
+            <w:shd w:val="clear" w:color="auto" w:fill="FFF2CC"/>
+            <w:tcMar>
+              <w:top w:w="80" w:type="dxa"/>
+              <w:left w:w="100" w:type="dxa"/>
+              <w:bottom w:w="80" w:type="dxa"/>
+              <w:right w:w="100" w:type="dxa"/>
+            </w:tcMar>
+            <w:vAlign w:val="center"/>
+          </w:tcPr>
+          <w:p>
+            <w:pPr>
+              <w:spacing w:after="0"/>
+            </w:pPr>
+            <w:r>
+              <w:rPr>
+                <w:b/>
+                <w:bCs/>
+                <w:color w:val="202020"/>
+                <w:sz w:val="19"/>
+                <w:szCs w:val="19"/>
+              </w:rPr>
+              <w:t xml:space="preserve">Stop counting. Do not pair again. Ask the office to check the unit assignment first.</w:t>
+            </w:r>
+          </w:p>
+        </w:tc>
+      </w:tr>
+    </w:tbl>
+    <w:p>
+      <w:pPr>
+        <w:spacing w:after="100"/>
+      </w:pPr>
+    </w:p>
+    <w:tbl>
+      <w:tblPr>
+        <w:tblStyle w:val="9"/>
+        <w:tblW w:w="9746" w:type="dxa"/>
+        <w:tblInd w:w="0" w:type="dxa"/>
+        <w:tblBorders>
+          <w:top w:val="single" w:color="auto" w:sz="4" w:space="0"/>
+          <w:left w:val="single" w:color="auto" w:sz="4" w:space="0"/>
+          <w:bottom w:val="single" w:color="auto" w:sz="4" w:space="0"/>
+          <w:right w:val="single" w:color="auto" w:sz="4" w:space="0"/>
+          <w:insideH w:val="single" w:color="auto" w:sz="4" w:space="0"/>
+          <w:insideV w:val="single" w:color="auto" w:sz="4" w:space="0"/>
+        </w:tblBorders>
+        <w:tblLayout w:type="autofit"/>
+        <w:tblCellMar>
+          <w:top w:w="0" w:type="dxa"/>
+          <w:left w:w="10" w:type="dxa"/>
+          <w:bottom w:w="0" w:type="dxa"/>
+          <w:right w:w="10" w:type="dxa"/>
+        </w:tblCellMar>
+      </w:tblPr>
+      <w:tblGrid>
+        <w:gridCol w:w="9746"/>
+      </w:tblGrid>
+      <w:tr>
+        <w:tc>
+          <w:tcPr>
+            <w:tcW w:w="9746" w:type="dxa"/>
+            <w:tcBorders>
+              <w:top w:val="single" w:color="B7C9C0" w:sz="4" w:space="0"/>
+              <w:left w:val="single" w:color="B7C9C0" w:sz="4" w:space="0"/>
+              <w:bottom w:val="single" w:color="B7C9C0" w:sz="4" w:space="0"/>
+              <w:right w:val="single" w:color="B7C9C0" w:sz="4" w:space="0"/>
+            </w:tcBorders>
+            <w:shd w:val="clear" w:color="auto" w:fill="FFF2CC"/>
+            <w:tcMar>
+              <w:top w:w="100" w:type="dxa"/>
+              <w:left w:w="120" w:type="dxa"/>
+              <w:bottom w:w="100" w:type="dxa"/>
+              <w:right w:w="120" w:type="dxa"/>
+            </w:tcMar>
+          </w:tcPr>
+          <w:p>
+            <w:pPr>
+              <w:spacing w:after="0"/>
+            </w:pPr>
+            <w:r>
+              <w:t xml:space="preserve">⚠ Counts still unsent on a phone that is reset, lost, or damaged are permanently lost. Only a release performed from a working phone delivers pending work first.</w:t>
+            </w:r>
+          </w:p>
+        </w:tc>
+      </w:tr>
+    </w:tbl>
+    <w:p>
+      <w:pPr>
+        <w:spacing w:after="100"/>
+      </w:pPr>
+    </w:p>
+    <w:tbl>
+      <w:tblPr>
+        <w:tblStyle w:val="9"/>
+        <w:tblW w:w="9746" w:type="dxa"/>
+        <w:tblInd w:w="0" w:type="dxa"/>
+        <w:tblBorders>
+          <w:top w:val="single" w:color="auto" w:sz="4" w:space="0"/>
+          <w:left w:val="single" w:color="auto" w:sz="4" w:space="0"/>
+          <w:bottom w:val="single" w:color="auto" w:sz="4" w:space="0"/>
+          <w:right w:val="single" w:color="auto" w:sz="4" w:space="0"/>
+          <w:insideH w:val="single" w:color="auto" w:sz="4" w:space="0"/>
+          <w:insideV w:val="single" w:color="auto" w:sz="4" w:space="0"/>
+        </w:tblBorders>
+        <w:tblLayout w:type="autofit"/>
+        <w:tblCellMar>
+          <w:top w:w="0" w:type="dxa"/>
+          <w:left w:w="10" w:type="dxa"/>
+          <w:bottom w:w="0" w:type="dxa"/>
+          <w:right w:w="10" w:type="dxa"/>
+        </w:tblCellMar>
+      </w:tblPr>
+      <w:tblGrid>
+        <w:gridCol w:w="9746"/>
+      </w:tblGrid>
+      <w:tr>
+        <w:tc>
+          <w:tcPr>
+            <w:tcW w:w="9746" w:type="dxa"/>
+            <w:tcBorders>
+              <w:top w:val="single" w:color="B7C9C0" w:sz="4" w:space="0"/>
+              <w:left w:val="single" w:color="B7C9C0" w:sz="4" w:space="0"/>
+              <w:bottom w:val="single" w:color="B7C9C0" w:sz="4" w:space="0"/>
+              <w:right w:val="single" w:color="B7C9C0" w:sz="4" w:space="0"/>
+            </w:tcBorders>
+            <w:shd w:val="clear" w:color="auto" w:fill="FFF2CC"/>
+            <w:tcMar>
+              <w:top w:w="100" w:type="dxa"/>
+              <w:left w:w="120" w:type="dxa"/>
+              <w:bottom w:w="100" w:type="dxa"/>
+              <w:right w:w="120" w:type="dxa"/>
+            </w:tcMar>
+          </w:tcPr>
+          <w:p>
+            <w:pPr>
+              <w:spacing w:after="0"/>
+            </w:pPr>
+            <w:r>
+              <w:t xml:space="preserve">⚠ Do not force-release a unit while the old phone may still be working and holding unsent counts. That phone will stop delivering, and the work it holds is stranded.</w:t>
             </w:r>
           </w:p>
         </w:tc>
@@ -6327,7 +8030,12 @@
         <w:spacing w:after="50"/>
       </w:pPr>
       <w:r>
-        <w:t>Coordinates are converted to IPS DDMM.MMMM / DDDMM.MMMM format.</w:t>
+        <w:t>Coordinates are converted to IPS DDMM.MM</w:t>
+      </w:r>
+      <w:bookmarkStart w:id="24" w:name="_GoBack"/>
+      <w:bookmarkEnd w:id="24"/>
+      <w:r>
+        <w:t>MM / DDDMM.MMMM format.</w:t>
       </w:r>
     </w:p>
     <w:p>
@@ -8441,12 +10149,6 @@
             <w:insideH w:val="single" w:color="auto" w:sz="4" w:space="0"/>
             <w:insideV w:val="single" w:color="auto" w:sz="4" w:space="0"/>
           </w:tblBorders>
-          <w:tblCellMar>
-            <w:top w:w="0" w:type="dxa"/>
-            <w:left w:w="10" w:type="dxa"/>
-            <w:bottom w:w="0" w:type="dxa"/>
-            <w:right w:w="10" w:type="dxa"/>
-          </w:tblCellMar>
         </w:tblPrEx>
         <w:trPr>
           <w:tblHeader/>
@@ -8974,12 +10676,6 @@
             <w:insideH w:val="single" w:color="auto" w:sz="4" w:space="0"/>
             <w:insideV w:val="single" w:color="auto" w:sz="4" w:space="0"/>
           </w:tblBorders>
-          <w:tblCellMar>
-            <w:top w:w="0" w:type="dxa"/>
-            <w:left w:w="10" w:type="dxa"/>
-            <w:bottom w:w="0" w:type="dxa"/>
-            <w:right w:w="10" w:type="dxa"/>
-          </w:tblCellMar>
         </w:tblPrEx>
         <w:trPr>
           <w:tblHeader/>
@@ -10447,6 +12143,12 @@
             <w:insideH w:val="single" w:color="auto" w:sz="4" w:space="0"/>
             <w:insideV w:val="single" w:color="auto" w:sz="4" w:space="0"/>
           </w:tblBorders>
+          <w:tblCellMar>
+            <w:top w:w="0" w:type="dxa"/>
+            <w:left w:w="10" w:type="dxa"/>
+            <w:bottom w:w="0" w:type="dxa"/>
+            <w:right w:w="10" w:type="dxa"/>
+          </w:tblCellMar>
         </w:tblPrEx>
         <w:trPr>
           <w:tblHeader/>
@@ -11003,12 +12705,6 @@
             <w:insideH w:val="single" w:color="auto" w:sz="4" w:space="0"/>
             <w:insideV w:val="single" w:color="auto" w:sz="4" w:space="0"/>
           </w:tblBorders>
-          <w:tblCellMar>
-            <w:top w:w="0" w:type="dxa"/>
-            <w:left w:w="10" w:type="dxa"/>
-            <w:bottom w:w="0" w:type="dxa"/>
-            <w:right w:w="10" w:type="dxa"/>
-          </w:tblCellMar>
         </w:tblPrEx>
         <w:trPr>
           <w:tblHeader/>
@@ -13711,12 +15407,6 @@
             <w:insideH w:val="single" w:color="auto" w:sz="4" w:space="0"/>
             <w:insideV w:val="single" w:color="auto" w:sz="4" w:space="0"/>
           </w:tblBorders>
-          <w:tblCellMar>
-            <w:top w:w="0" w:type="dxa"/>
-            <w:left w:w="10" w:type="dxa"/>
-            <w:bottom w:w="0" w:type="dxa"/>
-            <w:right w:w="10" w:type="dxa"/>
-          </w:tblCellMar>
         </w:tblPrEx>
         <w:trPr>
           <w:tblHeader/>
@@ -16003,12 +17693,6 @@
             <w:insideH w:val="single" w:color="auto" w:sz="4" w:space="0"/>
             <w:insideV w:val="single" w:color="auto" w:sz="4" w:space="0"/>
           </w:tblBorders>
-          <w:tblCellMar>
-            <w:top w:w="0" w:type="dxa"/>
-            <w:left w:w="10" w:type="dxa"/>
-            <w:bottom w:w="0" w:type="dxa"/>
-            <w:right w:w="10" w:type="dxa"/>
-          </w:tblCellMar>
         </w:tblPrEx>
         <w:tc>
           <w:tcPr>
@@ -16136,6 +17820,13 @@
         <w:szCs w:val="18"/>
       </w:rPr>
       <w:tab/>
+    </w:r>
+    <w:r>
+      <w:rPr>
+        <w:color w:val="666666"/>
+        <w:sz w:val="18"/>
+        <w:szCs w:val="18"/>
+      </w:rPr>
       <w:t>Production Reference and User Guide</w:t>
     </w:r>
   </w:p>

</xml_diff>

<commit_message>
docs(reference): bring the docx cover up to date and mark it released
The cover page still advertised App 1.1 (2) - a version on no handset - and the
metadata block read Draft, 10 August, App version 1.2.

Cover now reads 26 August 2026 | realme C85 | App 1.2 (3); Status is Released;
App version records both the production and trial builds, matching the markdown.

Patched in place. Section 4.3, the TOC, and all five embedded screenshots are
unchanged; only word/document.xml differs.
</commit_message>
<xml_diff>
--- a/docs/HAMS_PRODUCTION_REFERENCE.docx
+++ b/docs/HAMS_PRODUCTION_REFERENCE.docx
@@ -72,7 +72,7 @@
           <w:sz w:val="20"/>
           <w:szCs w:val="20"/>
         </w:rPr>
-        <w:t>10 August 2026 | realme C85 | App 1.1 (2)</w:t>
+        <w:t>26 August 2026 | realme C85 | App 1.2 (3)</w:t>
       </w:r>
     </w:p>
     <w:p>
@@ -1558,7 +1558,7 @@
                 <w:sz w:val="19"/>
                 <w:szCs w:val="19"/>
               </w:rPr>
-              <w:t>10 August 2026</w:t>
+              <w:t>26 August 2026</w:t>
             </w:r>
           </w:p>
         </w:tc>
@@ -1730,7 +1730,7 @@
                 <w:sz w:val="19"/>
                 <w:szCs w:val="19"/>
               </w:rPr>
-              <w:t>Draft</w:t>
+              <w:t>Released</w:t>
             </w:r>
           </w:p>
         </w:tc>
@@ -1893,32 +1893,16 @@
           <w:p>
             <w:pPr>
               <w:spacing w:after="0"/>
-              <w:rPr>
-                <w:rFonts w:hint="default"/>
-                <w:lang w:val="en-US"/>
-              </w:rPr>
-            </w:pPr>
-            <w:r>
-              <w:rPr>
-                <w:b w:val="0"/>
-                <w:bCs w:val="0"/>
-                <w:color w:val="202020"/>
-                <w:sz w:val="19"/>
-                <w:szCs w:val="19"/>
-              </w:rPr>
-              <w:t>1.</w:t>
-            </w:r>
-            <w:r>
-              <w:rPr>
-                <w:rFonts w:hint="default"/>
-                <w:b w:val="0"/>
-                <w:bCs w:val="0"/>
-                <w:color w:val="202020"/>
-                <w:sz w:val="19"/>
-                <w:szCs w:val="19"/>
-                <w:lang w:val="en-US"/>
-              </w:rPr>
-              <w:t>2</w:t>
+            </w:pPr>
+            <w:r>
+              <w:rPr>
+                <w:b w:val="0"/>
+                <w:bCs w:val="0"/>
+                <w:color w:val="202020"/>
+                <w:sz w:val="19"/>
+                <w:szCs w:val="19"/>
+              </w:rPr>
+              <w:t xml:space="preserve">1.2 (3) in production; 1.3 (5) under trial</w:t>
             </w:r>
           </w:p>
         </w:tc>

</xml_diff>

<commit_message>
docs(reference): correct the n8n workflow roles in the docx
Section 5.3 still described Device OTP as issuing an office OTP only. That
workflow has seeded the requested unit before issuing the code since 20 August
2026, so the docx described behaviour that had been replaced. Seed also gains
the detail that it is bulk and manually triggered.

All seven role rows now match the markdown. Patched in place; images and every
other package part unchanged.
</commit_message>
<xml_diff>
--- a/docs/HAMS_PRODUCTION_REFERENCE.docx
+++ b/docs/HAMS_PRODUCTION_REFERENCE.docx
@@ -8584,7 +8584,7 @@
                 <w:sz w:val="19"/>
                 <w:szCs w:val="19"/>
               </w:rPr>
-              <w:t>Create/refresh unit registry records.</w:t>
+              <w:t>Create/refresh unit registry records in bulk. Manual trigger.</w:t>
             </w:r>
           </w:p>
         </w:tc>
@@ -8670,7 +8670,7 @@
                 <w:sz w:val="19"/>
                 <w:szCs w:val="19"/>
               </w:rPr>
-              <w:t>Issue office OTP.</w:t>
+              <w:t>Seed the requested unit if the registry has never seen it, then issue and email an office OTP.</w:t>
             </w:r>
           </w:p>
         </w:tc>

</xml_diff>

<commit_message>
docs(reference): use the company n8n workflow names in 5.3
The table listed friendly labels (Seed, Device OTP, Manual Claim) that do not
exist in n8n, so nobody could find the workflow being described. It now carries
the actual names, and the column header says so.

Every name was cross-checked against the name field inside the corresponding
sanitized export: seven listed, seven exports, no orphans either way. Applied to
the docx and the markdown together; docx patched in place, images and all other
package parts unchanged.
</commit_message>
<xml_diff>
--- a/docs/HAMS_PRODUCTION_REFERENCE.docx
+++ b/docs/HAMS_PRODUCTION_REFERENCE.docx
@@ -8464,7 +8464,7 @@
                 <w:sz w:val="19"/>
                 <w:szCs w:val="19"/>
               </w:rPr>
-              <w:t>n8n workflow</w:t>
+              <w:t>n8n workflow (name in n8n)</w:t>
             </w:r>
           </w:p>
         </w:tc>
@@ -8550,7 +8550,7 @@
                 <w:sz w:val="19"/>
                 <w:szCs w:val="19"/>
               </w:rPr>
-              <w:t>Seed</w:t>
+              <w:t>G_PM_IT_IOT_HAMS_SEED</w:t>
             </w:r>
           </w:p>
         </w:tc>
@@ -8636,7 +8636,7 @@
                 <w:sz w:val="19"/>
                 <w:szCs w:val="19"/>
               </w:rPr>
-              <w:t>Device OTP</w:t>
+              <w:t>G_PM_IT_IOT_HAMS_DEVICEOTP</w:t>
             </w:r>
           </w:p>
         </w:tc>
@@ -8722,7 +8722,7 @@
                 <w:sz w:val="19"/>
                 <w:szCs w:val="19"/>
               </w:rPr>
-              <w:t>Manual Claim</w:t>
+              <w:t>G_PM_IT_IOT_HAMS_MANUALCLAIM</w:t>
             </w:r>
           </w:p>
         </w:tc>
@@ -8808,7 +8808,7 @@
                 <w:sz w:val="19"/>
                 <w:szCs w:val="19"/>
               </w:rPr>
-              <w:t>Verify</w:t>
+              <w:t>G_PM_IT_IOT_HAMS_VERIFY</w:t>
             </w:r>
           </w:p>
         </w:tc>
@@ -8894,7 +8894,7 @@
                 <w:sz w:val="19"/>
                 <w:szCs w:val="19"/>
               </w:rPr>
-              <w:t>Release</w:t>
+              <w:t>G_PM_IT_IOT_HAMS_RELEASE</w:t>
             </w:r>
           </w:p>
         </w:tc>
@@ -8980,7 +8980,7 @@
                 <w:sz w:val="19"/>
                 <w:szCs w:val="19"/>
               </w:rPr>
-              <w:t>Admin Release</w:t>
+              <w:t>G_PM_IT_IOT_HAMS_ADMINRELEASE</w:t>
             </w:r>
           </w:p>
         </w:tc>
@@ -9066,7 +9066,7 @@
                 <w:sz w:val="19"/>
                 <w:szCs w:val="19"/>
               </w:rPr>
-              <w:t>List Units</w:t>
+              <w:t>G_PM_IT_IOT_HAMS_LISTUNITS</w:t>
             </w:r>
           </w:p>
         </w:tc>

</xml_diff>

<commit_message>
docs: close the remaining audit findings
- Event dictionary: fix the split word in the local-only marker table header.
- Testing record: 1.2 has now run on a handset (HONOR ALI-NX1, 21 August). The
  record states both limits on that evidence - not the approved realme, and the
  installed APK was never hashed, so which 1.2 build it received is unconfirmed.
- Docs index: list the docx and releases/, neither of which a reader following
  the index could previously find.
- D.3: add routine parameters. admin_release taking only a unit id is the whole
  reason it can recover a phone that can no longer prove ownership.
- FR-17/FR-18: press-outcome feedback and the 1.3 rate limit had no requirement.
- NFR-02: restate against the 1.2 mechanism - controls stay pressable and the
  refusal is announced, rather than the buttons being disabled.
- NFR-12: the build name is now readable off the count screen.

D.3 applied to the docx as well; images and all other package parts unchanged.
</commit_message>
<xml_diff>
--- a/docs/HAMS_PRODUCTION_REFERENCE.docx
+++ b/docs/HAMS_PRODUCTION_REFERENCE.docx
@@ -86,17 +86,7 @@
           <w:sz w:val="18"/>
           <w:szCs w:val="18"/>
         </w:rPr>
-        <w:t>© 2026 Kuala Lump</w:t>
-      </w:r>
-      <w:bookmarkStart w:id="50" w:name="_GoBack"/>
-      <w:bookmarkEnd w:id="50"/>
-      <w:r>
-        <w:rPr>
-          <w:color w:val="666666"/>
-          <w:sz w:val="18"/>
-          <w:szCs w:val="18"/>
-        </w:rPr>
-        <w:t>ur Kepong Berhad. All rights reserved.</w:t>
+        <w:t>© 2026 Kuala Lumpur Kepong Berhad. All rights reserved.</w:t>
       </w:r>
     </w:p>
     <w:p>
@@ -1902,7 +1892,7 @@
                 <w:sz w:val="19"/>
                 <w:szCs w:val="19"/>
               </w:rPr>
-              <w:t xml:space="preserve">1.2 (3) in production; 1.3 (5) under trial</w:t>
+              <w:t>1.2 (3) in production; 1.3 (5) under trial</w:t>
             </w:r>
           </w:p>
         </w:tc>
@@ -2496,8 +2486,8 @@
         <w:pStyle w:val="2"/>
         <w:pageBreakBefore/>
       </w:pPr>
-      <w:bookmarkStart w:id="2" w:name="_Toc5645"/>
-      <w:bookmarkStart w:id="3" w:name="_Toc15700"/>
+      <w:bookmarkStart w:id="2" w:name="_Toc15700"/>
+      <w:bookmarkStart w:id="3" w:name="_Toc5645"/>
       <w:r>
         <w:t>2. Device and application baseline</w:t>
       </w:r>
@@ -3298,8 +3288,8 @@
         </w:tblCellMar>
       </w:tblPr>
       <w:tblGrid>
-        <w:gridCol w:w="4873"/>
-        <w:gridCol w:w="4873"/>
+        <w:gridCol w:w="2432"/>
+        <w:gridCol w:w="7314"/>
       </w:tblGrid>
       <w:tr>
         <w:tblPrEx>
@@ -3311,13 +3301,19 @@
             <w:insideH w:val="single" w:color="auto" w:sz="4" w:space="0"/>
             <w:insideV w:val="single" w:color="auto" w:sz="4" w:space="0"/>
           </w:tblBorders>
+          <w:tblCellMar>
+            <w:top w:w="0" w:type="dxa"/>
+            <w:left w:w="10" w:type="dxa"/>
+            <w:bottom w:w="0" w:type="dxa"/>
+            <w:right w:w="10" w:type="dxa"/>
+          </w:tblCellMar>
         </w:tblPrEx>
         <w:trPr>
           <w:tblHeader/>
         </w:trPr>
         <w:tc>
           <w:tcPr>
-            <w:tcW w:w="4873" w:type="dxa"/>
+            <w:tcW w:w="2432" w:type="dxa"/>
             <w:tcBorders>
               <w:top w:val="single" w:color="B7C9C0" w:sz="4" w:space="0"/>
               <w:left w:val="single" w:color="B7C9C0" w:sz="4" w:space="0"/>
@@ -3351,7 +3347,7 @@
         </w:tc>
         <w:tc>
           <w:tcPr>
-            <w:tcW w:w="4873" w:type="dxa"/>
+            <w:tcW w:w="7314" w:type="dxa"/>
             <w:tcBorders>
               <w:top w:val="single" w:color="B7C9C0" w:sz="4" w:space="0"/>
               <w:left w:val="single" w:color="B7C9C0" w:sz="4" w:space="0"/>
@@ -3403,7 +3399,7 @@
         </w:tblPrEx>
         <w:tc>
           <w:tcPr>
-            <w:tcW w:w="4873" w:type="dxa"/>
+            <w:tcW w:w="2432" w:type="dxa"/>
             <w:tcBorders>
               <w:top w:val="single" w:color="B7C9C0" w:sz="4" w:space="0"/>
               <w:left w:val="single" w:color="B7C9C0" w:sz="4" w:space="0"/>
@@ -3437,7 +3433,7 @@
         </w:tc>
         <w:tc>
           <w:tcPr>
-            <w:tcW w:w="4873" w:type="dxa"/>
+            <w:tcW w:w="7314" w:type="dxa"/>
             <w:tcBorders>
               <w:top w:val="single" w:color="B7C9C0" w:sz="4" w:space="0"/>
               <w:left w:val="single" w:color="B7C9C0" w:sz="4" w:space="0"/>
@@ -3489,7 +3485,7 @@
         </w:tblPrEx>
         <w:tc>
           <w:tcPr>
-            <w:tcW w:w="4873" w:type="dxa"/>
+            <w:tcW w:w="2432" w:type="dxa"/>
             <w:tcBorders>
               <w:top w:val="single" w:color="B7C9C0" w:sz="4" w:space="0"/>
               <w:left w:val="single" w:color="B7C9C0" w:sz="4" w:space="0"/>
@@ -3523,7 +3519,7 @@
         </w:tc>
         <w:tc>
           <w:tcPr>
-            <w:tcW w:w="4873" w:type="dxa"/>
+            <w:tcW w:w="7314" w:type="dxa"/>
             <w:tcBorders>
               <w:top w:val="single" w:color="B7C9C0" w:sz="4" w:space="0"/>
               <w:left w:val="single" w:color="B7C9C0" w:sz="4" w:space="0"/>
@@ -3575,7 +3571,7 @@
         </w:tblPrEx>
         <w:tc>
           <w:tcPr>
-            <w:tcW w:w="4873" w:type="dxa"/>
+            <w:tcW w:w="2432" w:type="dxa"/>
             <w:tcBorders>
               <w:top w:val="single" w:color="B7C9C0" w:sz="4" w:space="0"/>
               <w:left w:val="single" w:color="B7C9C0" w:sz="4" w:space="0"/>
@@ -3609,7 +3605,7 @@
         </w:tc>
         <w:tc>
           <w:tcPr>
-            <w:tcW w:w="4873" w:type="dxa"/>
+            <w:tcW w:w="7314" w:type="dxa"/>
             <w:tcBorders>
               <w:top w:val="single" w:color="B7C9C0" w:sz="4" w:space="0"/>
               <w:left w:val="single" w:color="B7C9C0" w:sz="4" w:space="0"/>
@@ -3661,7 +3657,7 @@
         </w:tblPrEx>
         <w:tc>
           <w:tcPr>
-            <w:tcW w:w="4873" w:type="dxa"/>
+            <w:tcW w:w="2432" w:type="dxa"/>
             <w:tcBorders>
               <w:top w:val="single" w:color="B7C9C0" w:sz="4" w:space="0"/>
               <w:left w:val="single" w:color="B7C9C0" w:sz="4" w:space="0"/>
@@ -3695,7 +3691,7 @@
         </w:tc>
         <w:tc>
           <w:tcPr>
-            <w:tcW w:w="4873" w:type="dxa"/>
+            <w:tcW w:w="7314" w:type="dxa"/>
             <w:tcBorders>
               <w:top w:val="single" w:color="B7C9C0" w:sz="4" w:space="0"/>
               <w:left w:val="single" w:color="B7C9C0" w:sz="4" w:space="0"/>
@@ -3747,7 +3743,7 @@
         </w:tblPrEx>
         <w:tc>
           <w:tcPr>
-            <w:tcW w:w="4873" w:type="dxa"/>
+            <w:tcW w:w="2432" w:type="dxa"/>
             <w:tcBorders>
               <w:top w:val="single" w:color="B7C9C0" w:sz="4" w:space="0"/>
               <w:left w:val="single" w:color="B7C9C0" w:sz="4" w:space="0"/>
@@ -3781,7 +3777,7 @@
         </w:tc>
         <w:tc>
           <w:tcPr>
-            <w:tcW w:w="4873" w:type="dxa"/>
+            <w:tcW w:w="7314" w:type="dxa"/>
             <w:tcBorders>
               <w:top w:val="single" w:color="B7C9C0" w:sz="4" w:space="0"/>
               <w:left w:val="single" w:color="B7C9C0" w:sz="4" w:space="0"/>
@@ -4117,6 +4113,7 @@
           <w:numId w:val="1"/>
         </w:numPr>
         <w:spacing w:after="50"/>
+        <w:ind w:left="260" w:leftChars="0" w:firstLineChars="0"/>
       </w:pPr>
       <w:r>
         <w:t>Open HAMS and confirm that the device is paired.</w:t>
@@ -4130,6 +4127,7 @@
           <w:numId w:val="1"/>
         </w:numPr>
         <w:spacing w:after="50"/>
+        <w:ind w:left="260" w:leftChars="0" w:firstLineChars="0"/>
       </w:pPr>
       <w:r>
         <w:t>Confirm GPS is ready before counting.</w:t>
@@ -4143,6 +4141,7 @@
           <w:numId w:val="1"/>
         </w:numPr>
         <w:spacing w:after="50"/>
+        <w:ind w:left="260" w:leftChars="0" w:firstLineChars="0"/>
       </w:pPr>
       <w:r>
         <w:t>Press + for each count and confirm the displayed net count.</w:t>
@@ -4156,6 +4155,7 @@
           <w:numId w:val="1"/>
         </w:numPr>
         <w:spacing w:after="50"/>
+        <w:ind w:left="260" w:leftChars="0" w:firstLineChars="0"/>
       </w:pPr>
       <w:r>
         <w:t>Use − only for a genuine correction.</w:t>
@@ -4169,6 +4169,7 @@
           <w:numId w:val="1"/>
         </w:numPr>
         <w:spacing w:after="50"/>
+        <w:ind w:left="260" w:leftChars="0" w:firstLineChars="0"/>
       </w:pPr>
       <w:r>
         <w:t>Use New Task only after completing the prior task.</w:t>
@@ -4182,10 +4183,21 @@
           <w:numId w:val="1"/>
         </w:numPr>
         <w:spacing w:after="50"/>
+        <w:ind w:left="260" w:leftChars="0" w:firstLineChars="0"/>
       </w:pPr>
       <w:r>
         <w:t>Use normal app controls to check delivery; do not uninstall the app to resolve a push issue.</w:t>
       </w:r>
+    </w:p>
+    <w:p>
+      <w:pPr>
+        <w:pStyle w:val="18"/>
+        <w:numPr>
+          <w:numId w:val="0"/>
+        </w:numPr>
+        <w:spacing w:after="50"/>
+        <w:ind w:left="260" w:leftChars="0"/>
+      </w:pPr>
     </w:p>
     <w:tbl>
       <w:tblPr>
@@ -5842,6 +5854,7 @@
           <w:numId w:val="2"/>
         </w:numPr>
         <w:spacing w:after="50"/>
+        <w:ind w:left="260" w:leftChars="0" w:firstLineChars="0"/>
       </w:pPr>
       <w:r>
         <w:t>Release through the protected administrator control using a valid OTP.</w:t>
@@ -5855,6 +5868,7 @@
           <w:numId w:val="2"/>
         </w:numPr>
         <w:spacing w:after="50"/>
+        <w:ind w:left="260" w:leftChars="0" w:firstLineChars="0"/>
       </w:pPr>
       <w:r>
         <w:t>The app verifies that it still owns the unit.</w:t>
@@ -5868,6 +5882,7 @@
           <w:numId w:val="2"/>
         </w:numPr>
         <w:spacing w:after="50"/>
+        <w:ind w:left="260" w:leftChars="0" w:firstLineChars="0"/>
       </w:pPr>
       <w:r>
         <w:t>It attempts bounded delivery while it remains bound.</w:t>
@@ -5881,6 +5896,7 @@
           <w:numId w:val="2"/>
         </w:numPr>
         <w:spacing w:after="50"/>
+        <w:ind w:left="260" w:leftChars="0" w:firstLineChars="0"/>
       </w:pPr>
       <w:r>
         <w:t>It releases the unit through the configured backend.</w:t>
@@ -5894,6 +5910,7 @@
           <w:numId w:val="2"/>
         </w:numPr>
         <w:spacing w:after="50"/>
+        <w:ind w:left="260" w:leftChars="0" w:firstLineChars="0"/>
       </w:pPr>
       <w:r>
         <w:t>Any remaining queued task rows are marked stranded (pushed = 2) and cannot upload under a later unit.</w:t>
@@ -6012,7 +6029,7 @@
           <w:numId w:val="3"/>
         </w:numPr>
         <w:spacing w:after="50"/>
-        <w:ind w:left="520" w:leftChars="0" w:hanging="260" w:firstLineChars="0"/>
+        <w:ind w:left="260" w:leftChars="0" w:hanging="260" w:firstLineChars="0"/>
       </w:pPr>
       <w:r>
         <w:t>Take the unit ID from the office register. Do not guess it or type it from memory. The convention is OC&lt;NUM&gt;_H_&lt;SERIAL_NUMBER&gt;; a wrong ID either fails outright or binds the phone to the wrong unit.</w:t>
@@ -6025,7 +6042,7 @@
           <w:numId w:val="3"/>
         </w:numPr>
         <w:spacing w:after="50"/>
-        <w:ind w:left="520" w:leftChars="0" w:hanging="260" w:firstLineChars="0"/>
+        <w:ind w:left="260" w:leftChars="0" w:hanging="260" w:firstLineChars="0"/>
       </w:pPr>
       <w:r>
         <w:t>Confirm the phone has a working network connection. Pairing needs one. GPS is not required until counting starts.</w:t>
@@ -6038,7 +6055,7 @@
           <w:numId w:val="3"/>
         </w:numPr>
         <w:spacing w:after="50"/>
-        <w:ind w:left="520" w:leftChars="0" w:hanging="260" w:firstLineChars="0"/>
+        <w:ind w:left="260" w:leftChars="0" w:hanging="260" w:firstLineChars="0"/>
       </w:pPr>
       <w:r>
         <w:t>Pair one phone to one unit at a time, and record the pairing in the operational register.</w:t>
@@ -7070,7 +7087,15 @@
           <w:numId w:val="2"/>
         </w:numPr>
         <w:spacing w:after="50"/>
+        <w:ind w:left="260" w:leftChars="0" w:firstLineChars="0"/>
       </w:pPr>
+      <w:r>
+        <w:rPr>
+          <w:rFonts w:hint="default"/>
+          <w:lang w:val="en-US"/>
+        </w:rPr>
+        <w:t xml:space="preserve">    </w:t>
+      </w:r>
       <w:r>
         <w:t>Deliver pending counts first, and confirm the push completed.</w:t>
       </w:r>
@@ -7082,6 +7107,7 @@
           <w:numId w:val="2"/>
         </w:numPr>
         <w:spacing w:after="50"/>
+        <w:ind w:left="260" w:leftChars="0" w:firstLineChars="0"/>
       </w:pPr>
       <w:r>
         <w:t>Only then use the protected administrator release control with a valid supervisor code.</w:t>
@@ -7094,6 +7120,7 @@
           <w:numId w:val="2"/>
         </w:numPr>
         <w:spacing w:after="50"/>
+        <w:ind w:left="260" w:leftChars="0" w:firstLineChars="0"/>
       </w:pPr>
       <w:r>
         <w:t>Never uninstall the app to fix a delivery problem. Uninstalling destroys counts that have not been sent, and skips the safe release sequence entirely.</w:t>
@@ -7146,8 +7173,8 @@
         </w:tblCellMar>
       </w:tblPr>
       <w:tblGrid>
-        <w:gridCol w:w="2900"/>
-        <w:gridCol w:w="3200"/>
+        <w:gridCol w:w="3023"/>
+        <w:gridCol w:w="3077"/>
         <w:gridCol w:w="3646"/>
       </w:tblGrid>
       <w:tr>
@@ -7172,7 +7199,7 @@
         </w:trPr>
         <w:tc>
           <w:tcPr>
-            <w:tcW w:w="2900" w:type="dxa"/>
+            <w:tcW w:w="3023" w:type="dxa"/>
             <w:tcBorders>
               <w:top w:val="single" w:color="B7C9C0" w:sz="4" w:space="0"/>
               <w:left w:val="single" w:color="B7C9C0" w:sz="4" w:space="0"/>
@@ -7206,7 +7233,7 @@
         </w:tc>
         <w:tc>
           <w:tcPr>
-            <w:tcW w:w="3200" w:type="dxa"/>
+            <w:tcW w:w="3077" w:type="dxa"/>
             <w:tcBorders>
               <w:top w:val="single" w:color="B7C9C0" w:sz="4" w:space="0"/>
               <w:left w:val="single" w:color="B7C9C0" w:sz="4" w:space="0"/>
@@ -7292,7 +7319,7 @@
         </w:tblPrEx>
         <w:tc>
           <w:tcPr>
-            <w:tcW w:w="2900" w:type="dxa"/>
+            <w:tcW w:w="3023" w:type="dxa"/>
             <w:tcBorders>
               <w:top w:val="single" w:color="B7C9C0" w:sz="4" w:space="0"/>
               <w:left w:val="single" w:color="B7C9C0" w:sz="4" w:space="0"/>
@@ -7326,7 +7353,7 @@
         </w:tc>
         <w:tc>
           <w:tcPr>
-            <w:tcW w:w="3200" w:type="dxa"/>
+            <w:tcW w:w="3077" w:type="dxa"/>
             <w:tcBorders>
               <w:top w:val="single" w:color="B7C9C0" w:sz="4" w:space="0"/>
               <w:left w:val="single" w:color="B7C9C0" w:sz="4" w:space="0"/>
@@ -7412,7 +7439,7 @@
         </w:tblPrEx>
         <w:tc>
           <w:tcPr>
-            <w:tcW w:w="2900" w:type="dxa"/>
+            <w:tcW w:w="3023" w:type="dxa"/>
             <w:tcBorders>
               <w:top w:val="single" w:color="B7C9C0" w:sz="4" w:space="0"/>
               <w:left w:val="single" w:color="B7C9C0" w:sz="4" w:space="0"/>
@@ -7446,7 +7473,7 @@
         </w:tc>
         <w:tc>
           <w:tcPr>
-            <w:tcW w:w="3200" w:type="dxa"/>
+            <w:tcW w:w="3077" w:type="dxa"/>
             <w:tcBorders>
               <w:top w:val="single" w:color="B7C9C0" w:sz="4" w:space="0"/>
               <w:left w:val="single" w:color="B7C9C0" w:sz="4" w:space="0"/>
@@ -7532,7 +7559,7 @@
         </w:tblPrEx>
         <w:tc>
           <w:tcPr>
-            <w:tcW w:w="2900" w:type="dxa"/>
+            <w:tcW w:w="3023" w:type="dxa"/>
             <w:tcBorders>
               <w:top w:val="single" w:color="B7C9C0" w:sz="4" w:space="0"/>
               <w:left w:val="single" w:color="B7C9C0" w:sz="4" w:space="0"/>
@@ -7566,7 +7593,7 @@
         </w:tc>
         <w:tc>
           <w:tcPr>
-            <w:tcW w:w="3200" w:type="dxa"/>
+            <w:tcW w:w="3077" w:type="dxa"/>
             <w:tcBorders>
               <w:top w:val="single" w:color="B7C9C0" w:sz="4" w:space="0"/>
               <w:left w:val="single" w:color="B7C9C0" w:sz="4" w:space="0"/>
@@ -7652,7 +7679,7 @@
         </w:tblPrEx>
         <w:tc>
           <w:tcPr>
-            <w:tcW w:w="2900" w:type="dxa"/>
+            <w:tcW w:w="3023" w:type="dxa"/>
             <w:tcBorders>
               <w:top w:val="single" w:color="B7C9C0" w:sz="4" w:space="0"/>
               <w:left w:val="single" w:color="B7C9C0" w:sz="4" w:space="0"/>
@@ -7686,7 +7713,7 @@
         </w:tc>
         <w:tc>
           <w:tcPr>
-            <w:tcW w:w="3200" w:type="dxa"/>
+            <w:tcW w:w="3077" w:type="dxa"/>
             <w:tcBorders>
               <w:top w:val="single" w:color="B7C9C0" w:sz="4" w:space="0"/>
               <w:left w:val="single" w:color="B7C9C0" w:sz="4" w:space="0"/>
@@ -7919,8 +7946,8 @@
       <w:pPr>
         <w:pStyle w:val="3"/>
       </w:pPr>
-      <w:bookmarkStart w:id="20" w:name="_Toc4426"/>
-      <w:bookmarkStart w:id="21" w:name="_Toc15271"/>
+      <w:bookmarkStart w:id="20" w:name="_Toc15271"/>
+      <w:bookmarkStart w:id="21" w:name="_Toc4426"/>
       <w:r>
         <w:t>5.1 Local mobile database</w:t>
       </w:r>
@@ -8373,8 +8400,13 @@
       <w:pPr>
         <w:pStyle w:val="3"/>
       </w:pPr>
-      <w:bookmarkStart w:id="24" w:name="_Toc13778"/>
-      <w:bookmarkStart w:id="25" w:name="_Toc20072"/>
+      <w:bookmarkStart w:id="24" w:name="_Toc20072"/>
+      <w:bookmarkStart w:id="25" w:name="_Toc13778"/>
+    </w:p>
+    <w:p>
+      <w:pPr>
+        <w:pStyle w:val="3"/>
+      </w:pPr>
       <w:r>
         <w:t>5.3 n8n and PostgreSQL backend</w:t>
       </w:r>
@@ -8411,8 +8443,8 @@
         </w:tblCellMar>
       </w:tblPr>
       <w:tblGrid>
-        <w:gridCol w:w="4873"/>
-        <w:gridCol w:w="4873"/>
+        <w:gridCol w:w="3975"/>
+        <w:gridCol w:w="5771"/>
       </w:tblGrid>
       <w:tr>
         <w:tblPrEx>
@@ -8436,7 +8468,7 @@
         </w:trPr>
         <w:tc>
           <w:tcPr>
-            <w:tcW w:w="4873" w:type="dxa"/>
+            <w:tcW w:w="3975" w:type="dxa"/>
             <w:tcBorders>
               <w:top w:val="single" w:color="B7C9C0" w:sz="4" w:space="0"/>
               <w:left w:val="single" w:color="B7C9C0" w:sz="4" w:space="0"/>
@@ -8470,7 +8502,7 @@
         </w:tc>
         <w:tc>
           <w:tcPr>
-            <w:tcW w:w="4873" w:type="dxa"/>
+            <w:tcW w:w="5771" w:type="dxa"/>
             <w:tcBorders>
               <w:top w:val="single" w:color="B7C9C0" w:sz="4" w:space="0"/>
               <w:left w:val="single" w:color="B7C9C0" w:sz="4" w:space="0"/>
@@ -8522,7 +8554,7 @@
         </w:tblPrEx>
         <w:tc>
           <w:tcPr>
-            <w:tcW w:w="4873" w:type="dxa"/>
+            <w:tcW w:w="3975" w:type="dxa"/>
             <w:tcBorders>
               <w:top w:val="single" w:color="B7C9C0" w:sz="4" w:space="0"/>
               <w:left w:val="single" w:color="B7C9C0" w:sz="4" w:space="0"/>
@@ -8556,7 +8588,7 @@
         </w:tc>
         <w:tc>
           <w:tcPr>
-            <w:tcW w:w="4873" w:type="dxa"/>
+            <w:tcW w:w="5771" w:type="dxa"/>
             <w:tcBorders>
               <w:top w:val="single" w:color="B7C9C0" w:sz="4" w:space="0"/>
               <w:left w:val="single" w:color="B7C9C0" w:sz="4" w:space="0"/>
@@ -8608,7 +8640,7 @@
         </w:tblPrEx>
         <w:tc>
           <w:tcPr>
-            <w:tcW w:w="4873" w:type="dxa"/>
+            <w:tcW w:w="3975" w:type="dxa"/>
             <w:tcBorders>
               <w:top w:val="single" w:color="B7C9C0" w:sz="4" w:space="0"/>
               <w:left w:val="single" w:color="B7C9C0" w:sz="4" w:space="0"/>
@@ -8642,7 +8674,7 @@
         </w:tc>
         <w:tc>
           <w:tcPr>
-            <w:tcW w:w="4873" w:type="dxa"/>
+            <w:tcW w:w="5771" w:type="dxa"/>
             <w:tcBorders>
               <w:top w:val="single" w:color="B7C9C0" w:sz="4" w:space="0"/>
               <w:left w:val="single" w:color="B7C9C0" w:sz="4" w:space="0"/>
@@ -8694,7 +8726,7 @@
         </w:tblPrEx>
         <w:tc>
           <w:tcPr>
-            <w:tcW w:w="4873" w:type="dxa"/>
+            <w:tcW w:w="3975" w:type="dxa"/>
             <w:tcBorders>
               <w:top w:val="single" w:color="B7C9C0" w:sz="4" w:space="0"/>
               <w:left w:val="single" w:color="B7C9C0" w:sz="4" w:space="0"/>
@@ -8728,7 +8760,7 @@
         </w:tc>
         <w:tc>
           <w:tcPr>
-            <w:tcW w:w="4873" w:type="dxa"/>
+            <w:tcW w:w="5771" w:type="dxa"/>
             <w:tcBorders>
               <w:top w:val="single" w:color="B7C9C0" w:sz="4" w:space="0"/>
               <w:left w:val="single" w:color="B7C9C0" w:sz="4" w:space="0"/>
@@ -8780,7 +8812,7 @@
         </w:tblPrEx>
         <w:tc>
           <w:tcPr>
-            <w:tcW w:w="4873" w:type="dxa"/>
+            <w:tcW w:w="3975" w:type="dxa"/>
             <w:tcBorders>
               <w:top w:val="single" w:color="B7C9C0" w:sz="4" w:space="0"/>
               <w:left w:val="single" w:color="B7C9C0" w:sz="4" w:space="0"/>
@@ -8814,7 +8846,7 @@
         </w:tc>
         <w:tc>
           <w:tcPr>
-            <w:tcW w:w="4873" w:type="dxa"/>
+            <w:tcW w:w="5771" w:type="dxa"/>
             <w:tcBorders>
               <w:top w:val="single" w:color="B7C9C0" w:sz="4" w:space="0"/>
               <w:left w:val="single" w:color="B7C9C0" w:sz="4" w:space="0"/>
@@ -8866,7 +8898,7 @@
         </w:tblPrEx>
         <w:tc>
           <w:tcPr>
-            <w:tcW w:w="4873" w:type="dxa"/>
+            <w:tcW w:w="3975" w:type="dxa"/>
             <w:tcBorders>
               <w:top w:val="single" w:color="B7C9C0" w:sz="4" w:space="0"/>
               <w:left w:val="single" w:color="B7C9C0" w:sz="4" w:space="0"/>
@@ -8900,7 +8932,7 @@
         </w:tc>
         <w:tc>
           <w:tcPr>
-            <w:tcW w:w="4873" w:type="dxa"/>
+            <w:tcW w:w="5771" w:type="dxa"/>
             <w:tcBorders>
               <w:top w:val="single" w:color="B7C9C0" w:sz="4" w:space="0"/>
               <w:left w:val="single" w:color="B7C9C0" w:sz="4" w:space="0"/>
@@ -8952,7 +8984,7 @@
         </w:tblPrEx>
         <w:tc>
           <w:tcPr>
-            <w:tcW w:w="4873" w:type="dxa"/>
+            <w:tcW w:w="3975" w:type="dxa"/>
             <w:tcBorders>
               <w:top w:val="single" w:color="B7C9C0" w:sz="4" w:space="0"/>
               <w:left w:val="single" w:color="B7C9C0" w:sz="4" w:space="0"/>
@@ -8986,7 +9018,7 @@
         </w:tc>
         <w:tc>
           <w:tcPr>
-            <w:tcW w:w="4873" w:type="dxa"/>
+            <w:tcW w:w="5771" w:type="dxa"/>
             <w:tcBorders>
               <w:top w:val="single" w:color="B7C9C0" w:sz="4" w:space="0"/>
               <w:left w:val="single" w:color="B7C9C0" w:sz="4" w:space="0"/>
@@ -9038,7 +9070,7 @@
         </w:tblPrEx>
         <w:tc>
           <w:tcPr>
-            <w:tcW w:w="4873" w:type="dxa"/>
+            <w:tcW w:w="3975" w:type="dxa"/>
             <w:tcBorders>
               <w:top w:val="single" w:color="B7C9C0" w:sz="4" w:space="0"/>
               <w:left w:val="single" w:color="B7C9C0" w:sz="4" w:space="0"/>
@@ -9072,7 +9104,7 @@
         </w:tc>
         <w:tc>
           <w:tcPr>
-            <w:tcW w:w="4873" w:type="dxa"/>
+            <w:tcW w:w="5771" w:type="dxa"/>
             <w:tcBorders>
               <w:top w:val="single" w:color="B7C9C0" w:sz="4" w:space="0"/>
               <w:left w:val="single" w:color="B7C9C0" w:sz="4" w:space="0"/>
@@ -9514,8 +9546,8 @@
       <w:pPr>
         <w:pStyle w:val="3"/>
       </w:pPr>
-      <w:bookmarkStart w:id="28" w:name="_Toc941"/>
-      <w:bookmarkStart w:id="29" w:name="_Toc7319"/>
+      <w:bookmarkStart w:id="28" w:name="_Toc7319"/>
+      <w:bookmarkStart w:id="29" w:name="_Toc941"/>
       <w:r>
         <w:t>6.1 Sensitive data and credentials register</w:t>
       </w:r>
@@ -9552,8 +9584,8 @@
         </w:tblCellMar>
       </w:tblPr>
       <w:tblGrid>
-        <w:gridCol w:w="4045"/>
-        <w:gridCol w:w="5701"/>
+        <w:gridCol w:w="3580"/>
+        <w:gridCol w:w="6166"/>
       </w:tblGrid>
       <w:tr>
         <w:tblPrEx>
@@ -9577,7 +9609,7 @@
         </w:trPr>
         <w:tc>
           <w:tcPr>
-            <w:tcW w:w="4045" w:type="dxa"/>
+            <w:tcW w:w="3580" w:type="dxa"/>
             <w:tcBorders>
               <w:top w:val="single" w:color="B7C9C0" w:sz="4" w:space="0"/>
               <w:left w:val="single" w:color="B7C9C0" w:sz="4" w:space="0"/>
@@ -9611,7 +9643,7 @@
         </w:tc>
         <w:tc>
           <w:tcPr>
-            <w:tcW w:w="5701" w:type="dxa"/>
+            <w:tcW w:w="6166" w:type="dxa"/>
             <w:tcBorders>
               <w:top w:val="single" w:color="B7C9C0" w:sz="4" w:space="0"/>
               <w:left w:val="single" w:color="B7C9C0" w:sz="4" w:space="0"/>
@@ -9663,7 +9695,7 @@
         </w:tblPrEx>
         <w:tc>
           <w:tcPr>
-            <w:tcW w:w="4045" w:type="dxa"/>
+            <w:tcW w:w="3580" w:type="dxa"/>
             <w:tcBorders>
               <w:top w:val="single" w:color="B7C9C0" w:sz="4" w:space="0"/>
               <w:left w:val="single" w:color="B7C9C0" w:sz="4" w:space="0"/>
@@ -9697,7 +9729,7 @@
         </w:tc>
         <w:tc>
           <w:tcPr>
-            <w:tcW w:w="5701" w:type="dxa"/>
+            <w:tcW w:w="6166" w:type="dxa"/>
             <w:tcBorders>
               <w:top w:val="single" w:color="B7C9C0" w:sz="4" w:space="0"/>
               <w:left w:val="single" w:color="B7C9C0" w:sz="4" w:space="0"/>
@@ -9749,7 +9781,7 @@
         </w:tblPrEx>
         <w:tc>
           <w:tcPr>
-            <w:tcW w:w="4045" w:type="dxa"/>
+            <w:tcW w:w="3580" w:type="dxa"/>
             <w:tcBorders>
               <w:top w:val="single" w:color="B7C9C0" w:sz="4" w:space="0"/>
               <w:left w:val="single" w:color="B7C9C0" w:sz="4" w:space="0"/>
@@ -9783,7 +9815,7 @@
         </w:tc>
         <w:tc>
           <w:tcPr>
-            <w:tcW w:w="5701" w:type="dxa"/>
+            <w:tcW w:w="6166" w:type="dxa"/>
             <w:tcBorders>
               <w:top w:val="single" w:color="B7C9C0" w:sz="4" w:space="0"/>
               <w:left w:val="single" w:color="B7C9C0" w:sz="4" w:space="0"/>
@@ -9835,7 +9867,7 @@
         </w:tblPrEx>
         <w:tc>
           <w:tcPr>
-            <w:tcW w:w="4045" w:type="dxa"/>
+            <w:tcW w:w="3580" w:type="dxa"/>
             <w:tcBorders>
               <w:top w:val="single" w:color="B7C9C0" w:sz="4" w:space="0"/>
               <w:left w:val="single" w:color="B7C9C0" w:sz="4" w:space="0"/>
@@ -9869,7 +9901,7 @@
         </w:tc>
         <w:tc>
           <w:tcPr>
-            <w:tcW w:w="5701" w:type="dxa"/>
+            <w:tcW w:w="6166" w:type="dxa"/>
             <w:tcBorders>
               <w:top w:val="single" w:color="B7C9C0" w:sz="4" w:space="0"/>
               <w:left w:val="single" w:color="B7C9C0" w:sz="4" w:space="0"/>
@@ -9921,7 +9953,7 @@
         </w:tblPrEx>
         <w:tc>
           <w:tcPr>
-            <w:tcW w:w="4045" w:type="dxa"/>
+            <w:tcW w:w="3580" w:type="dxa"/>
             <w:tcBorders>
               <w:top w:val="single" w:color="B7C9C0" w:sz="4" w:space="0"/>
               <w:left w:val="single" w:color="B7C9C0" w:sz="4" w:space="0"/>
@@ -9955,7 +9987,7 @@
         </w:tc>
         <w:tc>
           <w:tcPr>
-            <w:tcW w:w="5701" w:type="dxa"/>
+            <w:tcW w:w="6166" w:type="dxa"/>
             <w:tcBorders>
               <w:top w:val="single" w:color="B7C9C0" w:sz="4" w:space="0"/>
               <w:left w:val="single" w:color="B7C9C0" w:sz="4" w:space="0"/>
@@ -10007,7 +10039,7 @@
         </w:tblPrEx>
         <w:tc>
           <w:tcPr>
-            <w:tcW w:w="4045" w:type="dxa"/>
+            <w:tcW w:w="3580" w:type="dxa"/>
             <w:tcBorders>
               <w:top w:val="single" w:color="B7C9C0" w:sz="4" w:space="0"/>
               <w:left w:val="single" w:color="B7C9C0" w:sz="4" w:space="0"/>
@@ -10041,7 +10073,7 @@
         </w:tc>
         <w:tc>
           <w:tcPr>
-            <w:tcW w:w="5701" w:type="dxa"/>
+            <w:tcW w:w="6166" w:type="dxa"/>
             <w:tcBorders>
               <w:top w:val="single" w:color="B7C9C0" w:sz="4" w:space="0"/>
               <w:left w:val="single" w:color="B7C9C0" w:sz="4" w:space="0"/>
@@ -10093,7 +10125,7 @@
         </w:tblPrEx>
         <w:tc>
           <w:tcPr>
-            <w:tcW w:w="4045" w:type="dxa"/>
+            <w:tcW w:w="3580" w:type="dxa"/>
             <w:tcBorders>
               <w:top w:val="single" w:color="B7C9C0" w:sz="4" w:space="0"/>
               <w:left w:val="single" w:color="B7C9C0" w:sz="4" w:space="0"/>
@@ -10127,7 +10159,7 @@
         </w:tc>
         <w:tc>
           <w:tcPr>
-            <w:tcW w:w="5701" w:type="dxa"/>
+            <w:tcW w:w="6166" w:type="dxa"/>
             <w:tcBorders>
               <w:top w:val="single" w:color="B7C9C0" w:sz="4" w:space="0"/>
               <w:left w:val="single" w:color="B7C9C0" w:sz="4" w:space="0"/>
@@ -10179,7 +10211,7 @@
         </w:tblPrEx>
         <w:tc>
           <w:tcPr>
-            <w:tcW w:w="4045" w:type="dxa"/>
+            <w:tcW w:w="3580" w:type="dxa"/>
             <w:tcBorders>
               <w:top w:val="single" w:color="B7C9C0" w:sz="4" w:space="0"/>
               <w:left w:val="single" w:color="B7C9C0" w:sz="4" w:space="0"/>
@@ -10213,7 +10245,7 @@
         </w:tc>
         <w:tc>
           <w:tcPr>
-            <w:tcW w:w="5701" w:type="dxa"/>
+            <w:tcW w:w="6166" w:type="dxa"/>
             <w:tcBorders>
               <w:top w:val="single" w:color="B7C9C0" w:sz="4" w:space="0"/>
               <w:left w:val="single" w:color="B7C9C0" w:sz="4" w:space="0"/>
@@ -10265,7 +10297,7 @@
         </w:tblPrEx>
         <w:tc>
           <w:tcPr>
-            <w:tcW w:w="4045" w:type="dxa"/>
+            <w:tcW w:w="3580" w:type="dxa"/>
             <w:tcBorders>
               <w:top w:val="single" w:color="B7C9C0" w:sz="4" w:space="0"/>
               <w:left w:val="single" w:color="B7C9C0" w:sz="4" w:space="0"/>
@@ -10299,7 +10331,7 @@
         </w:tc>
         <w:tc>
           <w:tcPr>
-            <w:tcW w:w="5701" w:type="dxa"/>
+            <w:tcW w:w="6166" w:type="dxa"/>
             <w:tcBorders>
               <w:top w:val="single" w:color="B7C9C0" w:sz="4" w:space="0"/>
               <w:left w:val="single" w:color="B7C9C0" w:sz="4" w:space="0"/>
@@ -10342,8 +10374,8 @@
       <w:pPr>
         <w:pStyle w:val="3"/>
       </w:pPr>
-      <w:bookmarkStart w:id="30" w:name="_Toc31370"/>
-      <w:bookmarkStart w:id="31" w:name="_Toc6119"/>
+      <w:bookmarkStart w:id="30" w:name="_Toc6119"/>
+      <w:bookmarkStart w:id="31" w:name="_Toc31370"/>
       <w:r>
         <w:t>6.2 Support record</w:t>
       </w:r>
@@ -10364,6 +10396,13 @@
       </w:pPr>
       <w:bookmarkStart w:id="32" w:name="_Toc22178"/>
       <w:bookmarkStart w:id="33" w:name="_Toc17197"/>
+    </w:p>
+    <w:p>
+      <w:pPr>
+        <w:pStyle w:val="3"/>
+      </w:pPr>
+      <w:bookmarkStart w:id="50" w:name="_GoBack"/>
+      <w:bookmarkEnd w:id="50"/>
       <w:r>
         <w:t>6.3 Controlled changes</w:t>
       </w:r>
@@ -10950,8 +10989,8 @@
         <w:pStyle w:val="2"/>
         <w:pageBreakBefore/>
       </w:pPr>
-      <w:bookmarkStart w:id="36" w:name="_Toc13824"/>
-      <w:bookmarkStart w:id="37" w:name="_Toc1911"/>
+      <w:bookmarkStart w:id="36" w:name="_Toc1911"/>
+      <w:bookmarkStart w:id="37" w:name="_Toc13824"/>
       <w:r>
         <w:t>Appendix B. Wialon diagnostic telemetry codes</w:t>
       </w:r>
@@ -12427,8 +12466,8 @@
         <w:pStyle w:val="2"/>
         <w:pageBreakBefore/>
       </w:pPr>
-      <w:bookmarkStart w:id="40" w:name="_Toc15224"/>
-      <w:bookmarkStart w:id="41" w:name="_Toc15828"/>
+      <w:bookmarkStart w:id="40" w:name="_Toc15828"/>
+      <w:bookmarkStart w:id="41" w:name="_Toc15224"/>
       <w:r>
         <w:t>Appendix D. PostgreSQL Data Dictionary</w:t>
       </w:r>
@@ -15741,32 +15780,17 @@
         </w:tblCellMar>
       </w:tblPr>
       <w:tblGrid>
-        <w:gridCol w:w="4873"/>
-        <w:gridCol w:w="4873"/>
+        <w:gridCol w:w="2100"/>
+        <w:gridCol w:w="3000"/>
+        <w:gridCol w:w="4646"/>
       </w:tblGrid>
       <w:tr>
-        <w:tblPrEx>
-          <w:tblBorders>
-            <w:top w:val="single" w:color="auto" w:sz="4" w:space="0"/>
-            <w:left w:val="single" w:color="auto" w:sz="4" w:space="0"/>
-            <w:bottom w:val="single" w:color="auto" w:sz="4" w:space="0"/>
-            <w:right w:val="single" w:color="auto" w:sz="4" w:space="0"/>
-            <w:insideH w:val="single" w:color="auto" w:sz="4" w:space="0"/>
-            <w:insideV w:val="single" w:color="auto" w:sz="4" w:space="0"/>
-          </w:tblBorders>
-          <w:tblCellMar>
-            <w:top w:w="0" w:type="dxa"/>
-            <w:left w:w="10" w:type="dxa"/>
-            <w:bottom w:w="0" w:type="dxa"/>
-            <w:right w:w="10" w:type="dxa"/>
-          </w:tblCellMar>
-        </w:tblPrEx>
         <w:trPr>
           <w:tblHeader/>
         </w:trPr>
         <w:tc>
           <w:tcPr>
-            <w:tcW w:w="4873" w:type="dxa"/>
+            <w:tcW w:w="2100" w:type="dxa"/>
             <w:tcBorders>
               <w:top w:val="single" w:color="B7C9C0" w:sz="4" w:space="0"/>
               <w:left w:val="single" w:color="B7C9C0" w:sz="4" w:space="0"/>
@@ -15794,13 +15818,13 @@
                 <w:sz w:val="19"/>
                 <w:szCs w:val="19"/>
               </w:rPr>
-              <w:t>Routine</w:t>
-            </w:r>
-          </w:p>
-        </w:tc>
-        <w:tc>
-          <w:tcPr>
-            <w:tcW w:w="4873" w:type="dxa"/>
+              <w:t xml:space="preserve">Routine</w:t>
+            </w:r>
+          </w:p>
+        </w:tc>
+        <w:tc>
+          <w:tcPr>
+            <w:tcW w:w="3000" w:type="dxa"/>
             <w:tcBorders>
               <w:top w:val="single" w:color="B7C9C0" w:sz="4" w:space="0"/>
               <w:left w:val="single" w:color="B7C9C0" w:sz="4" w:space="0"/>
@@ -15828,31 +15852,49 @@
                 <w:sz w:val="19"/>
                 <w:szCs w:val="19"/>
               </w:rPr>
-              <w:t>Purpose</w:t>
+              <w:t xml:space="preserve">Parameters</w:t>
+            </w:r>
+          </w:p>
+        </w:tc>
+        <w:tc>
+          <w:tcPr>
+            <w:tcW w:w="4646" w:type="dxa"/>
+            <w:tcBorders>
+              <w:top w:val="single" w:color="B7C9C0" w:sz="4" w:space="0"/>
+              <w:left w:val="single" w:color="B7C9C0" w:sz="4" w:space="0"/>
+              <w:bottom w:val="single" w:color="B7C9C0" w:sz="4" w:space="0"/>
+              <w:right w:val="single" w:color="B7C9C0" w:sz="4" w:space="0"/>
+            </w:tcBorders>
+            <w:shd w:val="clear" w:color="auto" w:fill="1F4E3D"/>
+            <w:tcMar>
+              <w:top w:w="80" w:type="dxa"/>
+              <w:left w:w="100" w:type="dxa"/>
+              <w:bottom w:w="80" w:type="dxa"/>
+              <w:right w:w="100" w:type="dxa"/>
+            </w:tcMar>
+            <w:vAlign w:val="center"/>
+          </w:tcPr>
+          <w:p>
+            <w:pPr>
+              <w:spacing w:after="0"/>
+            </w:pPr>
+            <w:r>
+              <w:rPr>
+                <w:b/>
+                <w:bCs/>
+                <w:color w:val="FFFFFF"/>
+                <w:sz w:val="19"/>
+                <w:szCs w:val="19"/>
+              </w:rPr>
+              <w:t xml:space="preserve">Purpose</w:t>
             </w:r>
           </w:p>
         </w:tc>
       </w:tr>
       <w:tr>
-        <w:tblPrEx>
-          <w:tblBorders>
-            <w:top w:val="single" w:color="auto" w:sz="4" w:space="0"/>
-            <w:left w:val="single" w:color="auto" w:sz="4" w:space="0"/>
-            <w:bottom w:val="single" w:color="auto" w:sz="4" w:space="0"/>
-            <w:right w:val="single" w:color="auto" w:sz="4" w:space="0"/>
-            <w:insideH w:val="single" w:color="auto" w:sz="4" w:space="0"/>
-            <w:insideV w:val="single" w:color="auto" w:sz="4" w:space="0"/>
-          </w:tblBorders>
-          <w:tblCellMar>
-            <w:top w:w="0" w:type="dxa"/>
-            <w:left w:w="10" w:type="dxa"/>
-            <w:bottom w:w="0" w:type="dxa"/>
-            <w:right w:w="10" w:type="dxa"/>
-          </w:tblCellMar>
-        </w:tblPrEx>
-        <w:tc>
-          <w:tcPr>
-            <w:tcW w:w="4873" w:type="dxa"/>
+        <w:tc>
+          <w:tcPr>
+            <w:tcW w:w="2100" w:type="dxa"/>
             <w:tcBorders>
               <w:top w:val="single" w:color="B7C9C0" w:sz="4" w:space="0"/>
               <w:left w:val="single" w:color="B7C9C0" w:sz="4" w:space="0"/>
@@ -15880,13 +15922,13 @@
                 <w:sz w:val="19"/>
                 <w:szCs w:val="19"/>
               </w:rPr>
-              <w:t>seed_unit</w:t>
-            </w:r>
-          </w:p>
-        </w:tc>
-        <w:tc>
-          <w:tcPr>
-            <w:tcW w:w="4873" w:type="dxa"/>
+              <w:t xml:space="preserve">seed_unit</w:t>
+            </w:r>
+          </w:p>
+        </w:tc>
+        <w:tc>
+          <w:tcPr>
+            <w:tcW w:w="3000" w:type="dxa"/>
             <w:tcBorders>
               <w:top w:val="single" w:color="B7C9C0" w:sz="4" w:space="0"/>
               <w:left w:val="single" w:color="B7C9C0" w:sz="4" w:space="0"/>
@@ -15914,31 +15956,49 @@
                 <w:sz w:val="19"/>
                 <w:szCs w:val="19"/>
               </w:rPr>
-              <w:t>Insert a unit or refresh its label without changing a live binding.</w:t>
+              <w:t xml:space="preserve">p_unique_id, p_name</w:t>
+            </w:r>
+          </w:p>
+        </w:tc>
+        <w:tc>
+          <w:tcPr>
+            <w:tcW w:w="4646" w:type="dxa"/>
+            <w:tcBorders>
+              <w:top w:val="single" w:color="B7C9C0" w:sz="4" w:space="0"/>
+              <w:left w:val="single" w:color="B7C9C0" w:sz="4" w:space="0"/>
+              <w:bottom w:val="single" w:color="B7C9C0" w:sz="4" w:space="0"/>
+              <w:right w:val="single" w:color="B7C9C0" w:sz="4" w:space="0"/>
+            </w:tcBorders>
+            <w:shd w:val="clear" w:color="auto" w:fill="FFFFFF"/>
+            <w:tcMar>
+              <w:top w:w="80" w:type="dxa"/>
+              <w:left w:w="100" w:type="dxa"/>
+              <w:bottom w:w="80" w:type="dxa"/>
+              <w:right w:w="100" w:type="dxa"/>
+            </w:tcMar>
+            <w:vAlign w:val="center"/>
+          </w:tcPr>
+          <w:p>
+            <w:pPr>
+              <w:spacing w:after="0"/>
+            </w:pPr>
+            <w:r>
+              <w:rPr>
+                <w:b w:val="0"/>
+                <w:bCs w:val="0"/>
+                <w:color w:val="202020"/>
+                <w:sz w:val="19"/>
+                <w:szCs w:val="19"/>
+              </w:rPr>
+              <w:t xml:space="preserve">Insert a unit or refresh its label without changing a live binding.</w:t>
             </w:r>
           </w:p>
         </w:tc>
       </w:tr>
       <w:tr>
-        <w:tblPrEx>
-          <w:tblBorders>
-            <w:top w:val="single" w:color="auto" w:sz="4" w:space="0"/>
-            <w:left w:val="single" w:color="auto" w:sz="4" w:space="0"/>
-            <w:bottom w:val="single" w:color="auto" w:sz="4" w:space="0"/>
-            <w:right w:val="single" w:color="auto" w:sz="4" w:space="0"/>
-            <w:insideH w:val="single" w:color="auto" w:sz="4" w:space="0"/>
-            <w:insideV w:val="single" w:color="auto" w:sz="4" w:space="0"/>
-          </w:tblBorders>
-          <w:tblCellMar>
-            <w:top w:w="0" w:type="dxa"/>
-            <w:left w:w="10" w:type="dxa"/>
-            <w:bottom w:w="0" w:type="dxa"/>
-            <w:right w:w="10" w:type="dxa"/>
-          </w:tblCellMar>
-        </w:tblPrEx>
-        <w:tc>
-          <w:tcPr>
-            <w:tcW w:w="4873" w:type="dxa"/>
+        <w:tc>
+          <w:tcPr>
+            <w:tcW w:w="2100" w:type="dxa"/>
             <w:tcBorders>
               <w:top w:val="single" w:color="B7C9C0" w:sz="4" w:space="0"/>
               <w:left w:val="single" w:color="B7C9C0" w:sz="4" w:space="0"/>
@@ -15966,13 +16026,13 @@
                 <w:sz w:val="19"/>
                 <w:szCs w:val="19"/>
               </w:rPr>
-              <w:t>issue_otp</w:t>
-            </w:r>
-          </w:p>
-        </w:tc>
-        <w:tc>
-          <w:tcPr>
-            <w:tcW w:w="4873" w:type="dxa"/>
+              <w:t xml:space="preserve">issue_otp</w:t>
+            </w:r>
+          </w:p>
+        </w:tc>
+        <w:tc>
+          <w:tcPr>
+            <w:tcW w:w="3000" w:type="dxa"/>
             <w:tcBorders>
               <w:top w:val="single" w:color="B7C9C0" w:sz="4" w:space="0"/>
               <w:left w:val="single" w:color="B7C9C0" w:sz="4" w:space="0"/>
@@ -16000,31 +16060,49 @@
                 <w:sz w:val="19"/>
                 <w:szCs w:val="19"/>
               </w:rPr>
-              <w:t>Purge expired OTPs and issue a six-digit OTP.</w:t>
+              <w:t xml:space="preserve">p_ttl_minutes (default 10)</w:t>
+            </w:r>
+          </w:p>
+        </w:tc>
+        <w:tc>
+          <w:tcPr>
+            <w:tcW w:w="4646" w:type="dxa"/>
+            <w:tcBorders>
+              <w:top w:val="single" w:color="B7C9C0" w:sz="4" w:space="0"/>
+              <w:left w:val="single" w:color="B7C9C0" w:sz="4" w:space="0"/>
+              <w:bottom w:val="single" w:color="B7C9C0" w:sz="4" w:space="0"/>
+              <w:right w:val="single" w:color="B7C9C0" w:sz="4" w:space="0"/>
+            </w:tcBorders>
+            <w:shd w:val="clear" w:color="auto" w:fill="F2F8F1"/>
+            <w:tcMar>
+              <w:top w:w="80" w:type="dxa"/>
+              <w:left w:w="100" w:type="dxa"/>
+              <w:bottom w:w="80" w:type="dxa"/>
+              <w:right w:w="100" w:type="dxa"/>
+            </w:tcMar>
+            <w:vAlign w:val="center"/>
+          </w:tcPr>
+          <w:p>
+            <w:pPr>
+              <w:spacing w:after="0"/>
+            </w:pPr>
+            <w:r>
+              <w:rPr>
+                <w:b w:val="0"/>
+                <w:bCs w:val="0"/>
+                <w:color w:val="202020"/>
+                <w:sz w:val="19"/>
+                <w:szCs w:val="19"/>
+              </w:rPr>
+              <w:t xml:space="preserve">Purge expired OTPs and issue a six-digit OTP.</w:t>
             </w:r>
           </w:p>
         </w:tc>
       </w:tr>
       <w:tr>
-        <w:tblPrEx>
-          <w:tblBorders>
-            <w:top w:val="single" w:color="auto" w:sz="4" w:space="0"/>
-            <w:left w:val="single" w:color="auto" w:sz="4" w:space="0"/>
-            <w:bottom w:val="single" w:color="auto" w:sz="4" w:space="0"/>
-            <w:right w:val="single" w:color="auto" w:sz="4" w:space="0"/>
-            <w:insideH w:val="single" w:color="auto" w:sz="4" w:space="0"/>
-            <w:insideV w:val="single" w:color="auto" w:sz="4" w:space="0"/>
-          </w:tblBorders>
-          <w:tblCellMar>
-            <w:top w:w="0" w:type="dxa"/>
-            <w:left w:w="10" w:type="dxa"/>
-            <w:bottom w:w="0" w:type="dxa"/>
-            <w:right w:w="10" w:type="dxa"/>
-          </w:tblCellMar>
-        </w:tblPrEx>
-        <w:tc>
-          <w:tcPr>
-            <w:tcW w:w="4873" w:type="dxa"/>
+        <w:tc>
+          <w:tcPr>
+            <w:tcW w:w="2100" w:type="dxa"/>
             <w:tcBorders>
               <w:top w:val="single" w:color="B7C9C0" w:sz="4" w:space="0"/>
               <w:left w:val="single" w:color="B7C9C0" w:sz="4" w:space="0"/>
@@ -16052,13 +16130,13 @@
                 <w:sz w:val="19"/>
                 <w:szCs w:val="19"/>
               </w:rPr>
-              <w:t>otp_is_valid</w:t>
-            </w:r>
-          </w:p>
-        </w:tc>
-        <w:tc>
-          <w:tcPr>
-            <w:tcW w:w="4873" w:type="dxa"/>
+              <w:t xml:space="preserve">otp_is_valid</w:t>
+            </w:r>
+          </w:p>
+        </w:tc>
+        <w:tc>
+          <w:tcPr>
+            <w:tcW w:w="3000" w:type="dxa"/>
             <w:tcBorders>
               <w:top w:val="single" w:color="B7C9C0" w:sz="4" w:space="0"/>
               <w:left w:val="single" w:color="B7C9C0" w:sz="4" w:space="0"/>
@@ -16086,31 +16164,49 @@
                 <w:sz w:val="19"/>
                 <w:szCs w:val="19"/>
               </w:rPr>
-              <w:t>Check OTP validity without consuming it.</w:t>
+              <w:t xml:space="preserve">p_otp</w:t>
+            </w:r>
+          </w:p>
+        </w:tc>
+        <w:tc>
+          <w:tcPr>
+            <w:tcW w:w="4646" w:type="dxa"/>
+            <w:tcBorders>
+              <w:top w:val="single" w:color="B7C9C0" w:sz="4" w:space="0"/>
+              <w:left w:val="single" w:color="B7C9C0" w:sz="4" w:space="0"/>
+              <w:bottom w:val="single" w:color="B7C9C0" w:sz="4" w:space="0"/>
+              <w:right w:val="single" w:color="B7C9C0" w:sz="4" w:space="0"/>
+            </w:tcBorders>
+            <w:shd w:val="clear" w:color="auto" w:fill="FFFFFF"/>
+            <w:tcMar>
+              <w:top w:w="80" w:type="dxa"/>
+              <w:left w:w="100" w:type="dxa"/>
+              <w:bottom w:w="80" w:type="dxa"/>
+              <w:right w:w="100" w:type="dxa"/>
+            </w:tcMar>
+            <w:vAlign w:val="center"/>
+          </w:tcPr>
+          <w:p>
+            <w:pPr>
+              <w:spacing w:after="0"/>
+            </w:pPr>
+            <w:r>
+              <w:rPr>
+                <w:b w:val="0"/>
+                <w:bCs w:val="0"/>
+                <w:color w:val="202020"/>
+                <w:sz w:val="19"/>
+                <w:szCs w:val="19"/>
+              </w:rPr>
+              <w:t xml:space="preserve">Check OTP validity without consuming it.</w:t>
             </w:r>
           </w:p>
         </w:tc>
       </w:tr>
       <w:tr>
-        <w:tblPrEx>
-          <w:tblBorders>
-            <w:top w:val="single" w:color="auto" w:sz="4" w:space="0"/>
-            <w:left w:val="single" w:color="auto" w:sz="4" w:space="0"/>
-            <w:bottom w:val="single" w:color="auto" w:sz="4" w:space="0"/>
-            <w:right w:val="single" w:color="auto" w:sz="4" w:space="0"/>
-            <w:insideH w:val="single" w:color="auto" w:sz="4" w:space="0"/>
-            <w:insideV w:val="single" w:color="auto" w:sz="4" w:space="0"/>
-          </w:tblBorders>
-          <w:tblCellMar>
-            <w:top w:w="0" w:type="dxa"/>
-            <w:left w:w="10" w:type="dxa"/>
-            <w:bottom w:w="0" w:type="dxa"/>
-            <w:right w:w="10" w:type="dxa"/>
-          </w:tblCellMar>
-        </w:tblPrEx>
-        <w:tc>
-          <w:tcPr>
-            <w:tcW w:w="4873" w:type="dxa"/>
+        <w:tc>
+          <w:tcPr>
+            <w:tcW w:w="2100" w:type="dxa"/>
             <w:tcBorders>
               <w:top w:val="single" w:color="B7C9C0" w:sz="4" w:space="0"/>
               <w:left w:val="single" w:color="B7C9C0" w:sz="4" w:space="0"/>
@@ -16138,13 +16234,13 @@
                 <w:sz w:val="19"/>
                 <w:szCs w:val="19"/>
               </w:rPr>
-              <w:t>consume_otp</w:t>
-            </w:r>
-          </w:p>
-        </w:tc>
-        <w:tc>
-          <w:tcPr>
-            <w:tcW w:w="4873" w:type="dxa"/>
+              <w:t xml:space="preserve">consume_otp</w:t>
+            </w:r>
+          </w:p>
+        </w:tc>
+        <w:tc>
+          <w:tcPr>
+            <w:tcW w:w="3000" w:type="dxa"/>
             <w:tcBorders>
               <w:top w:val="single" w:color="B7C9C0" w:sz="4" w:space="0"/>
               <w:left w:val="single" w:color="B7C9C0" w:sz="4" w:space="0"/>
@@ -16172,31 +16268,49 @@
                 <w:sz w:val="19"/>
                 <w:szCs w:val="19"/>
               </w:rPr>
-              <w:t>Atomically consume a valid OTP.</w:t>
+              <w:t xml:space="preserve">p_otp</w:t>
+            </w:r>
+          </w:p>
+        </w:tc>
+        <w:tc>
+          <w:tcPr>
+            <w:tcW w:w="4646" w:type="dxa"/>
+            <w:tcBorders>
+              <w:top w:val="single" w:color="B7C9C0" w:sz="4" w:space="0"/>
+              <w:left w:val="single" w:color="B7C9C0" w:sz="4" w:space="0"/>
+              <w:bottom w:val="single" w:color="B7C9C0" w:sz="4" w:space="0"/>
+              <w:right w:val="single" w:color="B7C9C0" w:sz="4" w:space="0"/>
+            </w:tcBorders>
+            <w:shd w:val="clear" w:color="auto" w:fill="F2F8F1"/>
+            <w:tcMar>
+              <w:top w:w="80" w:type="dxa"/>
+              <w:left w:w="100" w:type="dxa"/>
+              <w:bottom w:w="80" w:type="dxa"/>
+              <w:right w:w="100" w:type="dxa"/>
+            </w:tcMar>
+            <w:vAlign w:val="center"/>
+          </w:tcPr>
+          <w:p>
+            <w:pPr>
+              <w:spacing w:after="0"/>
+            </w:pPr>
+            <w:r>
+              <w:rPr>
+                <w:b w:val="0"/>
+                <w:bCs w:val="0"/>
+                <w:color w:val="202020"/>
+                <w:sz w:val="19"/>
+                <w:szCs w:val="19"/>
+              </w:rPr>
+              <w:t xml:space="preserve">Atomically consume a valid OTP.</w:t>
             </w:r>
           </w:p>
         </w:tc>
       </w:tr>
       <w:tr>
-        <w:tblPrEx>
-          <w:tblBorders>
-            <w:top w:val="single" w:color="auto" w:sz="4" w:space="0"/>
-            <w:left w:val="single" w:color="auto" w:sz="4" w:space="0"/>
-            <w:bottom w:val="single" w:color="auto" w:sz="4" w:space="0"/>
-            <w:right w:val="single" w:color="auto" w:sz="4" w:space="0"/>
-            <w:insideH w:val="single" w:color="auto" w:sz="4" w:space="0"/>
-            <w:insideV w:val="single" w:color="auto" w:sz="4" w:space="0"/>
-          </w:tblBorders>
-          <w:tblCellMar>
-            <w:top w:w="0" w:type="dxa"/>
-            <w:left w:w="10" w:type="dxa"/>
-            <w:bottom w:w="0" w:type="dxa"/>
-            <w:right w:w="10" w:type="dxa"/>
-          </w:tblCellMar>
-        </w:tblPrEx>
-        <w:tc>
-          <w:tcPr>
-            <w:tcW w:w="4873" w:type="dxa"/>
+        <w:tc>
+          <w:tcPr>
+            <w:tcW w:w="2100" w:type="dxa"/>
             <w:tcBorders>
               <w:top w:val="single" w:color="B7C9C0" w:sz="4" w:space="0"/>
               <w:left w:val="single" w:color="B7C9C0" w:sz="4" w:space="0"/>
@@ -16224,13 +16338,13 @@
                 <w:sz w:val="19"/>
                 <w:szCs w:val="19"/>
               </w:rPr>
-              <w:t>manual_claim</w:t>
-            </w:r>
-          </w:p>
-        </w:tc>
-        <w:tc>
-          <w:tcPr>
-            <w:tcW w:w="4873" w:type="dxa"/>
+              <w:t xml:space="preserve">manual_claim</w:t>
+            </w:r>
+          </w:p>
+        </w:tc>
+        <w:tc>
+          <w:tcPr>
+            <w:tcW w:w="3000" w:type="dxa"/>
             <w:tcBorders>
               <w:top w:val="single" w:color="B7C9C0" w:sz="4" w:space="0"/>
               <w:left w:val="single" w:color="B7C9C0" w:sz="4" w:space="0"/>
@@ -16258,31 +16372,49 @@
                 <w:sz w:val="19"/>
                 <w:szCs w:val="19"/>
               </w:rPr>
-              <w:t>Bind a phone to a unit after ownership, OTP, and drain checks.</w:t>
+              <w:t xml:space="preserve">p_unique_id, p_fingerprint, p_otp</w:t>
+            </w:r>
+          </w:p>
+        </w:tc>
+        <w:tc>
+          <w:tcPr>
+            <w:tcW w:w="4646" w:type="dxa"/>
+            <w:tcBorders>
+              <w:top w:val="single" w:color="B7C9C0" w:sz="4" w:space="0"/>
+              <w:left w:val="single" w:color="B7C9C0" w:sz="4" w:space="0"/>
+              <w:bottom w:val="single" w:color="B7C9C0" w:sz="4" w:space="0"/>
+              <w:right w:val="single" w:color="B7C9C0" w:sz="4" w:space="0"/>
+            </w:tcBorders>
+            <w:shd w:val="clear" w:color="auto" w:fill="FFFFFF"/>
+            <w:tcMar>
+              <w:top w:w="80" w:type="dxa"/>
+              <w:left w:w="100" w:type="dxa"/>
+              <w:bottom w:w="80" w:type="dxa"/>
+              <w:right w:w="100" w:type="dxa"/>
+            </w:tcMar>
+            <w:vAlign w:val="center"/>
+          </w:tcPr>
+          <w:p>
+            <w:pPr>
+              <w:spacing w:after="0"/>
+            </w:pPr>
+            <w:r>
+              <w:rPr>
+                <w:b w:val="0"/>
+                <w:bCs w:val="0"/>
+                <w:color w:val="202020"/>
+                <w:sz w:val="19"/>
+                <w:szCs w:val="19"/>
+              </w:rPr>
+              <w:t xml:space="preserve">Bind a phone to a unit after ownership, OTP, and drain checks.</w:t>
             </w:r>
           </w:p>
         </w:tc>
       </w:tr>
       <w:tr>
-        <w:tblPrEx>
-          <w:tblBorders>
-            <w:top w:val="single" w:color="auto" w:sz="4" w:space="0"/>
-            <w:left w:val="single" w:color="auto" w:sz="4" w:space="0"/>
-            <w:bottom w:val="single" w:color="auto" w:sz="4" w:space="0"/>
-            <w:right w:val="single" w:color="auto" w:sz="4" w:space="0"/>
-            <w:insideH w:val="single" w:color="auto" w:sz="4" w:space="0"/>
-            <w:insideV w:val="single" w:color="auto" w:sz="4" w:space="0"/>
-          </w:tblBorders>
-          <w:tblCellMar>
-            <w:top w:w="0" w:type="dxa"/>
-            <w:left w:w="10" w:type="dxa"/>
-            <w:bottom w:w="0" w:type="dxa"/>
-            <w:right w:w="10" w:type="dxa"/>
-          </w:tblCellMar>
-        </w:tblPrEx>
-        <w:tc>
-          <w:tcPr>
-            <w:tcW w:w="4873" w:type="dxa"/>
+        <w:tc>
+          <w:tcPr>
+            <w:tcW w:w="2100" w:type="dxa"/>
             <w:tcBorders>
               <w:top w:val="single" w:color="B7C9C0" w:sz="4" w:space="0"/>
               <w:left w:val="single" w:color="B7C9C0" w:sz="4" w:space="0"/>
@@ -16310,13 +16442,13 @@
                 <w:sz w:val="19"/>
                 <w:szCs w:val="19"/>
               </w:rPr>
-              <w:t>release_unit</w:t>
-            </w:r>
-          </w:p>
-        </w:tc>
-        <w:tc>
-          <w:tcPr>
-            <w:tcW w:w="4873" w:type="dxa"/>
+              <w:t xml:space="preserve">release_unit</w:t>
+            </w:r>
+          </w:p>
+        </w:tc>
+        <w:tc>
+          <w:tcPr>
+            <w:tcW w:w="3000" w:type="dxa"/>
             <w:tcBorders>
               <w:top w:val="single" w:color="B7C9C0" w:sz="4" w:space="0"/>
               <w:left w:val="single" w:color="B7C9C0" w:sz="4" w:space="0"/>
@@ -16344,31 +16476,49 @@
                 <w:sz w:val="19"/>
                 <w:szCs w:val="19"/>
               </w:rPr>
-              <w:t>Release a unit only for its proven owner.</w:t>
+              <w:t xml:space="preserve">p_unique_id, p_fingerprint, p_otp</w:t>
+            </w:r>
+          </w:p>
+        </w:tc>
+        <w:tc>
+          <w:tcPr>
+            <w:tcW w:w="4646" w:type="dxa"/>
+            <w:tcBorders>
+              <w:top w:val="single" w:color="B7C9C0" w:sz="4" w:space="0"/>
+              <w:left w:val="single" w:color="B7C9C0" w:sz="4" w:space="0"/>
+              <w:bottom w:val="single" w:color="B7C9C0" w:sz="4" w:space="0"/>
+              <w:right w:val="single" w:color="B7C9C0" w:sz="4" w:space="0"/>
+            </w:tcBorders>
+            <w:shd w:val="clear" w:color="auto" w:fill="F2F8F1"/>
+            <w:tcMar>
+              <w:top w:w="80" w:type="dxa"/>
+              <w:left w:w="100" w:type="dxa"/>
+              <w:bottom w:w="80" w:type="dxa"/>
+              <w:right w:w="100" w:type="dxa"/>
+            </w:tcMar>
+            <w:vAlign w:val="center"/>
+          </w:tcPr>
+          <w:p>
+            <w:pPr>
+              <w:spacing w:after="0"/>
+            </w:pPr>
+            <w:r>
+              <w:rPr>
+                <w:b w:val="0"/>
+                <w:bCs w:val="0"/>
+                <w:color w:val="202020"/>
+                <w:sz w:val="19"/>
+                <w:szCs w:val="19"/>
+              </w:rPr>
+              <w:t xml:space="preserve">Release a unit only for its proven owner.</w:t>
             </w:r>
           </w:p>
         </w:tc>
       </w:tr>
       <w:tr>
-        <w:tblPrEx>
-          <w:tblBorders>
-            <w:top w:val="single" w:color="auto" w:sz="4" w:space="0"/>
-            <w:left w:val="single" w:color="auto" w:sz="4" w:space="0"/>
-            <w:bottom w:val="single" w:color="auto" w:sz="4" w:space="0"/>
-            <w:right w:val="single" w:color="auto" w:sz="4" w:space="0"/>
-            <w:insideH w:val="single" w:color="auto" w:sz="4" w:space="0"/>
-            <w:insideV w:val="single" w:color="auto" w:sz="4" w:space="0"/>
-          </w:tblBorders>
-          <w:tblCellMar>
-            <w:top w:w="0" w:type="dxa"/>
-            <w:left w:w="10" w:type="dxa"/>
-            <w:bottom w:w="0" w:type="dxa"/>
-            <w:right w:w="10" w:type="dxa"/>
-          </w:tblCellMar>
-        </w:tblPrEx>
-        <w:tc>
-          <w:tcPr>
-            <w:tcW w:w="4873" w:type="dxa"/>
+        <w:tc>
+          <w:tcPr>
+            <w:tcW w:w="2100" w:type="dxa"/>
             <w:tcBorders>
               <w:top w:val="single" w:color="B7C9C0" w:sz="4" w:space="0"/>
               <w:left w:val="single" w:color="B7C9C0" w:sz="4" w:space="0"/>
@@ -16396,13 +16546,13 @@
                 <w:sz w:val="19"/>
                 <w:szCs w:val="19"/>
               </w:rPr>
-              <w:t>check_binding</w:t>
-            </w:r>
-          </w:p>
-        </w:tc>
-        <w:tc>
-          <w:tcPr>
-            <w:tcW w:w="4873" w:type="dxa"/>
+              <w:t xml:space="preserve">check_binding</w:t>
+            </w:r>
+          </w:p>
+        </w:tc>
+        <w:tc>
+          <w:tcPr>
+            <w:tcW w:w="3000" w:type="dxa"/>
             <w:tcBorders>
               <w:top w:val="single" w:color="B7C9C0" w:sz="4" w:space="0"/>
               <w:left w:val="single" w:color="B7C9C0" w:sz="4" w:space="0"/>
@@ -16430,31 +16580,49 @@
                 <w:sz w:val="19"/>
                 <w:szCs w:val="19"/>
               </w:rPr>
-              <w:t>Return binding state and refresh owner activity/version when bound.</w:t>
+              <w:t xml:space="preserve">p_unique_id, p_fingerprint, p_app_version (default NULL)</w:t>
+            </w:r>
+          </w:p>
+        </w:tc>
+        <w:tc>
+          <w:tcPr>
+            <w:tcW w:w="4646" w:type="dxa"/>
+            <w:tcBorders>
+              <w:top w:val="single" w:color="B7C9C0" w:sz="4" w:space="0"/>
+              <w:left w:val="single" w:color="B7C9C0" w:sz="4" w:space="0"/>
+              <w:bottom w:val="single" w:color="B7C9C0" w:sz="4" w:space="0"/>
+              <w:right w:val="single" w:color="B7C9C0" w:sz="4" w:space="0"/>
+            </w:tcBorders>
+            <w:shd w:val="clear" w:color="auto" w:fill="FFFFFF"/>
+            <w:tcMar>
+              <w:top w:w="80" w:type="dxa"/>
+              <w:left w:w="100" w:type="dxa"/>
+              <w:bottom w:w="80" w:type="dxa"/>
+              <w:right w:w="100" w:type="dxa"/>
+            </w:tcMar>
+            <w:vAlign w:val="center"/>
+          </w:tcPr>
+          <w:p>
+            <w:pPr>
+              <w:spacing w:after="0"/>
+            </w:pPr>
+            <w:r>
+              <w:rPr>
+                <w:b w:val="0"/>
+                <w:bCs w:val="0"/>
+                <w:color w:val="202020"/>
+                <w:sz w:val="19"/>
+                <w:szCs w:val="19"/>
+              </w:rPr>
+              <w:t xml:space="preserve">Return binding state and refresh owner activity/version when bound.</w:t>
             </w:r>
           </w:p>
         </w:tc>
       </w:tr>
       <w:tr>
-        <w:tblPrEx>
-          <w:tblBorders>
-            <w:top w:val="single" w:color="auto" w:sz="4" w:space="0"/>
-            <w:left w:val="single" w:color="auto" w:sz="4" w:space="0"/>
-            <w:bottom w:val="single" w:color="auto" w:sz="4" w:space="0"/>
-            <w:right w:val="single" w:color="auto" w:sz="4" w:space="0"/>
-            <w:insideH w:val="single" w:color="auto" w:sz="4" w:space="0"/>
-            <w:insideV w:val="single" w:color="auto" w:sz="4" w:space="0"/>
-          </w:tblBorders>
-          <w:tblCellMar>
-            <w:top w:w="0" w:type="dxa"/>
-            <w:left w:w="10" w:type="dxa"/>
-            <w:bottom w:w="0" w:type="dxa"/>
-            <w:right w:w="10" w:type="dxa"/>
-          </w:tblCellMar>
-        </w:tblPrEx>
-        <w:tc>
-          <w:tcPr>
-            <w:tcW w:w="4873" w:type="dxa"/>
+        <w:tc>
+          <w:tcPr>
+            <w:tcW w:w="2100" w:type="dxa"/>
             <w:tcBorders>
               <w:top w:val="single" w:color="B7C9C0" w:sz="4" w:space="0"/>
               <w:left w:val="single" w:color="B7C9C0" w:sz="4" w:space="0"/>
@@ -16482,13 +16650,13 @@
                 <w:sz w:val="19"/>
                 <w:szCs w:val="19"/>
               </w:rPr>
-              <w:t>admin_release</w:t>
-            </w:r>
-          </w:p>
-        </w:tc>
-        <w:tc>
-          <w:tcPr>
-            <w:tcW w:w="4873" w:type="dxa"/>
+              <w:t xml:space="preserve">admin_release</w:t>
+            </w:r>
+          </w:p>
+        </w:tc>
+        <w:tc>
+          <w:tcPr>
+            <w:tcW w:w="3000" w:type="dxa"/>
             <w:tcBorders>
               <w:top w:val="single" w:color="B7C9C0" w:sz="4" w:space="0"/>
               <w:left w:val="single" w:color="B7C9C0" w:sz="4" w:space="0"/>
@@ -16516,7 +16684,41 @@
                 <w:sz w:val="19"/>
                 <w:szCs w:val="19"/>
               </w:rPr>
-              <w:t>Office force-release for lost, dead, or reassigned handset.</w:t>
+              <w:t xml:space="preserve">p_unique_id</w:t>
+            </w:r>
+          </w:p>
+        </w:tc>
+        <w:tc>
+          <w:tcPr>
+            <w:tcW w:w="4646" w:type="dxa"/>
+            <w:tcBorders>
+              <w:top w:val="single" w:color="B7C9C0" w:sz="4" w:space="0"/>
+              <w:left w:val="single" w:color="B7C9C0" w:sz="4" w:space="0"/>
+              <w:bottom w:val="single" w:color="B7C9C0" w:sz="4" w:space="0"/>
+              <w:right w:val="single" w:color="B7C9C0" w:sz="4" w:space="0"/>
+            </w:tcBorders>
+            <w:shd w:val="clear" w:color="auto" w:fill="F2F8F1"/>
+            <w:tcMar>
+              <w:top w:w="80" w:type="dxa"/>
+              <w:left w:w="100" w:type="dxa"/>
+              <w:bottom w:w="80" w:type="dxa"/>
+              <w:right w:w="100" w:type="dxa"/>
+            </w:tcMar>
+            <w:vAlign w:val="center"/>
+          </w:tcPr>
+          <w:p>
+            <w:pPr>
+              <w:spacing w:after="0"/>
+            </w:pPr>
+            <w:r>
+              <w:rPr>
+                <w:b w:val="0"/>
+                <w:bCs w:val="0"/>
+                <w:color w:val="202020"/>
+                <w:sz w:val="19"/>
+                <w:szCs w:val="19"/>
+              </w:rPr>
+              <w:t xml:space="preserve">Office force-release for lost, dead, or reassigned handset. Takes no fingerprint: the point is that the owning phone can no longer prove anything.</w:t>
             </w:r>
           </w:p>
         </w:tc>
@@ -16531,8 +16733,8 @@
       <w:pPr>
         <w:pStyle w:val="3"/>
       </w:pPr>
-      <w:bookmarkStart w:id="48" w:name="_Toc16210"/>
-      <w:bookmarkStart w:id="49" w:name="_Toc9571"/>
+      <w:bookmarkStart w:id="48" w:name="_Toc9571"/>
+      <w:bookmarkStart w:id="49" w:name="_Toc16210"/>
       <w:r>
         <w:t>D.4 App-facing status values</w:t>
       </w:r>
@@ -16562,8 +16764,8 @@
       </w:tblPr>
       <w:tblGrid>
         <w:gridCol w:w="3248"/>
-        <w:gridCol w:w="3248"/>
-        <w:gridCol w:w="3250"/>
+        <w:gridCol w:w="2115"/>
+        <w:gridCol w:w="4383"/>
       </w:tblGrid>
       <w:tr>
         <w:tblPrEx>
@@ -16575,12 +16777,6 @@
             <w:insideH w:val="single" w:color="auto" w:sz="4" w:space="0"/>
             <w:insideV w:val="single" w:color="auto" w:sz="4" w:space="0"/>
           </w:tblBorders>
-          <w:tblCellMar>
-            <w:top w:w="0" w:type="dxa"/>
-            <w:left w:w="10" w:type="dxa"/>
-            <w:bottom w:w="0" w:type="dxa"/>
-            <w:right w:w="10" w:type="dxa"/>
-          </w:tblCellMar>
         </w:tblPrEx>
         <w:trPr>
           <w:tblHeader/>
@@ -16621,7 +16817,7 @@
         </w:tc>
         <w:tc>
           <w:tcPr>
-            <w:tcW w:w="3248" w:type="dxa"/>
+            <w:tcW w:w="2115" w:type="dxa"/>
             <w:tcBorders>
               <w:top w:val="single" w:color="B7C9C0" w:sz="4" w:space="0"/>
               <w:left w:val="single" w:color="B7C9C0" w:sz="4" w:space="0"/>
@@ -16655,7 +16851,7 @@
         </w:tc>
         <w:tc>
           <w:tcPr>
-            <w:tcW w:w="3250" w:type="dxa"/>
+            <w:tcW w:w="4383" w:type="dxa"/>
             <w:tcBorders>
               <w:top w:val="single" w:color="B7C9C0" w:sz="4" w:space="0"/>
               <w:left w:val="single" w:color="B7C9C0" w:sz="4" w:space="0"/>
@@ -16741,7 +16937,7 @@
         </w:tc>
         <w:tc>
           <w:tcPr>
-            <w:tcW w:w="3248" w:type="dxa"/>
+            <w:tcW w:w="2115" w:type="dxa"/>
             <w:tcBorders>
               <w:top w:val="single" w:color="B7C9C0" w:sz="4" w:space="0"/>
               <w:left w:val="single" w:color="B7C9C0" w:sz="4" w:space="0"/>
@@ -16775,7 +16971,7 @@
         </w:tc>
         <w:tc>
           <w:tcPr>
-            <w:tcW w:w="3250" w:type="dxa"/>
+            <w:tcW w:w="4383" w:type="dxa"/>
             <w:tcBorders>
               <w:top w:val="single" w:color="B7C9C0" w:sz="4" w:space="0"/>
               <w:left w:val="single" w:color="B7C9C0" w:sz="4" w:space="0"/>
@@ -16861,7 +17057,7 @@
         </w:tc>
         <w:tc>
           <w:tcPr>
-            <w:tcW w:w="3248" w:type="dxa"/>
+            <w:tcW w:w="2115" w:type="dxa"/>
             <w:tcBorders>
               <w:top w:val="single" w:color="B7C9C0" w:sz="4" w:space="0"/>
               <w:left w:val="single" w:color="B7C9C0" w:sz="4" w:space="0"/>
@@ -16895,7 +17091,7 @@
         </w:tc>
         <w:tc>
           <w:tcPr>
-            <w:tcW w:w="3250" w:type="dxa"/>
+            <w:tcW w:w="4383" w:type="dxa"/>
             <w:tcBorders>
               <w:top w:val="single" w:color="B7C9C0" w:sz="4" w:space="0"/>
               <w:left w:val="single" w:color="B7C9C0" w:sz="4" w:space="0"/>
@@ -16981,7 +17177,7 @@
         </w:tc>
         <w:tc>
           <w:tcPr>
-            <w:tcW w:w="3248" w:type="dxa"/>
+            <w:tcW w:w="2115" w:type="dxa"/>
             <w:tcBorders>
               <w:top w:val="single" w:color="B7C9C0" w:sz="4" w:space="0"/>
               <w:left w:val="single" w:color="B7C9C0" w:sz="4" w:space="0"/>
@@ -17015,7 +17211,7 @@
         </w:tc>
         <w:tc>
           <w:tcPr>
-            <w:tcW w:w="3250" w:type="dxa"/>
+            <w:tcW w:w="4383" w:type="dxa"/>
             <w:tcBorders>
               <w:top w:val="single" w:color="B7C9C0" w:sz="4" w:space="0"/>
               <w:left w:val="single" w:color="B7C9C0" w:sz="4" w:space="0"/>
@@ -17101,7 +17297,7 @@
         </w:tc>
         <w:tc>
           <w:tcPr>
-            <w:tcW w:w="3248" w:type="dxa"/>
+            <w:tcW w:w="2115" w:type="dxa"/>
             <w:tcBorders>
               <w:top w:val="single" w:color="B7C9C0" w:sz="4" w:space="0"/>
               <w:left w:val="single" w:color="B7C9C0" w:sz="4" w:space="0"/>
@@ -17135,7 +17331,7 @@
         </w:tc>
         <w:tc>
           <w:tcPr>
-            <w:tcW w:w="3250" w:type="dxa"/>
+            <w:tcW w:w="4383" w:type="dxa"/>
             <w:tcBorders>
               <w:top w:val="single" w:color="B7C9C0" w:sz="4" w:space="0"/>
               <w:left w:val="single" w:color="B7C9C0" w:sz="4" w:space="0"/>
@@ -17221,7 +17417,7 @@
         </w:tc>
         <w:tc>
           <w:tcPr>
-            <w:tcW w:w="3248" w:type="dxa"/>
+            <w:tcW w:w="2115" w:type="dxa"/>
             <w:tcBorders>
               <w:top w:val="single" w:color="B7C9C0" w:sz="4" w:space="0"/>
               <w:left w:val="single" w:color="B7C9C0" w:sz="4" w:space="0"/>
@@ -17255,7 +17451,7 @@
         </w:tc>
         <w:tc>
           <w:tcPr>
-            <w:tcW w:w="3250" w:type="dxa"/>
+            <w:tcW w:w="4383" w:type="dxa"/>
             <w:tcBorders>
               <w:top w:val="single" w:color="B7C9C0" w:sz="4" w:space="0"/>
               <w:left w:val="single" w:color="B7C9C0" w:sz="4" w:space="0"/>
@@ -17341,7 +17537,7 @@
         </w:tc>
         <w:tc>
           <w:tcPr>
-            <w:tcW w:w="3248" w:type="dxa"/>
+            <w:tcW w:w="2115" w:type="dxa"/>
             <w:tcBorders>
               <w:top w:val="single" w:color="B7C9C0" w:sz="4" w:space="0"/>
               <w:left w:val="single" w:color="B7C9C0" w:sz="4" w:space="0"/>
@@ -17375,7 +17571,7 @@
         </w:tc>
         <w:tc>
           <w:tcPr>
-            <w:tcW w:w="3250" w:type="dxa"/>
+            <w:tcW w:w="4383" w:type="dxa"/>
             <w:tcBorders>
               <w:top w:val="single" w:color="B7C9C0" w:sz="4" w:space="0"/>
               <w:left w:val="single" w:color="B7C9C0" w:sz="4" w:space="0"/>
@@ -17461,7 +17657,7 @@
         </w:tc>
         <w:tc>
           <w:tcPr>
-            <w:tcW w:w="3248" w:type="dxa"/>
+            <w:tcW w:w="2115" w:type="dxa"/>
             <w:tcBorders>
               <w:top w:val="single" w:color="B7C9C0" w:sz="4" w:space="0"/>
               <w:left w:val="single" w:color="B7C9C0" w:sz="4" w:space="0"/>
@@ -17495,7 +17691,7 @@
         </w:tc>
         <w:tc>
           <w:tcPr>
-            <w:tcW w:w="3250" w:type="dxa"/>
+            <w:tcW w:w="4383" w:type="dxa"/>
             <w:tcBorders>
               <w:top w:val="single" w:color="B7C9C0" w:sz="4" w:space="0"/>
               <w:left w:val="single" w:color="B7C9C0" w:sz="4" w:space="0"/>
@@ -17581,7 +17777,7 @@
         </w:tc>
         <w:tc>
           <w:tcPr>
-            <w:tcW w:w="3248" w:type="dxa"/>
+            <w:tcW w:w="2115" w:type="dxa"/>
             <w:tcBorders>
               <w:top w:val="single" w:color="B7C9C0" w:sz="4" w:space="0"/>
               <w:left w:val="single" w:color="B7C9C0" w:sz="4" w:space="0"/>
@@ -17615,7 +17811,7 @@
         </w:tc>
         <w:tc>
           <w:tcPr>
-            <w:tcW w:w="3250" w:type="dxa"/>
+            <w:tcW w:w="4383" w:type="dxa"/>
             <w:tcBorders>
               <w:top w:val="single" w:color="B7C9C0" w:sz="4" w:space="0"/>
               <w:left w:val="single" w:color="B7C9C0" w:sz="4" w:space="0"/>
@@ -17701,7 +17897,7 @@
         </w:tc>
         <w:tc>
           <w:tcPr>
-            <w:tcW w:w="3248" w:type="dxa"/>
+            <w:tcW w:w="2115" w:type="dxa"/>
             <w:tcBorders>
               <w:top w:val="single" w:color="B7C9C0" w:sz="4" w:space="0"/>
               <w:left w:val="single" w:color="B7C9C0" w:sz="4" w:space="0"/>
@@ -17735,7 +17931,7 @@
         </w:tc>
         <w:tc>
           <w:tcPr>
-            <w:tcW w:w="3250" w:type="dxa"/>
+            <w:tcW w:w="4383" w:type="dxa"/>
             <w:tcBorders>
               <w:top w:val="single" w:color="B7C9C0" w:sz="4" w:space="0"/>
               <w:left w:val="single" w:color="B7C9C0" w:sz="4" w:space="0"/>
@@ -17821,7 +18017,7 @@
         </w:tc>
         <w:tc>
           <w:tcPr>
-            <w:tcW w:w="3248" w:type="dxa"/>
+            <w:tcW w:w="2115" w:type="dxa"/>
             <w:tcBorders>
               <w:top w:val="single" w:color="B7C9C0" w:sz="4" w:space="0"/>
               <w:left w:val="single" w:color="B7C9C0" w:sz="4" w:space="0"/>
@@ -17855,7 +18051,7 @@
         </w:tc>
         <w:tc>
           <w:tcPr>
-            <w:tcW w:w="3250" w:type="dxa"/>
+            <w:tcW w:w="4383" w:type="dxa"/>
             <w:tcBorders>
               <w:top w:val="single" w:color="B7C9C0" w:sz="4" w:space="0"/>
               <w:left w:val="single" w:color="B7C9C0" w:sz="4" w:space="0"/>
@@ -17941,7 +18137,7 @@
         </w:tc>
         <w:tc>
           <w:tcPr>
-            <w:tcW w:w="3248" w:type="dxa"/>
+            <w:tcW w:w="2115" w:type="dxa"/>
             <w:tcBorders>
               <w:top w:val="single" w:color="B7C9C0" w:sz="4" w:space="0"/>
               <w:left w:val="single" w:color="B7C9C0" w:sz="4" w:space="0"/>
@@ -17975,7 +18171,7 @@
         </w:tc>
         <w:tc>
           <w:tcPr>
-            <w:tcW w:w="3250" w:type="dxa"/>
+            <w:tcW w:w="4383" w:type="dxa"/>
             <w:tcBorders>
               <w:top w:val="single" w:color="B7C9C0" w:sz="4" w:space="0"/>
               <w:left w:val="single" w:color="B7C9C0" w:sz="4" w:space="0"/>
@@ -18220,7 +18416,7 @@
       <w:lvlText w:val="%1."/>
       <w:lvlJc w:val="left"/>
       <w:pPr>
-        <w:ind w:left="520" w:hanging="260"/>
+        <w:ind w:left="260" w:hanging="260"/>
       </w:pPr>
     </w:lvl>
   </w:abstractNum>
@@ -18279,7 +18475,7 @@
     <w:lsdException w:unhideWhenUsed="0" w:uiPriority="0" w:semiHidden="0" w:name="index 8"/>
     <w:lsdException w:unhideWhenUsed="0" w:uiPriority="0" w:semiHidden="0" w:name="index 9"/>
     <w:lsdException w:qFormat="1" w:unhideWhenUsed="0" w:uiPriority="0" w:semiHidden="0" w:name="toc 1"/>
-    <w:lsdException w:unhideWhenUsed="0" w:uiPriority="0" w:semiHidden="0" w:name="toc 2"/>
+    <w:lsdException w:qFormat="1" w:unhideWhenUsed="0" w:uiPriority="0" w:semiHidden="0" w:name="toc 2"/>
     <w:lsdException w:unhideWhenUsed="0" w:uiPriority="0" w:semiHidden="0" w:name="toc 3"/>
     <w:lsdException w:unhideWhenUsed="0" w:uiPriority="0" w:semiHidden="0" w:name="toc 4"/>
     <w:lsdException w:unhideWhenUsed="0" w:uiPriority="0" w:semiHidden="0" w:name="toc 5"/>
@@ -18288,7 +18484,7 @@
     <w:lsdException w:unhideWhenUsed="0" w:uiPriority="0" w:semiHidden="0" w:name="toc 8"/>
     <w:lsdException w:unhideWhenUsed="0" w:uiPriority="0" w:semiHidden="0" w:name="toc 9"/>
     <w:lsdException w:unhideWhenUsed="0" w:uiPriority="0" w:semiHidden="0" w:name="Normal Indent"/>
-    <w:lsdException w:uiPriority="99" w:name="footnote text"/>
+    <w:lsdException w:qFormat="1" w:uiPriority="99" w:name="footnote text"/>
     <w:lsdException w:unhideWhenUsed="0" w:uiPriority="0" w:semiHidden="0" w:name="annotation text"/>
     <w:lsdException w:unhideWhenUsed="0" w:uiPriority="0" w:semiHidden="0" w:name="header"/>
     <w:lsdException w:unhideWhenUsed="0" w:uiPriority="0" w:semiHidden="0" w:name="footer"/>
@@ -18674,6 +18870,7 @@
     <w:link w:val="19"/>
     <w:semiHidden/>
     <w:unhideWhenUsed/>
+    <w:qFormat/>
     <w:uiPriority w:val="99"/>
     <w:pPr>
       <w:spacing w:after="0" w:line="240" w:lineRule="auto"/>
@@ -18717,6 +18914,7 @@
     <w:name w:val="toc 2"/>
     <w:basedOn w:val="1"/>
     <w:next w:val="1"/>
+    <w:qFormat/>
     <w:uiPriority w:val="0"/>
     <w:pPr>
       <w:ind w:left="420" w:leftChars="200"/>

</xml_diff>

<commit_message>
docs(reference): add the company logo to the docx
Logo added to the document in WPS and saved from there, so the package was
repacked and the existing screenshots renumbered to image2-image6.

Verified before committing: all five screenshots are byte-identical to the
committed version, only the new logo (image1.png) was added, every section is
present including 4.3 and the D.3 parameter table, and no stale cover string
returned.
</commit_message>
<xml_diff>
--- a/docs/HAMS_PRODUCTION_REFERENCE.docx
+++ b/docs/HAMS_PRODUCTION_REFERENCE.docx
@@ -2,6 +2,73 @@
 <file path=word/document.xml><?xml version="1.0" encoding="utf-8"?>
 <w:document xmlns:wpc="http://schemas.microsoft.com/office/word/2010/wordprocessingCanvas" xmlns:cx="http://schemas.microsoft.com/office/drawing/2014/chartex" xmlns:cx1="http://schemas.microsoft.com/office/drawing/2015/9/8/chartex" xmlns:cx2="http://schemas.microsoft.com/office/drawing/2015/10/21/chartex" xmlns:cx3="http://schemas.microsoft.com/office/drawing/2016/5/9/chartex" xmlns:cx4="http://schemas.microsoft.com/office/drawing/2016/5/10/chartex" xmlns:cx5="http://schemas.microsoft.com/office/drawing/2016/5/11/chartex" xmlns:cx6="http://schemas.microsoft.com/office/drawing/2016/5/12/chartex" xmlns:cx7="http://schemas.microsoft.com/office/drawing/2016/5/13/chartex" xmlns:cx8="http://schemas.microsoft.com/office/drawing/2016/5/14/chartex" xmlns:mc="http://schemas.openxmlformats.org/markup-compatibility/2006" xmlns:o="urn:schemas-microsoft-com:office:office" xmlns:r="http://schemas.openxmlformats.org/officeDocument/2006/relationships" xmlns:m="http://schemas.openxmlformats.org/officeDocument/2006/math" xmlns:v="urn:schemas-microsoft-com:vml" xmlns:wp14="http://schemas.microsoft.com/office/word/2010/wordprocessingDrawing" xmlns:wp="http://schemas.openxmlformats.org/drawingml/2006/wordprocessingDrawing" xmlns:w="http://schemas.openxmlformats.org/wordprocessingml/2006/main" xmlns:w14="http://schemas.microsoft.com/office/word/2010/wordml" xmlns:w10="urn:schemas-microsoft-com:office:word" xmlns:w15="http://schemas.microsoft.com/office/word/2012/wordml" xmlns:wpg="http://schemas.microsoft.com/office/word/2010/wordprocessingGroup" xmlns:wpi="http://schemas.microsoft.com/office/word/2010/wordprocessingInk" xmlns:wne="http://schemas.microsoft.com/office/word/2006/wordml" xmlns:wps="http://schemas.microsoft.com/office/word/2010/wordprocessingShape" xmlns:wpsCustomData="http://www.wps.cn/officeDocument/2013/wpsCustomData" mc:Ignorable="w14 w15 wp14">
   <w:body>
+    <w:p>
+      <w:pPr>
+        <w:spacing w:before="2500" w:after="180"/>
+        <w:jc w:val="center"/>
+        <w:rPr>
+          <w:b/>
+          <w:bCs/>
+          <w:color w:val="1F4E3D"/>
+          <w:sz w:val="24"/>
+          <w:szCs w:val="24"/>
+        </w:rPr>
+      </w:pPr>
+      <w:r>
+        <w:rPr>
+          <w:b/>
+          <w:bCs/>
+          <w:color w:val="1F4E3D"/>
+          <w:sz w:val="24"/>
+          <w:szCs w:val="24"/>
+        </w:rPr>
+        <w:drawing>
+          <wp:anchor distT="0" distB="0" distL="114300" distR="114300" simplePos="0" relativeHeight="251659264" behindDoc="0" locked="0" layoutInCell="1" allowOverlap="1">
+            <wp:simplePos x="0" y="0"/>
+            <wp:positionH relativeFrom="column">
+              <wp:posOffset>1162685</wp:posOffset>
+            </wp:positionH>
+            <wp:positionV relativeFrom="paragraph">
+              <wp:posOffset>1368425</wp:posOffset>
+            </wp:positionV>
+            <wp:extent cx="3869055" cy="1980565"/>
+            <wp:effectExtent l="0" t="0" r="0" b="0"/>
+            <wp:wrapNone/>
+            <wp:docPr id="6" name="Picture 6" descr="KLK Coloured (RGB)"/>
+            <wp:cNvGraphicFramePr>
+              <a:graphicFrameLocks xmlns:a="http://schemas.openxmlformats.org/drawingml/2006/main" noChangeAspect="1"/>
+            </wp:cNvGraphicFramePr>
+            <a:graphic xmlns:a="http://schemas.openxmlformats.org/drawingml/2006/main">
+              <a:graphicData uri="http://schemas.openxmlformats.org/drawingml/2006/picture">
+                <pic:pic xmlns:pic="http://schemas.openxmlformats.org/drawingml/2006/picture">
+                  <pic:nvPicPr>
+                    <pic:cNvPr id="6" name="Picture 6" descr="KLK Coloured (RGB)"/>
+                    <pic:cNvPicPr>
+                      <a:picLocks noChangeAspect="1"/>
+                    </pic:cNvPicPr>
+                  </pic:nvPicPr>
+                  <pic:blipFill>
+                    <a:blip r:embed="rId6"/>
+                    <a:stretch>
+                      <a:fillRect/>
+                    </a:stretch>
+                  </pic:blipFill>
+                  <pic:spPr>
+                    <a:xfrm>
+                      <a:off x="0" y="0"/>
+                      <a:ext cx="3869055" cy="1980565"/>
+                    </a:xfrm>
+                    <a:prstGeom prst="rect">
+                      <a:avLst/>
+                    </a:prstGeom>
+                  </pic:spPr>
+                </pic:pic>
+              </a:graphicData>
+            </a:graphic>
+          </wp:anchor>
+        </w:drawing>
+      </w:r>
+    </w:p>
     <w:p>
       <w:pPr>
         <w:spacing w:before="2500" w:after="180"/>
@@ -1993,8 +2060,8 @@
       <w:pPr>
         <w:pStyle w:val="2"/>
       </w:pPr>
-      <w:bookmarkStart w:id="0" w:name="_Toc15468"/>
-      <w:bookmarkStart w:id="1" w:name="_Toc3111"/>
+      <w:bookmarkStart w:id="0" w:name="_Toc3111"/>
+      <w:bookmarkStart w:id="1" w:name="_Toc15468"/>
       <w:r>
         <w:t>1. Purpose and system scope</w:t>
       </w:r>
@@ -2486,8 +2553,8 @@
         <w:pStyle w:val="2"/>
         <w:pageBreakBefore/>
       </w:pPr>
-      <w:bookmarkStart w:id="2" w:name="_Toc15700"/>
-      <w:bookmarkStart w:id="3" w:name="_Toc5645"/>
+      <w:bookmarkStart w:id="2" w:name="_Toc5645"/>
+      <w:bookmarkStart w:id="3" w:name="_Toc15700"/>
       <w:r>
         <w:t>2. Device and application baseline</w:t>
       </w:r>
@@ -3246,8 +3313,8 @@
         <w:pStyle w:val="2"/>
         <w:pageBreakBefore/>
       </w:pPr>
-      <w:bookmarkStart w:id="4" w:name="_Toc13032"/>
-      <w:bookmarkStart w:id="5" w:name="_Toc8237"/>
+      <w:bookmarkStart w:id="4" w:name="_Toc8237"/>
+      <w:bookmarkStart w:id="5" w:name="_Toc13032"/>
       <w:r>
         <w:t>3. App user interface and field use</w:t>
       </w:r>
@@ -3847,7 +3914,7 @@
                     </pic:cNvPicPr>
                   </pic:nvPicPr>
                   <pic:blipFill>
-                    <a:blip r:embed="rId6"/>
+                    <a:blip r:embed="rId7"/>
                     <a:srcRect l="49" r="49"/>
                     <a:stretch>
                       <a:fillRect/>
@@ -3893,57 +3960,6 @@
                 <pic:pic xmlns:pic="http://schemas.openxmlformats.org/drawingml/2006/picture">
                   <pic:nvPicPr>
                     <pic:cNvPr id="2" name="Picture 2" descr="C:/Users/User/Downloads/WhatsApp Image 2026-08-21 at 09.46.07.jpegWhatsApp Image 2026-08-21 at 09.46.07"/>
-                    <pic:cNvPicPr>
-                      <a:picLocks noChangeAspect="1"/>
-                    </pic:cNvPicPr>
-                  </pic:nvPicPr>
-                  <pic:blipFill>
-                    <a:blip r:embed="rId7"/>
-                    <a:srcRect l="61" r="61"/>
-                    <a:stretch>
-                      <a:fillRect/>
-                    </a:stretch>
-                  </pic:blipFill>
-                  <pic:spPr>
-                    <a:xfrm>
-                      <a:off x="0" y="0"/>
-                      <a:ext cx="1176655" cy="2604135"/>
-                    </a:xfrm>
-                    <a:prstGeom prst="rect">
-                      <a:avLst/>
-                    </a:prstGeom>
-                  </pic:spPr>
-                </pic:pic>
-              </a:graphicData>
-            </a:graphic>
-          </wp:inline>
-        </w:drawing>
-      </w:r>
-      <w:r>
-        <w:rPr>
-          <w:rFonts w:hint="default"/>
-          <w:lang w:val="en-MY"/>
-        </w:rPr>
-        <w:t xml:space="preserve"> </w:t>
-      </w:r>
-      <w:r>
-        <w:rPr>
-          <w:rFonts w:hint="default"/>
-          <w:lang w:val="en-MY"/>
-        </w:rPr>
-        <w:drawing>
-          <wp:inline distT="0" distB="0" distL="114300" distR="114300">
-            <wp:extent cx="1176655" cy="2604135"/>
-            <wp:effectExtent l="0" t="0" r="12065" b="1905"/>
-            <wp:docPr id="3" name="Picture 3" descr="D:/HAMS_company_solution/docs/image_guideline/app/app-03-admin-sheet.jpegapp-03-admin-sheet"/>
-            <wp:cNvGraphicFramePr>
-              <a:graphicFrameLocks xmlns:a="http://schemas.openxmlformats.org/drawingml/2006/main" noChangeAspect="1"/>
-            </wp:cNvGraphicFramePr>
-            <a:graphic xmlns:a="http://schemas.openxmlformats.org/drawingml/2006/main">
-              <a:graphicData uri="http://schemas.openxmlformats.org/drawingml/2006/picture">
-                <pic:pic xmlns:pic="http://schemas.openxmlformats.org/drawingml/2006/picture">
-                  <pic:nvPicPr>
-                    <pic:cNvPr id="3" name="Picture 3" descr="D:/HAMS_company_solution/docs/image_guideline/app/app-03-admin-sheet.jpegapp-03-admin-sheet"/>
                     <pic:cNvPicPr>
                       <a:picLocks noChangeAspect="1"/>
                     </pic:cNvPicPr>
@@ -3986,7 +4002,7 @@
           <wp:inline distT="0" distB="0" distL="114300" distR="114300">
             <wp:extent cx="1176655" cy="2604135"/>
             <wp:effectExtent l="0" t="0" r="12065" b="1905"/>
-            <wp:docPr id="5" name="Picture 5" descr="D:/HAMS_company_solution/docs/image_guideline/app/app-04-supervisor-code.jpegapp-04-supervisor-code"/>
+            <wp:docPr id="3" name="Picture 3" descr="D:/HAMS_company_solution/docs/image_guideline/app/app-03-admin-sheet.jpegapp-03-admin-sheet"/>
             <wp:cNvGraphicFramePr>
               <a:graphicFrameLocks xmlns:a="http://schemas.openxmlformats.org/drawingml/2006/main" noChangeAspect="1"/>
             </wp:cNvGraphicFramePr>
@@ -3994,7 +4010,7 @@
               <a:graphicData uri="http://schemas.openxmlformats.org/drawingml/2006/picture">
                 <pic:pic xmlns:pic="http://schemas.openxmlformats.org/drawingml/2006/picture">
                   <pic:nvPicPr>
-                    <pic:cNvPr id="5" name="Picture 5" descr="D:/HAMS_company_solution/docs/image_guideline/app/app-04-supervisor-code.jpegapp-04-supervisor-code"/>
+                    <pic:cNvPr id="3" name="Picture 3" descr="D:/HAMS_company_solution/docs/image_guideline/app/app-03-admin-sheet.jpegapp-03-admin-sheet"/>
                     <pic:cNvPicPr>
                       <a:picLocks noChangeAspect="1"/>
                     </pic:cNvPicPr>
@@ -4037,7 +4053,7 @@
           <wp:inline distT="0" distB="0" distL="114300" distR="114300">
             <wp:extent cx="1176655" cy="2604135"/>
             <wp:effectExtent l="0" t="0" r="12065" b="1905"/>
-            <wp:docPr id="4" name="Picture 4" descr="D:/HAMS_company_solution/docs/image_guideline/app/app-05-notifications.jpegapp-05-notifications"/>
+            <wp:docPr id="5" name="Picture 5" descr="D:/HAMS_company_solution/docs/image_guideline/app/app-04-supervisor-code.jpegapp-04-supervisor-code"/>
             <wp:cNvGraphicFramePr>
               <a:graphicFrameLocks xmlns:a="http://schemas.openxmlformats.org/drawingml/2006/main" noChangeAspect="1"/>
             </wp:cNvGraphicFramePr>
@@ -4045,7 +4061,7 @@
               <a:graphicData uri="http://schemas.openxmlformats.org/drawingml/2006/picture">
                 <pic:pic xmlns:pic="http://schemas.openxmlformats.org/drawingml/2006/picture">
                   <pic:nvPicPr>
-                    <pic:cNvPr id="4" name="Picture 4" descr="D:/HAMS_company_solution/docs/image_guideline/app/app-05-notifications.jpegapp-05-notifications"/>
+                    <pic:cNvPr id="5" name="Picture 5" descr="D:/HAMS_company_solution/docs/image_guideline/app/app-04-supervisor-code.jpegapp-04-supervisor-code"/>
                     <pic:cNvPicPr>
                       <a:picLocks noChangeAspect="1"/>
                     </pic:cNvPicPr>
@@ -4079,6 +4095,57 @@
         </w:rPr>
         <w:t xml:space="preserve"> </w:t>
       </w:r>
+      <w:r>
+        <w:rPr>
+          <w:rFonts w:hint="default"/>
+          <w:lang w:val="en-MY"/>
+        </w:rPr>
+        <w:drawing>
+          <wp:inline distT="0" distB="0" distL="114300" distR="114300">
+            <wp:extent cx="1176655" cy="2604135"/>
+            <wp:effectExtent l="0" t="0" r="12065" b="1905"/>
+            <wp:docPr id="4" name="Picture 4" descr="D:/HAMS_company_solution/docs/image_guideline/app/app-05-notifications.jpegapp-05-notifications"/>
+            <wp:cNvGraphicFramePr>
+              <a:graphicFrameLocks xmlns:a="http://schemas.openxmlformats.org/drawingml/2006/main" noChangeAspect="1"/>
+            </wp:cNvGraphicFramePr>
+            <a:graphic xmlns:a="http://schemas.openxmlformats.org/drawingml/2006/main">
+              <a:graphicData uri="http://schemas.openxmlformats.org/drawingml/2006/picture">
+                <pic:pic xmlns:pic="http://schemas.openxmlformats.org/drawingml/2006/picture">
+                  <pic:nvPicPr>
+                    <pic:cNvPr id="4" name="Picture 4" descr="D:/HAMS_company_solution/docs/image_guideline/app/app-05-notifications.jpegapp-05-notifications"/>
+                    <pic:cNvPicPr>
+                      <a:picLocks noChangeAspect="1"/>
+                    </pic:cNvPicPr>
+                  </pic:nvPicPr>
+                  <pic:blipFill>
+                    <a:blip r:embed="rId11"/>
+                    <a:srcRect l="61" r="61"/>
+                    <a:stretch>
+                      <a:fillRect/>
+                    </a:stretch>
+                  </pic:blipFill>
+                  <pic:spPr>
+                    <a:xfrm>
+                      <a:off x="0" y="0"/>
+                      <a:ext cx="1176655" cy="2604135"/>
+                    </a:xfrm>
+                    <a:prstGeom prst="rect">
+                      <a:avLst/>
+                    </a:prstGeom>
+                  </pic:spPr>
+                </pic:pic>
+              </a:graphicData>
+            </a:graphic>
+          </wp:inline>
+        </w:drawing>
+      </w:r>
+      <w:r>
+        <w:rPr>
+          <w:rFonts w:hint="default"/>
+          <w:lang w:val="en-MY"/>
+        </w:rPr>
+        <w:t xml:space="preserve"> </w:t>
+      </w:r>
     </w:p>
     <w:p>
       <w:pPr>
@@ -4097,8 +4164,8 @@
       <w:pPr>
         <w:pStyle w:val="3"/>
       </w:pPr>
-      <w:bookmarkStart w:id="8" w:name="_Toc16534"/>
-      <w:bookmarkStart w:id="9" w:name="_Toc8007"/>
+      <w:bookmarkStart w:id="8" w:name="_Toc8007"/>
+      <w:bookmarkStart w:id="9" w:name="_Toc16534"/>
       <w:r>
         <w:t>3.2 Daily use</w:t>
       </w:r>
@@ -4193,6 +4260,7 @@
       <w:pPr>
         <w:pStyle w:val="18"/>
         <w:numPr>
+          <w:ilvl w:val="0"/>
           <w:numId w:val="0"/>
         </w:numPr>
         <w:spacing w:after="50"/>
@@ -5838,8 +5906,8 @@
       <w:pPr>
         <w:pStyle w:val="3"/>
       </w:pPr>
-      <w:bookmarkStart w:id="14" w:name="_Toc15323"/>
-      <w:bookmarkStart w:id="15" w:name="_Toc665"/>
+      <w:bookmarkStart w:id="14" w:name="_Toc665"/>
+      <w:bookmarkStart w:id="15" w:name="_Toc15323"/>
       <w:r>
         <w:t>4.2 Release and replacement</w:t>
       </w:r>
@@ -7946,8 +8014,8 @@
       <w:pPr>
         <w:pStyle w:val="3"/>
       </w:pPr>
-      <w:bookmarkStart w:id="20" w:name="_Toc15271"/>
-      <w:bookmarkStart w:id="21" w:name="_Toc4426"/>
+      <w:bookmarkStart w:id="20" w:name="_Toc4426"/>
+      <w:bookmarkStart w:id="21" w:name="_Toc15271"/>
       <w:r>
         <w:t>5.1 Local mobile database</w:t>
       </w:r>
@@ -8412,6 +8480,8 @@
       </w:r>
       <w:bookmarkEnd w:id="24"/>
       <w:bookmarkEnd w:id="25"/>
+      <w:bookmarkStart w:id="50" w:name="_GoBack"/>
+      <w:bookmarkEnd w:id="50"/>
     </w:p>
     <w:p>
       <w:pPr>
@@ -9534,8 +9604,8 @@
         <w:pStyle w:val="2"/>
         <w:pageBreakBefore/>
       </w:pPr>
-      <w:bookmarkStart w:id="26" w:name="_Toc22732"/>
-      <w:bookmarkStart w:id="27" w:name="_Toc27990"/>
+      <w:bookmarkStart w:id="26" w:name="_Toc27990"/>
+      <w:bookmarkStart w:id="27" w:name="_Toc22732"/>
       <w:r>
         <w:t>6. Credentials, support, and change control</w:t>
       </w:r>
@@ -9546,8 +9616,8 @@
       <w:pPr>
         <w:pStyle w:val="3"/>
       </w:pPr>
-      <w:bookmarkStart w:id="28" w:name="_Toc7319"/>
-      <w:bookmarkStart w:id="29" w:name="_Toc941"/>
+      <w:bookmarkStart w:id="28" w:name="_Toc941"/>
+      <w:bookmarkStart w:id="29" w:name="_Toc7319"/>
       <w:r>
         <w:t>6.1 Sensitive data and credentials register</w:t>
       </w:r>
@@ -10374,8 +10444,8 @@
       <w:pPr>
         <w:pStyle w:val="3"/>
       </w:pPr>
-      <w:bookmarkStart w:id="30" w:name="_Toc6119"/>
-      <w:bookmarkStart w:id="31" w:name="_Toc31370"/>
+      <w:bookmarkStart w:id="30" w:name="_Toc31370"/>
+      <w:bookmarkStart w:id="31" w:name="_Toc6119"/>
       <w:r>
         <w:t>6.2 Support record</w:t>
       </w:r>
@@ -10401,8 +10471,6 @@
       <w:pPr>
         <w:pStyle w:val="3"/>
       </w:pPr>
-      <w:bookmarkStart w:id="50" w:name="_GoBack"/>
-      <w:bookmarkEnd w:id="50"/>
       <w:r>
         <w:t>6.3 Controlled changes</w:t>
       </w:r>
@@ -11027,8 +11095,8 @@
         </w:tblCellMar>
       </w:tblPr>
       <w:tblGrid>
-        <w:gridCol w:w="4873"/>
-        <w:gridCol w:w="4873"/>
+        <w:gridCol w:w="2568"/>
+        <w:gridCol w:w="7178"/>
       </w:tblGrid>
       <w:tr>
         <w:tblPrEx>
@@ -11052,7 +11120,7 @@
         </w:trPr>
         <w:tc>
           <w:tcPr>
-            <w:tcW w:w="4873" w:type="dxa"/>
+            <w:tcW w:w="2568" w:type="dxa"/>
             <w:tcBorders>
               <w:top w:val="single" w:color="B7C9C0" w:sz="4" w:space="0"/>
               <w:left w:val="single" w:color="B7C9C0" w:sz="4" w:space="0"/>
@@ -11086,7 +11154,7 @@
         </w:tc>
         <w:tc>
           <w:tcPr>
-            <w:tcW w:w="4873" w:type="dxa"/>
+            <w:tcW w:w="7178" w:type="dxa"/>
             <w:tcBorders>
               <w:top w:val="single" w:color="B7C9C0" w:sz="4" w:space="0"/>
               <w:left w:val="single" w:color="B7C9C0" w:sz="4" w:space="0"/>
@@ -11138,7 +11206,7 @@
         </w:tblPrEx>
         <w:tc>
           <w:tcPr>
-            <w:tcW w:w="4873" w:type="dxa"/>
+            <w:tcW w:w="2568" w:type="dxa"/>
             <w:tcBorders>
               <w:top w:val="single" w:color="B7C9C0" w:sz="4" w:space="0"/>
               <w:left w:val="single" w:color="B7C9C0" w:sz="4" w:space="0"/>
@@ -11172,7 +11240,7 @@
         </w:tc>
         <w:tc>
           <w:tcPr>
-            <w:tcW w:w="4873" w:type="dxa"/>
+            <w:tcW w:w="7178" w:type="dxa"/>
             <w:tcBorders>
               <w:top w:val="single" w:color="B7C9C0" w:sz="4" w:space="0"/>
               <w:left w:val="single" w:color="B7C9C0" w:sz="4" w:space="0"/>
@@ -11224,7 +11292,7 @@
         </w:tblPrEx>
         <w:tc>
           <w:tcPr>
-            <w:tcW w:w="4873" w:type="dxa"/>
+            <w:tcW w:w="2568" w:type="dxa"/>
             <w:tcBorders>
               <w:top w:val="single" w:color="B7C9C0" w:sz="4" w:space="0"/>
               <w:left w:val="single" w:color="B7C9C0" w:sz="4" w:space="0"/>
@@ -11258,7 +11326,7 @@
         </w:tc>
         <w:tc>
           <w:tcPr>
-            <w:tcW w:w="4873" w:type="dxa"/>
+            <w:tcW w:w="7178" w:type="dxa"/>
             <w:tcBorders>
               <w:top w:val="single" w:color="B7C9C0" w:sz="4" w:space="0"/>
               <w:left w:val="single" w:color="B7C9C0" w:sz="4" w:space="0"/>
@@ -11310,7 +11378,7 @@
         </w:tblPrEx>
         <w:tc>
           <w:tcPr>
-            <w:tcW w:w="4873" w:type="dxa"/>
+            <w:tcW w:w="2568" w:type="dxa"/>
             <w:tcBorders>
               <w:top w:val="single" w:color="B7C9C0" w:sz="4" w:space="0"/>
               <w:left w:val="single" w:color="B7C9C0" w:sz="4" w:space="0"/>
@@ -11344,7 +11412,7 @@
         </w:tc>
         <w:tc>
           <w:tcPr>
-            <w:tcW w:w="4873" w:type="dxa"/>
+            <w:tcW w:w="7178" w:type="dxa"/>
             <w:tcBorders>
               <w:top w:val="single" w:color="B7C9C0" w:sz="4" w:space="0"/>
               <w:left w:val="single" w:color="B7C9C0" w:sz="4" w:space="0"/>
@@ -11396,7 +11464,7 @@
         </w:tblPrEx>
         <w:tc>
           <w:tcPr>
-            <w:tcW w:w="4873" w:type="dxa"/>
+            <w:tcW w:w="2568" w:type="dxa"/>
             <w:tcBorders>
               <w:top w:val="single" w:color="B7C9C0" w:sz="4" w:space="0"/>
               <w:left w:val="single" w:color="B7C9C0" w:sz="4" w:space="0"/>
@@ -11430,7 +11498,7 @@
         </w:tc>
         <w:tc>
           <w:tcPr>
-            <w:tcW w:w="4873" w:type="dxa"/>
+            <w:tcW w:w="7178" w:type="dxa"/>
             <w:tcBorders>
               <w:top w:val="single" w:color="B7C9C0" w:sz="4" w:space="0"/>
               <w:left w:val="single" w:color="B7C9C0" w:sz="4" w:space="0"/>
@@ -11482,7 +11550,7 @@
         </w:tblPrEx>
         <w:tc>
           <w:tcPr>
-            <w:tcW w:w="4873" w:type="dxa"/>
+            <w:tcW w:w="2568" w:type="dxa"/>
             <w:tcBorders>
               <w:top w:val="single" w:color="B7C9C0" w:sz="4" w:space="0"/>
               <w:left w:val="single" w:color="B7C9C0" w:sz="4" w:space="0"/>
@@ -11516,7 +11584,7 @@
         </w:tc>
         <w:tc>
           <w:tcPr>
-            <w:tcW w:w="4873" w:type="dxa"/>
+            <w:tcW w:w="7178" w:type="dxa"/>
             <w:tcBorders>
               <w:top w:val="single" w:color="B7C9C0" w:sz="4" w:space="0"/>
               <w:left w:val="single" w:color="B7C9C0" w:sz="4" w:space="0"/>
@@ -11568,7 +11636,7 @@
         </w:tblPrEx>
         <w:tc>
           <w:tcPr>
-            <w:tcW w:w="4873" w:type="dxa"/>
+            <w:tcW w:w="2568" w:type="dxa"/>
             <w:tcBorders>
               <w:top w:val="single" w:color="B7C9C0" w:sz="4" w:space="0"/>
               <w:left w:val="single" w:color="B7C9C0" w:sz="4" w:space="0"/>
@@ -11602,7 +11670,7 @@
         </w:tc>
         <w:tc>
           <w:tcPr>
-            <w:tcW w:w="4873" w:type="dxa"/>
+            <w:tcW w:w="7178" w:type="dxa"/>
             <w:tcBorders>
               <w:top w:val="single" w:color="B7C9C0" w:sz="4" w:space="0"/>
               <w:left w:val="single" w:color="B7C9C0" w:sz="4" w:space="0"/>
@@ -11654,7 +11722,7 @@
         </w:tblPrEx>
         <w:tc>
           <w:tcPr>
-            <w:tcW w:w="4873" w:type="dxa"/>
+            <w:tcW w:w="2568" w:type="dxa"/>
             <w:tcBorders>
               <w:top w:val="single" w:color="B7C9C0" w:sz="4" w:space="0"/>
               <w:left w:val="single" w:color="B7C9C0" w:sz="4" w:space="0"/>
@@ -11688,7 +11756,7 @@
         </w:tc>
         <w:tc>
           <w:tcPr>
-            <w:tcW w:w="4873" w:type="dxa"/>
+            <w:tcW w:w="7178" w:type="dxa"/>
             <w:tcBorders>
               <w:top w:val="single" w:color="B7C9C0" w:sz="4" w:space="0"/>
               <w:left w:val="single" w:color="B7C9C0" w:sz="4" w:space="0"/>
@@ -11740,7 +11808,7 @@
         </w:tblPrEx>
         <w:tc>
           <w:tcPr>
-            <w:tcW w:w="4873" w:type="dxa"/>
+            <w:tcW w:w="2568" w:type="dxa"/>
             <w:tcBorders>
               <w:top w:val="single" w:color="B7C9C0" w:sz="4" w:space="0"/>
               <w:left w:val="single" w:color="B7C9C0" w:sz="4" w:space="0"/>
@@ -11774,7 +11842,7 @@
         </w:tc>
         <w:tc>
           <w:tcPr>
-            <w:tcW w:w="4873" w:type="dxa"/>
+            <w:tcW w:w="7178" w:type="dxa"/>
             <w:tcBorders>
               <w:top w:val="single" w:color="B7C9C0" w:sz="4" w:space="0"/>
               <w:left w:val="single" w:color="B7C9C0" w:sz="4" w:space="0"/>
@@ -11818,8 +11886,8 @@
         <w:pStyle w:val="2"/>
         <w:pageBreakBefore/>
       </w:pPr>
-      <w:bookmarkStart w:id="38" w:name="_Toc15222"/>
-      <w:bookmarkStart w:id="39" w:name="_Toc561"/>
+      <w:bookmarkStart w:id="38" w:name="_Toc561"/>
+      <w:bookmarkStart w:id="39" w:name="_Toc15222"/>
       <w:r>
         <w:t>Appendix C. APK internal/local codes</w:t>
       </w:r>
@@ -12466,8 +12534,8 @@
         <w:pStyle w:val="2"/>
         <w:pageBreakBefore/>
       </w:pPr>
-      <w:bookmarkStart w:id="40" w:name="_Toc15828"/>
-      <w:bookmarkStart w:id="41" w:name="_Toc15224"/>
+      <w:bookmarkStart w:id="40" w:name="_Toc15224"/>
+      <w:bookmarkStart w:id="41" w:name="_Toc15828"/>
       <w:r>
         <w:t>Appendix D. PostgreSQL Data Dictionary</w:t>
       </w:r>
@@ -12504,8 +12572,8 @@
         </w:tblCellMar>
       </w:tblPr>
       <w:tblGrid>
-        <w:gridCol w:w="4873"/>
-        <w:gridCol w:w="4873"/>
+        <w:gridCol w:w="3648"/>
+        <w:gridCol w:w="6098"/>
       </w:tblGrid>
       <w:tr>
         <w:tblPrEx>
@@ -12529,7 +12597,7 @@
         </w:trPr>
         <w:tc>
           <w:tcPr>
-            <w:tcW w:w="4873" w:type="dxa"/>
+            <w:tcW w:w="3648" w:type="dxa"/>
             <w:tcBorders>
               <w:top w:val="single" w:color="B7C9C0" w:sz="4" w:space="0"/>
               <w:left w:val="single" w:color="B7C9C0" w:sz="4" w:space="0"/>
@@ -12563,7 +12631,7 @@
         </w:tc>
         <w:tc>
           <w:tcPr>
-            <w:tcW w:w="4873" w:type="dxa"/>
+            <w:tcW w:w="6098" w:type="dxa"/>
             <w:tcBorders>
               <w:top w:val="single" w:color="B7C9C0" w:sz="4" w:space="0"/>
               <w:left w:val="single" w:color="B7C9C0" w:sz="4" w:space="0"/>
@@ -12615,7 +12683,7 @@
         </w:tblPrEx>
         <w:tc>
           <w:tcPr>
-            <w:tcW w:w="4873" w:type="dxa"/>
+            <w:tcW w:w="3648" w:type="dxa"/>
             <w:tcBorders>
               <w:top w:val="single" w:color="B7C9C0" w:sz="4" w:space="0"/>
               <w:left w:val="single" w:color="B7C9C0" w:sz="4" w:space="0"/>
@@ -12649,7 +12717,7 @@
         </w:tc>
         <w:tc>
           <w:tcPr>
-            <w:tcW w:w="4873" w:type="dxa"/>
+            <w:tcW w:w="6098" w:type="dxa"/>
             <w:tcBorders>
               <w:top w:val="single" w:color="B7C9C0" w:sz="4" w:space="0"/>
               <w:left w:val="single" w:color="B7C9C0" w:sz="4" w:space="0"/>
@@ -12701,7 +12769,7 @@
         </w:tblPrEx>
         <w:tc>
           <w:tcPr>
-            <w:tcW w:w="4873" w:type="dxa"/>
+            <w:tcW w:w="3648" w:type="dxa"/>
             <w:tcBorders>
               <w:top w:val="single" w:color="B7C9C0" w:sz="4" w:space="0"/>
               <w:left w:val="single" w:color="B7C9C0" w:sz="4" w:space="0"/>
@@ -12735,7 +12803,7 @@
         </w:tc>
         <w:tc>
           <w:tcPr>
-            <w:tcW w:w="4873" w:type="dxa"/>
+            <w:tcW w:w="6098" w:type="dxa"/>
             <w:tcBorders>
               <w:top w:val="single" w:color="B7C9C0" w:sz="4" w:space="0"/>
               <w:left w:val="single" w:color="B7C9C0" w:sz="4" w:space="0"/>
@@ -12787,7 +12855,7 @@
         </w:tblPrEx>
         <w:tc>
           <w:tcPr>
-            <w:tcW w:w="4873" w:type="dxa"/>
+            <w:tcW w:w="3648" w:type="dxa"/>
             <w:tcBorders>
               <w:top w:val="single" w:color="B7C9C0" w:sz="4" w:space="0"/>
               <w:left w:val="single" w:color="B7C9C0" w:sz="4" w:space="0"/>
@@ -12821,7 +12889,7 @@
         </w:tc>
         <w:tc>
           <w:tcPr>
-            <w:tcW w:w="4873" w:type="dxa"/>
+            <w:tcW w:w="6098" w:type="dxa"/>
             <w:tcBorders>
               <w:top w:val="single" w:color="B7C9C0" w:sz="4" w:space="0"/>
               <w:left w:val="single" w:color="B7C9C0" w:sz="4" w:space="0"/>
@@ -12873,7 +12941,7 @@
         </w:tblPrEx>
         <w:tc>
           <w:tcPr>
-            <w:tcW w:w="4873" w:type="dxa"/>
+            <w:tcW w:w="3648" w:type="dxa"/>
             <w:tcBorders>
               <w:top w:val="single" w:color="B7C9C0" w:sz="4" w:space="0"/>
               <w:left w:val="single" w:color="B7C9C0" w:sz="4" w:space="0"/>
@@ -12907,7 +12975,7 @@
         </w:tc>
         <w:tc>
           <w:tcPr>
-            <w:tcW w:w="4873" w:type="dxa"/>
+            <w:tcW w:w="6098" w:type="dxa"/>
             <w:tcBorders>
               <w:top w:val="single" w:color="B7C9C0" w:sz="4" w:space="0"/>
               <w:left w:val="single" w:color="B7C9C0" w:sz="4" w:space="0"/>
@@ -12959,7 +13027,7 @@
         </w:tblPrEx>
         <w:tc>
           <w:tcPr>
-            <w:tcW w:w="4873" w:type="dxa"/>
+            <w:tcW w:w="3648" w:type="dxa"/>
             <w:tcBorders>
               <w:top w:val="single" w:color="B7C9C0" w:sz="4" w:space="0"/>
               <w:left w:val="single" w:color="B7C9C0" w:sz="4" w:space="0"/>
@@ -12993,7 +13061,7 @@
         </w:tc>
         <w:tc>
           <w:tcPr>
-            <w:tcW w:w="4873" w:type="dxa"/>
+            <w:tcW w:w="6098" w:type="dxa"/>
             <w:tcBorders>
               <w:top w:val="single" w:color="B7C9C0" w:sz="4" w:space="0"/>
               <w:left w:val="single" w:color="B7C9C0" w:sz="4" w:space="0"/>
@@ -14962,10 +15030,10 @@
         </w:tblCellMar>
       </w:tblPr>
       <w:tblGrid>
-        <w:gridCol w:w="2436"/>
-        <w:gridCol w:w="1831"/>
-        <w:gridCol w:w="1717"/>
-        <w:gridCol w:w="3762"/>
+        <w:gridCol w:w="1608"/>
+        <w:gridCol w:w="1899"/>
+        <w:gridCol w:w="1691"/>
+        <w:gridCol w:w="4548"/>
       </w:tblGrid>
       <w:tr>
         <w:tblPrEx>
@@ -14989,7 +15057,7 @@
         </w:trPr>
         <w:tc>
           <w:tcPr>
-            <w:tcW w:w="2436" w:type="dxa"/>
+            <w:tcW w:w="1608" w:type="dxa"/>
             <w:tcBorders>
               <w:top w:val="single" w:color="B7C9C0" w:sz="4" w:space="0"/>
               <w:left w:val="single" w:color="B7C9C0" w:sz="4" w:space="0"/>
@@ -15023,7 +15091,7 @@
         </w:tc>
         <w:tc>
           <w:tcPr>
-            <w:tcW w:w="1831" w:type="dxa"/>
+            <w:tcW w:w="1899" w:type="dxa"/>
             <w:tcBorders>
               <w:top w:val="single" w:color="B7C9C0" w:sz="4" w:space="0"/>
               <w:left w:val="single" w:color="B7C9C0" w:sz="4" w:space="0"/>
@@ -15057,7 +15125,7 @@
         </w:tc>
         <w:tc>
           <w:tcPr>
-            <w:tcW w:w="1717" w:type="dxa"/>
+            <w:tcW w:w="1691" w:type="dxa"/>
             <w:tcBorders>
               <w:top w:val="single" w:color="B7C9C0" w:sz="4" w:space="0"/>
               <w:left w:val="single" w:color="B7C9C0" w:sz="4" w:space="0"/>
@@ -15091,7 +15159,7 @@
         </w:tc>
         <w:tc>
           <w:tcPr>
-            <w:tcW w:w="3762" w:type="dxa"/>
+            <w:tcW w:w="4548" w:type="dxa"/>
             <w:tcBorders>
               <w:top w:val="single" w:color="B7C9C0" w:sz="4" w:space="0"/>
               <w:left w:val="single" w:color="B7C9C0" w:sz="4" w:space="0"/>
@@ -15143,7 +15211,7 @@
         </w:tblPrEx>
         <w:tc>
           <w:tcPr>
-            <w:tcW w:w="2436" w:type="dxa"/>
+            <w:tcW w:w="1608" w:type="dxa"/>
             <w:tcBorders>
               <w:top w:val="single" w:color="B7C9C0" w:sz="4" w:space="0"/>
               <w:left w:val="single" w:color="B7C9C0" w:sz="4" w:space="0"/>
@@ -15177,7 +15245,7 @@
         </w:tc>
         <w:tc>
           <w:tcPr>
-            <w:tcW w:w="1831" w:type="dxa"/>
+            <w:tcW w:w="1899" w:type="dxa"/>
             <w:tcBorders>
               <w:top w:val="single" w:color="B7C9C0" w:sz="4" w:space="0"/>
               <w:left w:val="single" w:color="B7C9C0" w:sz="4" w:space="0"/>
@@ -15211,7 +15279,7 @@
         </w:tc>
         <w:tc>
           <w:tcPr>
-            <w:tcW w:w="1717" w:type="dxa"/>
+            <w:tcW w:w="1691" w:type="dxa"/>
             <w:tcBorders>
               <w:top w:val="single" w:color="B7C9C0" w:sz="4" w:space="0"/>
               <w:left w:val="single" w:color="B7C9C0" w:sz="4" w:space="0"/>
@@ -15245,7 +15313,7 @@
         </w:tc>
         <w:tc>
           <w:tcPr>
-            <w:tcW w:w="3762" w:type="dxa"/>
+            <w:tcW w:w="4548" w:type="dxa"/>
             <w:tcBorders>
               <w:top w:val="single" w:color="B7C9C0" w:sz="4" w:space="0"/>
               <w:left w:val="single" w:color="B7C9C0" w:sz="4" w:space="0"/>
@@ -15297,7 +15365,7 @@
         </w:tblPrEx>
         <w:tc>
           <w:tcPr>
-            <w:tcW w:w="2436" w:type="dxa"/>
+            <w:tcW w:w="1608" w:type="dxa"/>
             <w:tcBorders>
               <w:top w:val="single" w:color="B7C9C0" w:sz="4" w:space="0"/>
               <w:left w:val="single" w:color="B7C9C0" w:sz="4" w:space="0"/>
@@ -15331,7 +15399,7 @@
         </w:tc>
         <w:tc>
           <w:tcPr>
-            <w:tcW w:w="1831" w:type="dxa"/>
+            <w:tcW w:w="1899" w:type="dxa"/>
             <w:tcBorders>
               <w:top w:val="single" w:color="B7C9C0" w:sz="4" w:space="0"/>
               <w:left w:val="single" w:color="B7C9C0" w:sz="4" w:space="0"/>
@@ -15365,7 +15433,7 @@
         </w:tc>
         <w:tc>
           <w:tcPr>
-            <w:tcW w:w="1717" w:type="dxa"/>
+            <w:tcW w:w="1691" w:type="dxa"/>
             <w:tcBorders>
               <w:top w:val="single" w:color="B7C9C0" w:sz="4" w:space="0"/>
               <w:left w:val="single" w:color="B7C9C0" w:sz="4" w:space="0"/>
@@ -15399,7 +15467,7 @@
         </w:tc>
         <w:tc>
           <w:tcPr>
-            <w:tcW w:w="3762" w:type="dxa"/>
+            <w:tcW w:w="4548" w:type="dxa"/>
             <w:tcBorders>
               <w:top w:val="single" w:color="B7C9C0" w:sz="4" w:space="0"/>
               <w:left w:val="single" w:color="B7C9C0" w:sz="4" w:space="0"/>
@@ -15451,7 +15519,7 @@
         </w:tblPrEx>
         <w:tc>
           <w:tcPr>
-            <w:tcW w:w="2436" w:type="dxa"/>
+            <w:tcW w:w="1608" w:type="dxa"/>
             <w:tcBorders>
               <w:top w:val="single" w:color="B7C9C0" w:sz="4" w:space="0"/>
               <w:left w:val="single" w:color="B7C9C0" w:sz="4" w:space="0"/>
@@ -15485,7 +15553,7 @@
         </w:tc>
         <w:tc>
           <w:tcPr>
-            <w:tcW w:w="1831" w:type="dxa"/>
+            <w:tcW w:w="1899" w:type="dxa"/>
             <w:tcBorders>
               <w:top w:val="single" w:color="B7C9C0" w:sz="4" w:space="0"/>
               <w:left w:val="single" w:color="B7C9C0" w:sz="4" w:space="0"/>
@@ -15519,7 +15587,7 @@
         </w:tc>
         <w:tc>
           <w:tcPr>
-            <w:tcW w:w="1717" w:type="dxa"/>
+            <w:tcW w:w="1691" w:type="dxa"/>
             <w:tcBorders>
               <w:top w:val="single" w:color="B7C9C0" w:sz="4" w:space="0"/>
               <w:left w:val="single" w:color="B7C9C0" w:sz="4" w:space="0"/>
@@ -15553,7 +15621,7 @@
         </w:tc>
         <w:tc>
           <w:tcPr>
-            <w:tcW w:w="3762" w:type="dxa"/>
+            <w:tcW w:w="4548" w:type="dxa"/>
             <w:tcBorders>
               <w:top w:val="single" w:color="B7C9C0" w:sz="4" w:space="0"/>
               <w:left w:val="single" w:color="B7C9C0" w:sz="4" w:space="0"/>
@@ -15605,7 +15673,7 @@
         </w:tblPrEx>
         <w:tc>
           <w:tcPr>
-            <w:tcW w:w="2436" w:type="dxa"/>
+            <w:tcW w:w="1608" w:type="dxa"/>
             <w:tcBorders>
               <w:top w:val="single" w:color="B7C9C0" w:sz="4" w:space="0"/>
               <w:left w:val="single" w:color="B7C9C0" w:sz="4" w:space="0"/>
@@ -15639,7 +15707,7 @@
         </w:tc>
         <w:tc>
           <w:tcPr>
-            <w:tcW w:w="1831" w:type="dxa"/>
+            <w:tcW w:w="1899" w:type="dxa"/>
             <w:tcBorders>
               <w:top w:val="single" w:color="B7C9C0" w:sz="4" w:space="0"/>
               <w:left w:val="single" w:color="B7C9C0" w:sz="4" w:space="0"/>
@@ -15673,7 +15741,7 @@
         </w:tc>
         <w:tc>
           <w:tcPr>
-            <w:tcW w:w="1717" w:type="dxa"/>
+            <w:tcW w:w="1691" w:type="dxa"/>
             <w:tcBorders>
               <w:top w:val="single" w:color="B7C9C0" w:sz="4" w:space="0"/>
               <w:left w:val="single" w:color="B7C9C0" w:sz="4" w:space="0"/>
@@ -15707,7 +15775,7 @@
         </w:tc>
         <w:tc>
           <w:tcPr>
-            <w:tcW w:w="3762" w:type="dxa"/>
+            <w:tcW w:w="4548" w:type="dxa"/>
             <w:tcBorders>
               <w:top w:val="single" w:color="B7C9C0" w:sz="4" w:space="0"/>
               <w:left w:val="single" w:color="B7C9C0" w:sz="4" w:space="0"/>
@@ -15785,6 +15853,22 @@
         <w:gridCol w:w="4646"/>
       </w:tblGrid>
       <w:tr>
+        <w:tblPrEx>
+          <w:tblBorders>
+            <w:top w:val="single" w:color="auto" w:sz="4" w:space="0"/>
+            <w:left w:val="single" w:color="auto" w:sz="4" w:space="0"/>
+            <w:bottom w:val="single" w:color="auto" w:sz="4" w:space="0"/>
+            <w:right w:val="single" w:color="auto" w:sz="4" w:space="0"/>
+            <w:insideH w:val="single" w:color="auto" w:sz="4" w:space="0"/>
+            <w:insideV w:val="single" w:color="auto" w:sz="4" w:space="0"/>
+          </w:tblBorders>
+          <w:tblCellMar>
+            <w:top w:w="0" w:type="dxa"/>
+            <w:left w:w="10" w:type="dxa"/>
+            <w:bottom w:w="0" w:type="dxa"/>
+            <w:right w:w="10" w:type="dxa"/>
+          </w:tblCellMar>
+        </w:tblPrEx>
         <w:trPr>
           <w:tblHeader/>
         </w:trPr>
@@ -15818,7 +15902,7 @@
                 <w:sz w:val="19"/>
                 <w:szCs w:val="19"/>
               </w:rPr>
-              <w:t xml:space="preserve">Routine</w:t>
+              <w:t>Routine</w:t>
             </w:r>
           </w:p>
         </w:tc>
@@ -15852,7 +15936,7 @@
                 <w:sz w:val="19"/>
                 <w:szCs w:val="19"/>
               </w:rPr>
-              <w:t xml:space="preserve">Parameters</w:t>
+              <w:t>Parameters</w:t>
             </w:r>
           </w:p>
         </w:tc>
@@ -15886,12 +15970,28 @@
                 <w:sz w:val="19"/>
                 <w:szCs w:val="19"/>
               </w:rPr>
-              <w:t xml:space="preserve">Purpose</w:t>
+              <w:t>Purpose</w:t>
             </w:r>
           </w:p>
         </w:tc>
       </w:tr>
       <w:tr>
+        <w:tblPrEx>
+          <w:tblBorders>
+            <w:top w:val="single" w:color="auto" w:sz="4" w:space="0"/>
+            <w:left w:val="single" w:color="auto" w:sz="4" w:space="0"/>
+            <w:bottom w:val="single" w:color="auto" w:sz="4" w:space="0"/>
+            <w:right w:val="single" w:color="auto" w:sz="4" w:space="0"/>
+            <w:insideH w:val="single" w:color="auto" w:sz="4" w:space="0"/>
+            <w:insideV w:val="single" w:color="auto" w:sz="4" w:space="0"/>
+          </w:tblBorders>
+          <w:tblCellMar>
+            <w:top w:w="0" w:type="dxa"/>
+            <w:left w:w="10" w:type="dxa"/>
+            <w:bottom w:w="0" w:type="dxa"/>
+            <w:right w:w="10" w:type="dxa"/>
+          </w:tblCellMar>
+        </w:tblPrEx>
         <w:tc>
           <w:tcPr>
             <w:tcW w:w="2100" w:type="dxa"/>
@@ -15922,7 +16022,7 @@
                 <w:sz w:val="19"/>
                 <w:szCs w:val="19"/>
               </w:rPr>
-              <w:t xml:space="preserve">seed_unit</w:t>
+              <w:t>seed_unit</w:t>
             </w:r>
           </w:p>
         </w:tc>
@@ -15956,7 +16056,7 @@
                 <w:sz w:val="19"/>
                 <w:szCs w:val="19"/>
               </w:rPr>
-              <w:t xml:space="preserve">p_unique_id, p_name</w:t>
+              <w:t>p_unique_id, p_name</w:t>
             </w:r>
           </w:p>
         </w:tc>
@@ -15990,12 +16090,28 @@
                 <w:sz w:val="19"/>
                 <w:szCs w:val="19"/>
               </w:rPr>
-              <w:t xml:space="preserve">Insert a unit or refresh its label without changing a live binding.</w:t>
+              <w:t>Insert a unit or refresh its label without changing a live binding.</w:t>
             </w:r>
           </w:p>
         </w:tc>
       </w:tr>
       <w:tr>
+        <w:tblPrEx>
+          <w:tblBorders>
+            <w:top w:val="single" w:color="auto" w:sz="4" w:space="0"/>
+            <w:left w:val="single" w:color="auto" w:sz="4" w:space="0"/>
+            <w:bottom w:val="single" w:color="auto" w:sz="4" w:space="0"/>
+            <w:right w:val="single" w:color="auto" w:sz="4" w:space="0"/>
+            <w:insideH w:val="single" w:color="auto" w:sz="4" w:space="0"/>
+            <w:insideV w:val="single" w:color="auto" w:sz="4" w:space="0"/>
+          </w:tblBorders>
+          <w:tblCellMar>
+            <w:top w:w="0" w:type="dxa"/>
+            <w:left w:w="10" w:type="dxa"/>
+            <w:bottom w:w="0" w:type="dxa"/>
+            <w:right w:w="10" w:type="dxa"/>
+          </w:tblCellMar>
+        </w:tblPrEx>
         <w:tc>
           <w:tcPr>
             <w:tcW w:w="2100" w:type="dxa"/>
@@ -16026,7 +16142,7 @@
                 <w:sz w:val="19"/>
                 <w:szCs w:val="19"/>
               </w:rPr>
-              <w:t xml:space="preserve">issue_otp</w:t>
+              <w:t>issue_otp</w:t>
             </w:r>
           </w:p>
         </w:tc>
@@ -16060,7 +16176,7 @@
                 <w:sz w:val="19"/>
                 <w:szCs w:val="19"/>
               </w:rPr>
-              <w:t xml:space="preserve">p_ttl_minutes (default 10)</w:t>
+              <w:t>p_ttl_minutes (default 10)</w:t>
             </w:r>
           </w:p>
         </w:tc>
@@ -16094,12 +16210,28 @@
                 <w:sz w:val="19"/>
                 <w:szCs w:val="19"/>
               </w:rPr>
-              <w:t xml:space="preserve">Purge expired OTPs and issue a six-digit OTP.</w:t>
+              <w:t>Purge expired OTPs and issue a six-digit OTP.</w:t>
             </w:r>
           </w:p>
         </w:tc>
       </w:tr>
       <w:tr>
+        <w:tblPrEx>
+          <w:tblBorders>
+            <w:top w:val="single" w:color="auto" w:sz="4" w:space="0"/>
+            <w:left w:val="single" w:color="auto" w:sz="4" w:space="0"/>
+            <w:bottom w:val="single" w:color="auto" w:sz="4" w:space="0"/>
+            <w:right w:val="single" w:color="auto" w:sz="4" w:space="0"/>
+            <w:insideH w:val="single" w:color="auto" w:sz="4" w:space="0"/>
+            <w:insideV w:val="single" w:color="auto" w:sz="4" w:space="0"/>
+          </w:tblBorders>
+          <w:tblCellMar>
+            <w:top w:w="0" w:type="dxa"/>
+            <w:left w:w="10" w:type="dxa"/>
+            <w:bottom w:w="0" w:type="dxa"/>
+            <w:right w:w="10" w:type="dxa"/>
+          </w:tblCellMar>
+        </w:tblPrEx>
         <w:tc>
           <w:tcPr>
             <w:tcW w:w="2100" w:type="dxa"/>
@@ -16130,7 +16262,7 @@
                 <w:sz w:val="19"/>
                 <w:szCs w:val="19"/>
               </w:rPr>
-              <w:t xml:space="preserve">otp_is_valid</w:t>
+              <w:t>otp_is_valid</w:t>
             </w:r>
           </w:p>
         </w:tc>
@@ -16164,7 +16296,7 @@
                 <w:sz w:val="19"/>
                 <w:szCs w:val="19"/>
               </w:rPr>
-              <w:t xml:space="preserve">p_otp</w:t>
+              <w:t>p_otp</w:t>
             </w:r>
           </w:p>
         </w:tc>
@@ -16198,12 +16330,28 @@
                 <w:sz w:val="19"/>
                 <w:szCs w:val="19"/>
               </w:rPr>
-              <w:t xml:space="preserve">Check OTP validity without consuming it.</w:t>
+              <w:t>Check OTP validity without consuming it.</w:t>
             </w:r>
           </w:p>
         </w:tc>
       </w:tr>
       <w:tr>
+        <w:tblPrEx>
+          <w:tblBorders>
+            <w:top w:val="single" w:color="auto" w:sz="4" w:space="0"/>
+            <w:left w:val="single" w:color="auto" w:sz="4" w:space="0"/>
+            <w:bottom w:val="single" w:color="auto" w:sz="4" w:space="0"/>
+            <w:right w:val="single" w:color="auto" w:sz="4" w:space="0"/>
+            <w:insideH w:val="single" w:color="auto" w:sz="4" w:space="0"/>
+            <w:insideV w:val="single" w:color="auto" w:sz="4" w:space="0"/>
+          </w:tblBorders>
+          <w:tblCellMar>
+            <w:top w:w="0" w:type="dxa"/>
+            <w:left w:w="10" w:type="dxa"/>
+            <w:bottom w:w="0" w:type="dxa"/>
+            <w:right w:w="10" w:type="dxa"/>
+          </w:tblCellMar>
+        </w:tblPrEx>
         <w:tc>
           <w:tcPr>
             <w:tcW w:w="2100" w:type="dxa"/>
@@ -16234,7 +16382,7 @@
                 <w:sz w:val="19"/>
                 <w:szCs w:val="19"/>
               </w:rPr>
-              <w:t xml:space="preserve">consume_otp</w:t>
+              <w:t>consume_otp</w:t>
             </w:r>
           </w:p>
         </w:tc>
@@ -16268,7 +16416,7 @@
                 <w:sz w:val="19"/>
                 <w:szCs w:val="19"/>
               </w:rPr>
-              <w:t xml:space="preserve">p_otp</w:t>
+              <w:t>p_otp</w:t>
             </w:r>
           </w:p>
         </w:tc>
@@ -16302,12 +16450,28 @@
                 <w:sz w:val="19"/>
                 <w:szCs w:val="19"/>
               </w:rPr>
-              <w:t xml:space="preserve">Atomically consume a valid OTP.</w:t>
+              <w:t>Atomically consume a valid OTP.</w:t>
             </w:r>
           </w:p>
         </w:tc>
       </w:tr>
       <w:tr>
+        <w:tblPrEx>
+          <w:tblBorders>
+            <w:top w:val="single" w:color="auto" w:sz="4" w:space="0"/>
+            <w:left w:val="single" w:color="auto" w:sz="4" w:space="0"/>
+            <w:bottom w:val="single" w:color="auto" w:sz="4" w:space="0"/>
+            <w:right w:val="single" w:color="auto" w:sz="4" w:space="0"/>
+            <w:insideH w:val="single" w:color="auto" w:sz="4" w:space="0"/>
+            <w:insideV w:val="single" w:color="auto" w:sz="4" w:space="0"/>
+          </w:tblBorders>
+          <w:tblCellMar>
+            <w:top w:w="0" w:type="dxa"/>
+            <w:left w:w="10" w:type="dxa"/>
+            <w:bottom w:w="0" w:type="dxa"/>
+            <w:right w:w="10" w:type="dxa"/>
+          </w:tblCellMar>
+        </w:tblPrEx>
         <w:tc>
           <w:tcPr>
             <w:tcW w:w="2100" w:type="dxa"/>
@@ -16338,7 +16502,7 @@
                 <w:sz w:val="19"/>
                 <w:szCs w:val="19"/>
               </w:rPr>
-              <w:t xml:space="preserve">manual_claim</w:t>
+              <w:t>manual_claim</w:t>
             </w:r>
           </w:p>
         </w:tc>
@@ -16372,7 +16536,7 @@
                 <w:sz w:val="19"/>
                 <w:szCs w:val="19"/>
               </w:rPr>
-              <w:t xml:space="preserve">p_unique_id, p_fingerprint, p_otp</w:t>
+              <w:t>p_unique_id, p_fingerprint, p_otp</w:t>
             </w:r>
           </w:p>
         </w:tc>
@@ -16406,12 +16570,28 @@
                 <w:sz w:val="19"/>
                 <w:szCs w:val="19"/>
               </w:rPr>
-              <w:t xml:space="preserve">Bind a phone to a unit after ownership, OTP, and drain checks.</w:t>
+              <w:t>Bind a phone to a unit after ownership, OTP, and drain checks.</w:t>
             </w:r>
           </w:p>
         </w:tc>
       </w:tr>
       <w:tr>
+        <w:tblPrEx>
+          <w:tblBorders>
+            <w:top w:val="single" w:color="auto" w:sz="4" w:space="0"/>
+            <w:left w:val="single" w:color="auto" w:sz="4" w:space="0"/>
+            <w:bottom w:val="single" w:color="auto" w:sz="4" w:space="0"/>
+            <w:right w:val="single" w:color="auto" w:sz="4" w:space="0"/>
+            <w:insideH w:val="single" w:color="auto" w:sz="4" w:space="0"/>
+            <w:insideV w:val="single" w:color="auto" w:sz="4" w:space="0"/>
+          </w:tblBorders>
+          <w:tblCellMar>
+            <w:top w:w="0" w:type="dxa"/>
+            <w:left w:w="10" w:type="dxa"/>
+            <w:bottom w:w="0" w:type="dxa"/>
+            <w:right w:w="10" w:type="dxa"/>
+          </w:tblCellMar>
+        </w:tblPrEx>
         <w:tc>
           <w:tcPr>
             <w:tcW w:w="2100" w:type="dxa"/>
@@ -16442,7 +16622,7 @@
                 <w:sz w:val="19"/>
                 <w:szCs w:val="19"/>
               </w:rPr>
-              <w:t xml:space="preserve">release_unit</w:t>
+              <w:t>release_unit</w:t>
             </w:r>
           </w:p>
         </w:tc>
@@ -16476,7 +16656,7 @@
                 <w:sz w:val="19"/>
                 <w:szCs w:val="19"/>
               </w:rPr>
-              <w:t xml:space="preserve">p_unique_id, p_fingerprint, p_otp</w:t>
+              <w:t>p_unique_id, p_fingerprint, p_otp</w:t>
             </w:r>
           </w:p>
         </w:tc>
@@ -16510,12 +16690,28 @@
                 <w:sz w:val="19"/>
                 <w:szCs w:val="19"/>
               </w:rPr>
-              <w:t xml:space="preserve">Release a unit only for its proven owner.</w:t>
+              <w:t>Release a unit only for its proven owner.</w:t>
             </w:r>
           </w:p>
         </w:tc>
       </w:tr>
       <w:tr>
+        <w:tblPrEx>
+          <w:tblBorders>
+            <w:top w:val="single" w:color="auto" w:sz="4" w:space="0"/>
+            <w:left w:val="single" w:color="auto" w:sz="4" w:space="0"/>
+            <w:bottom w:val="single" w:color="auto" w:sz="4" w:space="0"/>
+            <w:right w:val="single" w:color="auto" w:sz="4" w:space="0"/>
+            <w:insideH w:val="single" w:color="auto" w:sz="4" w:space="0"/>
+            <w:insideV w:val="single" w:color="auto" w:sz="4" w:space="0"/>
+          </w:tblBorders>
+          <w:tblCellMar>
+            <w:top w:w="0" w:type="dxa"/>
+            <w:left w:w="10" w:type="dxa"/>
+            <w:bottom w:w="0" w:type="dxa"/>
+            <w:right w:w="10" w:type="dxa"/>
+          </w:tblCellMar>
+        </w:tblPrEx>
         <w:tc>
           <w:tcPr>
             <w:tcW w:w="2100" w:type="dxa"/>
@@ -16546,7 +16742,7 @@
                 <w:sz w:val="19"/>
                 <w:szCs w:val="19"/>
               </w:rPr>
-              <w:t xml:space="preserve">check_binding</w:t>
+              <w:t>check_binding</w:t>
             </w:r>
           </w:p>
         </w:tc>
@@ -16580,7 +16776,7 @@
                 <w:sz w:val="19"/>
                 <w:szCs w:val="19"/>
               </w:rPr>
-              <w:t xml:space="preserve">p_unique_id, p_fingerprint, p_app_version (default NULL)</w:t>
+              <w:t>p_unique_id, p_fingerprint, p_app_version (default NULL)</w:t>
             </w:r>
           </w:p>
         </w:tc>
@@ -16614,12 +16810,28 @@
                 <w:sz w:val="19"/>
                 <w:szCs w:val="19"/>
               </w:rPr>
-              <w:t xml:space="preserve">Return binding state and refresh owner activity/version when bound.</w:t>
+              <w:t>Return binding state and refresh owner activity/version when bound.</w:t>
             </w:r>
           </w:p>
         </w:tc>
       </w:tr>
       <w:tr>
+        <w:tblPrEx>
+          <w:tblBorders>
+            <w:top w:val="single" w:color="auto" w:sz="4" w:space="0"/>
+            <w:left w:val="single" w:color="auto" w:sz="4" w:space="0"/>
+            <w:bottom w:val="single" w:color="auto" w:sz="4" w:space="0"/>
+            <w:right w:val="single" w:color="auto" w:sz="4" w:space="0"/>
+            <w:insideH w:val="single" w:color="auto" w:sz="4" w:space="0"/>
+            <w:insideV w:val="single" w:color="auto" w:sz="4" w:space="0"/>
+          </w:tblBorders>
+          <w:tblCellMar>
+            <w:top w:w="0" w:type="dxa"/>
+            <w:left w:w="10" w:type="dxa"/>
+            <w:bottom w:w="0" w:type="dxa"/>
+            <w:right w:w="10" w:type="dxa"/>
+          </w:tblCellMar>
+        </w:tblPrEx>
         <w:tc>
           <w:tcPr>
             <w:tcW w:w="2100" w:type="dxa"/>
@@ -16650,7 +16862,7 @@
                 <w:sz w:val="19"/>
                 <w:szCs w:val="19"/>
               </w:rPr>
-              <w:t xml:space="preserve">admin_release</w:t>
+              <w:t>admin_release</w:t>
             </w:r>
           </w:p>
         </w:tc>
@@ -16684,7 +16896,7 @@
                 <w:sz w:val="19"/>
                 <w:szCs w:val="19"/>
               </w:rPr>
-              <w:t xml:space="preserve">p_unique_id</w:t>
+              <w:t>p_unique_id</w:t>
             </w:r>
           </w:p>
         </w:tc>
@@ -16718,7 +16930,7 @@
                 <w:sz w:val="19"/>
                 <w:szCs w:val="19"/>
               </w:rPr>
-              <w:t xml:space="preserve">Office force-release for lost, dead, or reassigned handset. Takes no fingerprint: the point is that the owning phone can no longer prove anything.</w:t>
+              <w:t>Office force-release for lost, dead, or reassigned handset. Takes no fingerprint: the point is that the owning phone can no longer prove anything.</w:t>
             </w:r>
           </w:p>
         </w:tc>
@@ -16777,6 +16989,12 @@
             <w:insideH w:val="single" w:color="auto" w:sz="4" w:space="0"/>
             <w:insideV w:val="single" w:color="auto" w:sz="4" w:space="0"/>
           </w:tblBorders>
+          <w:tblCellMar>
+            <w:top w:w="0" w:type="dxa"/>
+            <w:left w:w="10" w:type="dxa"/>
+            <w:bottom w:w="0" w:type="dxa"/>
+            <w:right w:w="10" w:type="dxa"/>
+          </w:tblCellMar>
         </w:tblPrEx>
         <w:trPr>
           <w:tblHeader/>

</xml_diff>